<commit_message>
feat: fix issues in templates #BKDO-210
</commit_message>
<xml_diff>
--- a/src/Bk.APG.Api/Templates/APG_Decision_Federal_Council_French.docx
+++ b/src/Bk.APG.Api/Templates/APG_Decision_Federal_Council_French.docx
@@ -3,6 +3,11 @@
 <w:document xmlns:wpc="http://schemas.microsoft.com/office/word/2010/wordprocessingCanvas" xmlns:cx="http://schemas.microsoft.com/office/drawing/2014/chartex" xmlns:cx1="http://schemas.microsoft.com/office/drawing/2015/9/8/chartex" xmlns:cx2="http://schemas.microsoft.com/office/drawing/2015/10/21/chartex" xmlns:cx3="http://schemas.microsoft.com/office/drawing/2016/5/9/chartex" xmlns:cx4="http://schemas.microsoft.com/office/drawing/2016/5/10/chartex" xmlns:cx5="http://schemas.microsoft.com/office/drawing/2016/5/11/chartex" xmlns:cx6="http://schemas.microsoft.com/office/drawing/2016/5/12/chartex" xmlns:cx7="http://schemas.microsoft.com/office/drawing/2016/5/13/chartex" xmlns:cx8="http://schemas.microsoft.com/office/drawing/2016/5/14/chartex" xmlns:mc="http://schemas.openxmlformats.org/markup-compatibility/2006" xmlns:aink="http://schemas.microsoft.com/office/drawing/2016/ink" xmlns:am3d="http://schemas.microsoft.com/office/drawing/2017/model3d" xmlns:o="urn:schemas-microsoft-com:office:office" xmlns:oel="http://schemas.microsoft.com/office/2019/extlst" xmlns:r="http://schemas.openxmlformats.org/officeDocument/2006/relationships" xmlns:m="http://schemas.openxmlformats.org/officeDocument/2006/math" xmlns:v="urn:schemas-microsoft-com:vml" xmlns:wp14="http://schemas.microsoft.com/office/word/2010/wordprocessingDrawing" xmlns:wp="http://schemas.openxmlformats.org/drawingml/2006/wordprocessingDrawing" xmlns:w10="urn:schemas-microsoft-com:office:word" xmlns:w="http://schemas.openxmlformats.org/wordprocessingml/2006/main" xmlns:w14="http://schemas.microsoft.com/office/word/2010/wordml" xmlns:w15="http://schemas.microsoft.com/office/word/2012/wordml" xmlns:w16cex="http://schemas.microsoft.com/office/word/2018/wordml/cex" xmlns:w16cid="http://schemas.microsoft.com/office/word/2016/wordml/cid" xmlns:w16="http://schemas.microsoft.com/office/word/2018/wordml" xmlns:w16du="http://schemas.microsoft.com/office/word/2023/wordml/word16du" xmlns:w16sdtdh="http://schemas.microsoft.com/office/word/2020/wordml/sdtdatahash" xmlns:w16sdtfl="http://schemas.microsoft.com/office/word/2024/wordml/sdtformatlock" xmlns:w16se="http://schemas.microsoft.com/office/word/2015/wordml/symex" xmlns:wpg="http://schemas.microsoft.com/office/word/2010/wordprocessingGroup" xmlns:wpi="http://schemas.microsoft.com/office/word/2010/wordprocessingInk" xmlns:wne="http://schemas.microsoft.com/office/word/2006/wordml" xmlns:wps="http://schemas.microsoft.com/office/word/2010/wordprocessingShape" mc:Ignorable="w14 w15 w16se w16cid w16 w16cex w16sdtdh w16sdtfl w16du wp14">
   <w:body>
     <w:p>
+      <w:pPr>
+        <w:rPr>
+          <w:lang w:val="fr-CH"/>
+        </w:rPr>
+      </w:pPr>
       <w:r>
         <w:rPr>
           <w:lang w:val="fr-CH"/>
@@ -211,9 +216,10 @@
     </w:p>
     <w:p>
       <w:pPr>
+        <w:pStyle w:val="Listenabsatz"/>
         <w:numPr>
           <w:ilvl w:val="0"/>
-          <w:numId w:val="43"/>
+          <w:numId w:val="48"/>
         </w:numPr>
         <w:rPr>
           <w:szCs w:val="24"/>
@@ -225,7 +231,14 @@
           <w:szCs w:val="24"/>
           <w:lang w:val="fr-CH"/>
         </w:rPr>
-        <w:t xml:space="preserve">Les personnes indiquées dans la liste des membres (annexe) sont nommées pour la période </w:t>
+        <w:t>P</w:t>
+      </w:r>
+      <w:r>
+        <w:rPr>
+          <w:szCs w:val="24"/>
+          <w:lang w:val="fr-CH"/>
+        </w:rPr>
+        <w:t xml:space="preserve">our la période </w:t>
       </w:r>
       <w:r>
         <w:rPr>
@@ -238,12 +251,13 @@
           <w:szCs w:val="24"/>
           <w:lang w:val="fr-CH"/>
         </w:rPr>
-        <w:t xml:space="preserve"> selon la fonction et pour la durée qui y figure au sein des commissions extraparlementaires, des organes de direction ou comme représentants de la Confédération.</w:t>
+        <w:t>selon la fonction et pour la durée qui y figure au sein des commissions extraparlementaires, des organes de direction ou comme représentants de la Confédération.</w:t>
       </w:r>
     </w:p>
     <w:p>
       <w:pPr>
         <w:pStyle w:val="Listenabsatz"/>
+        <w:ind w:left="0"/>
         <w:rPr>
           <w:szCs w:val="24"/>
           <w:lang w:val="fr-CH"/>
@@ -252,12 +266,12 @@
     </w:p>
     <w:p>
       <w:pPr>
+        <w:pStyle w:val="Listenabsatz"/>
         <w:numPr>
           <w:ilvl w:val="0"/>
-          <w:numId w:val="17"/>
+          <w:numId w:val="48"/>
         </w:numPr>
         <w:spacing w:after="120"/>
-        <w:ind w:left="714" w:hanging="357"/>
         <w:rPr>
           <w:szCs w:val="24"/>
           <w:lang w:val="fr-CH"/>
@@ -327,68 +341,9 @@
     </w:p>
     <w:p>
       <w:pPr>
-        <w:numPr>
-          <w:ilvl w:val="0"/>
-          <w:numId w:val="17"/>
-        </w:numPr>
-        <w:rPr>
-          <w:szCs w:val="24"/>
-          <w:lang w:val="fr-CH"/>
-        </w:rPr>
-      </w:pPr>
-      <w:r>
-        <w:rPr>
-          <w:szCs w:val="24"/>
-          <w:lang w:val="fr-CH"/>
-        </w:rPr>
-        <w:t>Les profils des compétences des organes ci-après sont approuvés</w:t>
-      </w:r>
-      <w:r>
-        <w:rPr>
-          <w:szCs w:val="24"/>
-          <w:lang w:val="fr-CH"/>
-        </w:rPr>
-        <w:t>:</w:t>
-      </w:r>
-    </w:p>
-    <w:p>
-      <w:pPr>
         <w:pStyle w:val="Listenabsatz"/>
-        <w:rPr>
-          <w:szCs w:val="24"/>
-          <w:lang w:val="fr-CH"/>
-        </w:rPr>
-      </w:pPr>
-    </w:p>
-    <w:p>
-      <w:pPr>
-        <w:numPr>
-          <w:ilvl w:val="0"/>
-          <w:numId w:val="17"/>
-        </w:numPr>
-        <w:rPr>
-          <w:szCs w:val="24"/>
-          <w:lang w:val="fr-CH"/>
-        </w:rPr>
-      </w:pPr>
-      <w:r>
-        <w:rPr>
-          <w:szCs w:val="24"/>
-          <w:lang w:val="fr-CH"/>
-        </w:rPr>
-        <w:t>Les organes suivants ne sont pas désignés ou le seront ultérieurement</w:t>
-      </w:r>
-      <w:r>
-        <w:rPr>
-          <w:szCs w:val="24"/>
-          <w:lang w:val="fr-CH"/>
-        </w:rPr>
-        <w:t>:</w:t>
-      </w:r>
-    </w:p>
-    <w:p>
-      <w:pPr>
-        <w:pStyle w:val="Listenabsatz"/>
+        <w:spacing w:after="120"/>
+        <w:ind w:left="360"/>
         <w:rPr>
           <w:szCs w:val="24"/>
           <w:lang w:val="fr-CH"/>
@@ -400,22 +355,19 @@
         <w:pStyle w:val="Listenabsatz"/>
         <w:numPr>
           <w:ilvl w:val="0"/>
-          <w:numId w:val="17"/>
+          <w:numId w:val="48"/>
         </w:numPr>
-        <w:spacing w:after="120"/>
-        <w:ind w:left="714" w:hanging="357"/>
-        <w:contextualSpacing w:val="0"/>
-        <w:rPr>
-          <w:szCs w:val="24"/>
-          <w:lang w:val="fr-CH"/>
-        </w:rPr>
-      </w:pPr>
-      <w:r>
-        <w:rPr>
-          <w:szCs w:val="24"/>
-          <w:lang w:val="fr-CH"/>
-        </w:rPr>
-        <w:t>Le taux d’occupation des membres des commissions de suivi du marché est fixé comme suit</w:t>
+        <w:rPr>
+          <w:szCs w:val="24"/>
+          <w:lang w:val="fr-CH"/>
+        </w:rPr>
+      </w:pPr>
+      <w:r>
+        <w:rPr>
+          <w:szCs w:val="24"/>
+          <w:lang w:val="fr-CH"/>
+        </w:rPr>
+        <w:t>Les profils des compétences des organes ci-après sont approuvés</w:t>
       </w:r>
       <w:r>
         <w:rPr>
@@ -427,141 +379,11 @@
     </w:p>
     <w:p>
       <w:pPr>
-        <w:ind w:left="709"/>
-        <w:rPr>
-          <w:szCs w:val="24"/>
-          <w:lang w:val="en-US"/>
-        </w:rPr>
-      </w:pPr>
-      <w:r>
-        <w:rPr>
-          <w:szCs w:val="24"/>
-          <w:lang w:val="en-US"/>
-        </w:rPr>
-        <w:t>&lt;&lt;foreach [</w:t>
-      </w:r>
-      <w:r>
-        <w:rPr>
-          <w:szCs w:val="24"/>
-          <w:lang w:val="en-US"/>
-        </w:rPr>
-        <w:t>committee</w:t>
-      </w:r>
-      <w:r>
-        <w:rPr>
-          <w:szCs w:val="24"/>
-          <w:lang w:val="en-US"/>
-        </w:rPr>
-        <w:t xml:space="preserve"> in decisionFederalCouncil.marketOrientatedCommissions]&gt;&gt;</w:t>
-      </w:r>
-    </w:p>
-    <w:p>
-      <w:pPr>
-        <w:spacing w:before="120" w:after="60"/>
-        <w:ind w:left="709"/>
-        <w:rPr>
-          <w:b/>
-          <w:bCs/>
-          <w:szCs w:val="24"/>
-          <w:lang w:val="en-US"/>
-        </w:rPr>
-      </w:pPr>
-      <w:r>
-        <w:rPr>
-          <w:b/>
-          <w:bCs/>
-          <w:szCs w:val="24"/>
-          <w:lang w:val="en-US"/>
-        </w:rPr>
-        <w:t>&lt;&lt;[committee.</w:t>
-      </w:r>
-      <w:r>
-        <w:rPr>
-          <w:b/>
-          <w:bCs/>
-          <w:szCs w:val="24"/>
-          <w:lang w:val="en-US"/>
-        </w:rPr>
-        <w:t>n</w:t>
-      </w:r>
-      <w:r>
-        <w:rPr>
-          <w:b/>
-          <w:bCs/>
-          <w:szCs w:val="24"/>
-          <w:lang w:val="en-US"/>
-        </w:rPr>
-        <w:t>ame]&gt;&gt;</w:t>
-      </w:r>
-    </w:p>
-    <w:p>
-      <w:pPr>
         <w:pStyle w:val="Listenabsatz"/>
-        <w:spacing w:before="60" w:after="40"/>
-        <w:ind w:left="709"/>
-        <w:contextualSpacing w:val="0"/>
-        <w:rPr>
-          <w:szCs w:val="24"/>
-          <w:lang w:val="en-US"/>
-        </w:rPr>
-      </w:pPr>
-      <w:r>
-        <w:rPr>
-          <w:szCs w:val="24"/>
-          <w:lang w:val="en-US"/>
-        </w:rPr>
-        <w:t>&lt;&lt;[committee.</w:t>
-      </w:r>
-      <w:r>
-        <w:rPr>
-          <w:szCs w:val="24"/>
-          <w:lang w:val="en-US"/>
-        </w:rPr>
-        <w:t>freeText</w:t>
-      </w:r>
-      <w:r>
-        <w:rPr>
-          <w:szCs w:val="24"/>
-          <w:lang w:val="en-US"/>
-        </w:rPr>
-        <w:t>]&gt;&gt;</w:t>
-      </w:r>
-    </w:p>
-    <w:p>
-      <w:pPr>
-        <w:pStyle w:val="Listenabsatz"/>
-        <w:ind w:left="0" w:firstLine="709"/>
-        <w:rPr>
-          <w:sz w:val="12"/>
-          <w:szCs w:val="12"/>
-          <w:lang w:val="en-US"/>
-        </w:rPr>
-      </w:pPr>
-    </w:p>
-    <w:p>
-      <w:pPr>
-        <w:pStyle w:val="Listenabsatz"/>
-        <w:ind w:left="0" w:firstLine="709"/>
-        <w:rPr>
-          <w:szCs w:val="24"/>
-          <w:lang w:val="en-US"/>
-        </w:rPr>
-      </w:pPr>
-      <w:r>
-        <w:rPr>
-          <w:szCs w:val="24"/>
-          <w:lang w:val="en-US"/>
-        </w:rPr>
-        <w:t>&lt;&lt;/foreach&gt;&gt;</w:t>
-      </w:r>
-    </w:p>
-    <w:p>
-      <w:pPr>
-        <w:pStyle w:val="Listenabsatz"/>
-        <w:ind w:left="0" w:firstLine="709"/>
-        <w:rPr>
-          <w:szCs w:val="24"/>
-          <w:lang w:val="en-US"/>
+        <w:ind w:left="0"/>
+        <w:rPr>
+          <w:szCs w:val="24"/>
+          <w:lang w:val="fr-CH"/>
         </w:rPr>
       </w:pPr>
     </w:p>
@@ -570,7 +392,7 @@
         <w:pStyle w:val="Listenabsatz"/>
         <w:numPr>
           <w:ilvl w:val="0"/>
-          <w:numId w:val="17"/>
+          <w:numId w:val="48"/>
         </w:numPr>
         <w:rPr>
           <w:szCs w:val="24"/>
@@ -582,55 +404,293 @@
           <w:szCs w:val="24"/>
           <w:lang w:val="fr-CH"/>
         </w:rPr>
-        <w:t>Les exceptions relatives à la composition des commissions extraparlementaires ou à leurs membres sont approuvées comme ci-après.</w:t>
+        <w:t>Les organes suivants ne sont pas désignés ou le seront ultérieurement</w:t>
+      </w:r>
+      <w:r>
+        <w:rPr>
+          <w:szCs w:val="24"/>
+          <w:lang w:val="fr-CH"/>
+        </w:rPr>
+        <w:t>:</w:t>
       </w:r>
     </w:p>
     <w:p>
       <w:pPr>
         <w:pStyle w:val="Listenabsatz"/>
-        <w:rPr>
-          <w:szCs w:val="24"/>
-          <w:lang w:val="fr-CH"/>
-        </w:rPr>
-      </w:pPr>
+        <w:ind w:left="360"/>
+        <w:rPr>
+          <w:szCs w:val="24"/>
+          <w:lang w:val="en-US"/>
+        </w:rPr>
+      </w:pPr>
+      <w:r>
+        <w:rPr>
+          <w:szCs w:val="24"/>
+          <w:lang w:val="en-US"/>
+        </w:rPr>
+        <w:t>&lt;&lt;foreach [committee in decisionFederalCouncil.</w:t>
+      </w:r>
+      <w:r>
+        <w:rPr>
+          <w:szCs w:val="24"/>
+          <w:lang w:val="en-US"/>
+        </w:rPr>
+        <w:t>n</w:t>
+      </w:r>
+      <w:r>
+        <w:rPr>
+          <w:szCs w:val="24"/>
+          <w:lang w:val="en-US"/>
+        </w:rPr>
+        <w:t>onReleasedCommissions</w:t>
+      </w:r>
+      <w:r>
+        <w:rPr>
+          <w:szCs w:val="24"/>
+          <w:lang w:val="en-US"/>
+        </w:rPr>
+        <w:t>]&gt;&gt;</w:t>
+      </w:r>
+    </w:p>
+    <w:p>
+      <w:pPr>
+        <w:pStyle w:val="Listenabsatz"/>
+        <w:ind w:left="360"/>
+        <w:rPr>
+          <w:szCs w:val="24"/>
+          <w:lang w:val="en-US"/>
+        </w:rPr>
+      </w:pPr>
+      <w:r>
+        <w:rPr>
+          <w:b/>
+          <w:bCs/>
+          <w:szCs w:val="24"/>
+          <w:lang w:val="en-US"/>
+        </w:rPr>
+        <w:t>&lt;&lt;[committee.name]&gt;&gt;</w:t>
+      </w:r>
+    </w:p>
+    <w:p>
+      <w:pPr>
+        <w:pStyle w:val="Listenabsatz"/>
+        <w:ind w:left="360"/>
+        <w:rPr>
+          <w:szCs w:val="24"/>
+          <w:lang w:val="en-US"/>
+        </w:rPr>
+      </w:pPr>
+      <w:r>
+        <w:rPr>
+          <w:szCs w:val="24"/>
+          <w:lang w:val="en-US"/>
+        </w:rPr>
+        <w:t>&lt;&lt;/foreach&gt;&gt;</w:t>
+      </w:r>
+    </w:p>
+    <w:p>
+      <w:pPr>
+        <w:pStyle w:val="Listenabsatz"/>
+        <w:ind w:left="0"/>
+        <w:rPr>
+          <w:szCs w:val="24"/>
+          <w:lang w:val="fr-CH"/>
+        </w:rPr>
+      </w:pPr>
+    </w:p>
+    <w:p>
+      <w:pPr>
+        <w:pStyle w:val="Listenabsatz"/>
+        <w:numPr>
+          <w:ilvl w:val="0"/>
+          <w:numId w:val="48"/>
+        </w:numPr>
+        <w:spacing w:after="120"/>
+        <w:rPr>
+          <w:szCs w:val="24"/>
+          <w:lang w:val="fr-CH"/>
+        </w:rPr>
+      </w:pPr>
+      <w:r>
+        <w:rPr>
+          <w:szCs w:val="24"/>
+          <w:lang w:val="fr-CH"/>
+        </w:rPr>
+        <w:t>Le taux d’occupation des membres des commissions de suivi du marché est fixé comme suit</w:t>
+      </w:r>
+      <w:r>
+        <w:rPr>
+          <w:szCs w:val="24"/>
+          <w:lang w:val="fr-CH"/>
+        </w:rPr>
+        <w:t>:</w:t>
+      </w:r>
+    </w:p>
+    <w:p>
+      <w:pPr>
+        <w:pStyle w:val="Listenabsatz"/>
+        <w:ind w:left="426"/>
+        <w:rPr>
+          <w:szCs w:val="24"/>
+          <w:lang w:val="en-US"/>
+        </w:rPr>
+      </w:pPr>
+      <w:r>
+        <w:rPr>
+          <w:szCs w:val="24"/>
+          <w:lang w:val="en-US"/>
+        </w:rPr>
+        <w:t>&lt;&lt;foreach [committee in decisionFederalCouncil.marketOrientatedCommissions]&gt;&gt;</w:t>
+      </w:r>
+    </w:p>
+    <w:p>
+      <w:pPr>
+        <w:pStyle w:val="Listenabsatz"/>
+        <w:ind w:left="426"/>
+        <w:rPr>
+          <w:szCs w:val="24"/>
+          <w:lang w:val="en-US"/>
+        </w:rPr>
+      </w:pPr>
+      <w:r>
+        <w:rPr>
+          <w:b/>
+          <w:bCs/>
+          <w:szCs w:val="24"/>
+          <w:lang w:val="en-US"/>
+        </w:rPr>
+        <w:t>&lt;&lt;[committee.</w:t>
+      </w:r>
+      <w:r>
+        <w:rPr>
+          <w:b/>
+          <w:bCs/>
+          <w:szCs w:val="24"/>
+          <w:lang w:val="en-US"/>
+        </w:rPr>
+        <w:t>n</w:t>
+      </w:r>
+      <w:r>
+        <w:rPr>
+          <w:b/>
+          <w:bCs/>
+          <w:szCs w:val="24"/>
+          <w:lang w:val="en-US"/>
+        </w:rPr>
+        <w:t>ame]&gt;&gt;</w:t>
+      </w:r>
+    </w:p>
+    <w:p>
+      <w:pPr>
+        <w:pStyle w:val="Listenabsatz"/>
+        <w:spacing w:before="60" w:after="40"/>
+        <w:ind w:left="426"/>
+        <w:contextualSpacing w:val="0"/>
+        <w:rPr>
+          <w:szCs w:val="24"/>
+          <w:lang w:val="en-US"/>
+        </w:rPr>
+      </w:pPr>
+      <w:r>
+        <w:rPr>
+          <w:szCs w:val="24"/>
+          <w:lang w:val="en-US"/>
+        </w:rPr>
+        <w:t>&lt;&lt;[committee.</w:t>
+      </w:r>
+      <w:r>
+        <w:rPr>
+          <w:szCs w:val="24"/>
+          <w:lang w:val="en-US"/>
+        </w:rPr>
+        <w:t>freeText</w:t>
+      </w:r>
+      <w:r>
+        <w:rPr>
+          <w:szCs w:val="24"/>
+          <w:lang w:val="en-US"/>
+        </w:rPr>
+        <w:t>]&gt;&gt;</w:t>
+      </w:r>
+    </w:p>
+    <w:p>
+      <w:pPr>
+        <w:pStyle w:val="Listenabsatz"/>
+        <w:ind w:left="709" w:hanging="283"/>
+        <w:rPr>
+          <w:sz w:val="12"/>
+          <w:szCs w:val="12"/>
+          <w:lang w:val="en-US"/>
+        </w:rPr>
+      </w:pPr>
+    </w:p>
+    <w:p>
+      <w:pPr>
+        <w:pStyle w:val="Listenabsatz"/>
+        <w:ind w:left="709" w:hanging="283"/>
+        <w:rPr>
+          <w:szCs w:val="24"/>
+          <w:lang w:val="en-US"/>
+        </w:rPr>
+      </w:pPr>
+      <w:r>
+        <w:rPr>
+          <w:szCs w:val="24"/>
+          <w:lang w:val="en-US"/>
+        </w:rPr>
+        <w:t>&lt;&lt;/foreach&gt;&gt;</w:t>
+      </w:r>
+    </w:p>
+    <w:p>
+      <w:pPr>
+        <w:pStyle w:val="Listenabsatz"/>
+        <w:ind w:left="0"/>
+        <w:rPr>
+          <w:szCs w:val="24"/>
+          <w:lang w:val="en-US"/>
+        </w:rPr>
+      </w:pPr>
+    </w:p>
+    <w:p>
+      <w:pPr>
+        <w:pStyle w:val="Listenabsatz"/>
+        <w:numPr>
+          <w:ilvl w:val="0"/>
+          <w:numId w:val="48"/>
+        </w:numPr>
+        <w:spacing w:after="120"/>
+        <w:rPr>
+          <w:szCs w:val="24"/>
+          <w:lang w:val="fr-CH"/>
+        </w:rPr>
+      </w:pPr>
+      <w:r>
+        <w:rPr>
+          <w:szCs w:val="24"/>
+          <w:lang w:val="fr-CH"/>
+        </w:rPr>
+        <w:t>Les exceptions relatives à la composition des commissions extraparlementaires ou à leurs membres sont approuvées comme ci-après.</w:t>
+      </w:r>
     </w:p>
     <w:p>
       <w:pPr>
         <w:pStyle w:val="Listenabsatz"/>
         <w:numPr>
           <w:ilvl w:val="1"/>
-          <w:numId w:val="17"/>
+          <w:numId w:val="48"/>
         </w:numPr>
         <w:spacing w:after="120"/>
-        <w:ind w:left="1123" w:hanging="403"/>
-        <w:contextualSpacing w:val="0"/>
-        <w:rPr>
-          <w:szCs w:val="24"/>
-          <w:lang w:val="fr-CH"/>
-        </w:rPr>
-      </w:pPr>
-      <w:r>
-        <w:rPr>
-          <w:szCs w:val="24"/>
-          <w:lang w:val="fr-CH"/>
-        </w:rPr>
-        <w:t>Le dépassement du nombre maximal de membres autorisés (art. 57</w:t>
-      </w:r>
-      <w:r>
-        <w:rPr>
-          <w:i/>
-          <w:iCs/>
-          <w:szCs w:val="24"/>
-          <w:lang w:val="fr-CH"/>
-        </w:rPr>
-        <w:t>e</w:t>
-      </w:r>
-      <w:r>
-        <w:rPr>
-          <w:szCs w:val="24"/>
-          <w:lang w:val="fr-CH"/>
-        </w:rPr>
-        <w:t>, al. 1, LOGA) dans les commissions extraparlementaires suivantes est approuvé</w:t>
+        <w:rPr>
+          <w:szCs w:val="24"/>
+          <w:lang w:val="fr-CH"/>
+        </w:rPr>
+      </w:pPr>
+      <w:r>
+        <w:rPr>
+          <w:szCs w:val="24"/>
+          <w:lang w:val="fr-CH"/>
+        </w:rPr>
+        <w:t>Le dépassement du nombre maximal de membres autorisés (art. 57e, al. 1, LOGA) dans les commissions extraparlementaires suivantes est approuvé</w:t>
       </w:r>
       <w:r>
         <w:rPr>
@@ -643,32 +703,18 @@
     <w:p>
       <w:pPr>
         <w:pStyle w:val="Listenabsatz"/>
-        <w:ind w:firstLine="403"/>
-        <w:rPr>
-          <w:szCs w:val="24"/>
-          <w:lang w:val="en-US"/>
-        </w:rPr>
-      </w:pPr>
-      <w:r>
-        <w:rPr>
-          <w:szCs w:val="24"/>
-          <w:lang w:val="en-US"/>
-        </w:rPr>
-        <w:t>&lt;&lt;foreach [committee in decisionFederalCouncil.</w:t>
-      </w:r>
-      <w:r>
-        <w:rPr>
-          <w:szCs w:val="24"/>
-          <w:lang w:val="en-US"/>
-        </w:rPr>
-        <w:t>m</w:t>
-      </w:r>
-      <w:r>
-        <w:rPr>
-          <w:szCs w:val="24"/>
-          <w:lang w:val="en-US"/>
-        </w:rPr>
-        <w:t>oreThan15MembersCommittees]&gt;&gt;</w:t>
+        <w:ind w:left="1134" w:hanging="283"/>
+        <w:rPr>
+          <w:szCs w:val="24"/>
+          <w:lang w:val="en-US"/>
+        </w:rPr>
+      </w:pPr>
+      <w:r>
+        <w:rPr>
+          <w:szCs w:val="24"/>
+          <w:lang w:val="en-US"/>
+        </w:rPr>
+        <w:t>&lt;&lt;foreach [committee in decisionFederalCouncil.moreThan15MembersCommittees]&gt;&gt;</w:t>
       </w:r>
     </w:p>
     <w:p>
@@ -676,10 +722,10 @@
         <w:pStyle w:val="Listenabsatz"/>
         <w:numPr>
           <w:ilvl w:val="0"/>
-          <w:numId w:val="39"/>
+          <w:numId w:val="49"/>
         </w:numPr>
         <w:spacing w:before="120" w:after="60"/>
-        <w:ind w:left="1418" w:hanging="284"/>
+        <w:ind w:left="1134" w:hanging="283"/>
         <w:rPr>
           <w:szCs w:val="24"/>
           <w:lang w:val="en-US"/>
@@ -747,13 +793,20 @@
           <w:szCs w:val="24"/>
           <w:lang w:val="en-US"/>
         </w:rPr>
-        <w:t xml:space="preserve"> Mitglieder</w:t>
+        <w:t xml:space="preserve"> </w:t>
+      </w:r>
+      <w:r>
+        <w:rPr>
+          <w:szCs w:val="24"/>
+          <w:lang w:val="en-US"/>
+        </w:rPr>
+        <w:t>membres</w:t>
       </w:r>
     </w:p>
     <w:p>
       <w:pPr>
         <w:pStyle w:val="Listenabsatz"/>
-        <w:ind w:firstLine="360"/>
+        <w:ind w:left="1134" w:hanging="283"/>
         <w:rPr>
           <w:szCs w:val="24"/>
           <w:lang w:val="en-US"/>
@@ -769,6 +822,7 @@
     </w:p>
     <w:p>
       <w:pPr>
+        <w:spacing w:after="120"/>
         <w:rPr>
           <w:szCs w:val="24"/>
           <w:lang w:val="en-US"/>
@@ -780,22 +834,19 @@
         <w:pStyle w:val="Listenabsatz"/>
         <w:numPr>
           <w:ilvl w:val="1"/>
-          <w:numId w:val="17"/>
+          <w:numId w:val="48"/>
         </w:numPr>
         <w:spacing w:after="120"/>
-        <w:ind w:left="1123" w:hanging="403"/>
-        <w:contextualSpacing w:val="0"/>
-        <w:rPr>
-          <w:szCs w:val="24"/>
-          <w:lang w:val="fr-CH"/>
-        </w:rPr>
-      </w:pPr>
-      <w:r>
-        <w:rPr>
-          <w:szCs w:val="24"/>
-          <w:lang w:val="fr-CH"/>
-        </w:rPr>
-        <w:lastRenderedPageBreak/>
+        <w:rPr>
+          <w:szCs w:val="24"/>
+          <w:lang w:val="fr-CH"/>
+        </w:rPr>
+      </w:pPr>
+      <w:r>
+        <w:rPr>
+          <w:szCs w:val="24"/>
+          <w:lang w:val="fr-CH"/>
+        </w:rPr>
         <w:t>La sous-représentation des femmes ou des hommes (art. 8</w:t>
       </w:r>
       <w:r>
@@ -825,17 +876,18 @@
     <w:p>
       <w:pPr>
         <w:pStyle w:val="Listenabsatz"/>
-        <w:ind w:left="1123"/>
-        <w:rPr>
-          <w:szCs w:val="24"/>
-          <w:lang w:val="en-US"/>
-        </w:rPr>
-      </w:pPr>
-      <w:r>
-        <w:rPr>
-          <w:szCs w:val="24"/>
-          <w:lang w:val="en-US"/>
-        </w:rPr>
+        <w:ind w:left="1134" w:hanging="283"/>
+        <w:rPr>
+          <w:szCs w:val="24"/>
+          <w:lang w:val="en-US"/>
+        </w:rPr>
+      </w:pPr>
+      <w:r>
+        <w:rPr>
+          <w:szCs w:val="24"/>
+          <w:lang w:val="en-US"/>
+        </w:rPr>
+        <w:lastRenderedPageBreak/>
         <w:t>&lt;&lt;foreach [committee in decisionFederalCouncil.</w:t>
       </w:r>
       <w:r>
@@ -858,10 +910,10 @@
         <w:pStyle w:val="Listenabsatz"/>
         <w:numPr>
           <w:ilvl w:val="0"/>
-          <w:numId w:val="39"/>
+          <w:numId w:val="49"/>
         </w:numPr>
         <w:spacing w:before="120" w:after="60"/>
-        <w:ind w:left="1418" w:hanging="284"/>
+        <w:ind w:left="1134" w:hanging="283"/>
         <w:rPr>
           <w:szCs w:val="24"/>
           <w:lang w:val="en-US"/>
@@ -915,6 +967,13 @@
           <w:szCs w:val="24"/>
           <w:lang w:val="en-US"/>
         </w:rPr>
+        <w:t xml:space="preserve">de </w:t>
+      </w:r>
+      <w:r>
+        <w:rPr>
+          <w:szCs w:val="24"/>
+          <w:lang w:val="en-US"/>
+        </w:rPr>
         <w:t>femmes</w:t>
       </w:r>
       <w:r>
@@ -923,6 +982,13 @@
           <w:lang w:val="en-US"/>
         </w:rPr>
         <w:t xml:space="preserve">&lt;&lt;/if&gt;&gt;&lt;&lt;if [committee. maleMissingPercentage &lt; 40]&gt;&gt;&lt;&lt;[committee.maleMissingPercentage]&gt;&gt;% </w:t>
+      </w:r>
+      <w:r>
+        <w:rPr>
+          <w:szCs w:val="24"/>
+          <w:lang w:val="en-US"/>
+        </w:rPr>
+        <w:t>d’</w:t>
       </w:r>
       <w:r>
         <w:rPr>
@@ -942,7 +1008,7 @@
     <w:p>
       <w:pPr>
         <w:pStyle w:val="Listenabsatz"/>
-        <w:ind w:firstLine="403"/>
+        <w:ind w:left="1134" w:hanging="283"/>
         <w:rPr>
           <w:szCs w:val="24"/>
           <w:lang w:val="en-US"/>
@@ -960,7 +1026,7 @@
       <w:pPr>
         <w:pStyle w:val="Listenabsatz"/>
         <w:spacing w:after="120"/>
-        <w:ind w:left="1123"/>
+        <w:ind w:left="0"/>
         <w:contextualSpacing w:val="0"/>
         <w:rPr>
           <w:szCs w:val="24"/>
@@ -972,7 +1038,7 @@
         <w:pStyle w:val="Listenabsatz"/>
         <w:numPr>
           <w:ilvl w:val="1"/>
-          <w:numId w:val="17"/>
+          <w:numId w:val="48"/>
         </w:numPr>
         <w:rPr>
           <w:szCs w:val="24"/>
@@ -1014,19 +1080,7 @@
     <w:p>
       <w:pPr>
         <w:pStyle w:val="Listenabsatz"/>
-        <w:spacing w:after="120"/>
-        <w:ind w:left="1123"/>
-        <w:contextualSpacing w:val="0"/>
-        <w:rPr>
-          <w:szCs w:val="24"/>
-          <w:lang w:val="fr-CH"/>
-        </w:rPr>
-      </w:pPr>
-    </w:p>
-    <w:p>
-      <w:pPr>
-        <w:pStyle w:val="Listenabsatz"/>
-        <w:ind w:left="1123"/>
+        <w:ind w:left="1134" w:hanging="283"/>
         <w:rPr>
           <w:szCs w:val="24"/>
           <w:lang w:val="en-US"/>
@@ -1066,10 +1120,10 @@
         <w:pStyle w:val="Listenabsatz"/>
         <w:numPr>
           <w:ilvl w:val="0"/>
-          <w:numId w:val="39"/>
+          <w:numId w:val="49"/>
         </w:numPr>
         <w:spacing w:before="120" w:after="60"/>
-        <w:ind w:left="1418" w:hanging="284"/>
+        <w:ind w:left="1134" w:hanging="283"/>
         <w:rPr>
           <w:szCs w:val="24"/>
           <w:lang w:val="en-US"/>
@@ -1116,13 +1170,87 @@
           <w:szCs w:val="24"/>
           <w:lang w:val="en-US"/>
         </w:rPr>
-        <w:t xml:space="preserve"> &lt;&lt;if [committee.frenchMissing == true &amp;&amp; committee.italianMissing == true]&gt;&gt;französische &amp; italienische Sprachgemeinschaft&lt;&lt;/if&gt;&gt;&lt;&lt;if [committee.frenchMissing == true &amp;&amp; committee.italianMissing == false]&gt;&gt;französische Sprachgemeinschaft&lt;&lt;/if&gt;&gt;&lt;&lt;if [committee.italianMissing == true &amp;&amp; committee.frenchMissing == false]&gt;&gt;italienische Sprachgemeinschaft&lt;&lt;/if&gt;&gt;</w:t>
+        <w:t xml:space="preserve"> &lt;&lt;if [committee.frenchMissing == true &amp;&amp; committee.italianMissing == true]&gt;&gt;</w:t>
+      </w:r>
+      <w:r>
+        <w:rPr>
+          <w:lang w:val="en-US"/>
+        </w:rPr>
+        <w:t xml:space="preserve">communauté francophone </w:t>
+      </w:r>
+      <w:r>
+        <w:rPr>
+          <w:lang w:val="en-US"/>
+        </w:rPr>
+        <w:t xml:space="preserve">&amp; </w:t>
+      </w:r>
+      <w:r>
+        <w:rPr>
+          <w:lang w:val="en-US"/>
+        </w:rPr>
+        <w:t>italophone</w:t>
+      </w:r>
+      <w:r>
+        <w:rPr>
+          <w:noProof/>
+          <w:lang w:val="en-US"/>
+        </w:rPr>
+        <w:t xml:space="preserve"> non représentée</w:t>
+      </w:r>
+      <w:r>
+        <w:rPr>
+          <w:szCs w:val="24"/>
+          <w:lang w:val="en-US"/>
+        </w:rPr>
+        <w:t>&lt;&lt;/if&gt;&gt;&lt;&lt;if [committee.frenchMissing == true &amp;&amp; committee.italianMissing == false]&gt;&gt;</w:t>
+      </w:r>
+      <w:bookmarkStart w:id="2" w:name="_Hlk149123267"/>
+      <w:r>
+        <w:rPr>
+          <w:lang w:val="en-US"/>
+        </w:rPr>
+        <w:t>communauté francophone</w:t>
+      </w:r>
+      <w:bookmarkEnd w:id="2"/>
+      <w:r>
+        <w:rPr>
+          <w:noProof/>
+          <w:lang w:val="en-US"/>
+        </w:rPr>
+        <w:t xml:space="preserve"> non représentée</w:t>
+      </w:r>
+      <w:r>
+        <w:rPr>
+          <w:szCs w:val="24"/>
+          <w:lang w:val="en-US"/>
+        </w:rPr>
+        <w:t>&lt;&lt;/if&gt;&gt;&lt;&lt;if [committee.italianMissing == true &amp;&amp; committee.frenchMissing == false]&gt;&gt;</w:t>
+      </w:r>
+      <w:r>
+        <w:rPr>
+          <w:lang w:val="en-US"/>
+        </w:rPr>
+        <w:t>communauté italophone</w:t>
+      </w:r>
+      <w:r>
+        <w:rPr>
+          <w:noProof/>
+          <w:lang w:val="en-US"/>
+        </w:rPr>
+        <w:t xml:space="preserve"> non représentée</w:t>
+      </w:r>
+      <w:r>
+        <w:rPr>
+          <w:szCs w:val="24"/>
+          <w:lang w:val="en-US"/>
+        </w:rPr>
+        <w:t>&lt;&lt;/if&gt;&gt;</w:t>
       </w:r>
     </w:p>
     <w:p>
       <w:pPr>
         <w:pStyle w:val="Listenabsatz"/>
-        <w:ind w:firstLine="349"/>
+        <w:ind w:left="1134" w:hanging="283"/>
         <w:rPr>
           <w:szCs w:val="24"/>
           <w:lang w:val="en-US"/>
@@ -1148,7 +1276,7 @@
         <w:pStyle w:val="Listenabsatz"/>
         <w:numPr>
           <w:ilvl w:val="1"/>
-          <w:numId w:val="17"/>
+          <w:numId w:val="48"/>
         </w:numPr>
         <w:rPr>
           <w:szCs w:val="24"/>
@@ -1188,7 +1316,8 @@
     </w:p>
     <w:p>
       <w:pPr>
-        <w:ind w:left="1123"/>
+        <w:pStyle w:val="Listenabsatz"/>
+        <w:ind w:left="1134" w:hanging="283"/>
         <w:rPr>
           <w:szCs w:val="24"/>
           <w:lang w:val="en-US"/>
@@ -1221,10 +1350,10 @@
         <w:pStyle w:val="Listenabsatz"/>
         <w:numPr>
           <w:ilvl w:val="0"/>
-          <w:numId w:val="39"/>
+          <w:numId w:val="49"/>
         </w:numPr>
         <w:spacing w:before="120" w:after="60"/>
-        <w:ind w:left="1418" w:hanging="284"/>
+        <w:ind w:left="1134" w:hanging="283"/>
         <w:rPr>
           <w:szCs w:val="24"/>
           <w:lang w:val="en-US"/>
@@ -1290,7 +1419,8 @@
     </w:p>
     <w:p>
       <w:pPr>
-        <w:ind w:left="1080"/>
+        <w:pStyle w:val="Listenabsatz"/>
+        <w:ind w:left="1134" w:hanging="283"/>
         <w:rPr>
           <w:szCs w:val="24"/>
           <w:lang w:val="en-US"/>
@@ -1318,11 +1448,9 @@
         <w:pStyle w:val="Listenabsatz"/>
         <w:numPr>
           <w:ilvl w:val="1"/>
-          <w:numId w:val="17"/>
+          <w:numId w:val="48"/>
         </w:numPr>
         <w:spacing w:after="120"/>
-        <w:ind w:left="1123" w:hanging="403"/>
-        <w:contextualSpacing w:val="0"/>
         <w:rPr>
           <w:szCs w:val="24"/>
           <w:lang w:val="fr-CH"/>
@@ -1361,39 +1489,19 @@
     </w:p>
     <w:p>
       <w:pPr>
-        <w:ind w:left="1123"/>
-        <w:rPr>
-          <w:szCs w:val="24"/>
-          <w:lang w:val="en-US"/>
-        </w:rPr>
-      </w:pPr>
-      <w:r>
-        <w:rPr>
-          <w:szCs w:val="24"/>
-          <w:lang w:val="en-US"/>
-        </w:rPr>
-        <w:t>&lt;&lt;foreach [committee in decisionFederalCouncil.</w:t>
-      </w:r>
-      <w:r>
-        <w:rPr>
-          <w:szCs w:val="24"/>
-          <w:lang w:val="en-US"/>
-        </w:rPr>
-        <w:t>f</w:t>
-      </w:r>
-      <w:r>
-        <w:rPr>
-          <w:szCs w:val="24"/>
-          <w:lang w:val="en-US"/>
-        </w:rPr>
-        <w:t>ederalAssemblyMembersCommittees</w:t>
-      </w:r>
-      <w:r>
-        <w:rPr>
-          <w:szCs w:val="24"/>
-          <w:lang w:val="en-US"/>
-        </w:rPr>
-        <w:t>]&gt;&gt;</w:t>
+        <w:pStyle w:val="Listenabsatz"/>
+        <w:ind w:left="1134" w:hanging="283"/>
+        <w:rPr>
+          <w:szCs w:val="24"/>
+          <w:lang w:val="en-US"/>
+        </w:rPr>
+      </w:pPr>
+      <w:r>
+        <w:rPr>
+          <w:szCs w:val="24"/>
+          <w:lang w:val="en-US"/>
+        </w:rPr>
+        <w:t>&lt;&lt;foreach [committee in decisionFederalCouncil.federalAssemblyMembersCommittees]&gt;&gt;</w:t>
       </w:r>
     </w:p>
     <w:p>
@@ -1401,10 +1509,10 @@
         <w:pStyle w:val="Listenabsatz"/>
         <w:numPr>
           <w:ilvl w:val="0"/>
-          <w:numId w:val="39"/>
+          <w:numId w:val="49"/>
         </w:numPr>
         <w:spacing w:before="120" w:after="60"/>
-        <w:ind w:left="1418" w:hanging="284"/>
+        <w:ind w:left="1134" w:hanging="283"/>
         <w:rPr>
           <w:szCs w:val="24"/>
           <w:lang w:val="en-US"/>
@@ -1470,7 +1578,8 @@
     </w:p>
     <w:p>
       <w:pPr>
-        <w:ind w:left="1080"/>
+        <w:pStyle w:val="Listenabsatz"/>
+        <w:ind w:left="1134" w:hanging="283"/>
         <w:rPr>
           <w:szCs w:val="24"/>
           <w:lang w:val="en-US"/>
@@ -1493,23 +1602,38 @@
     </w:p>
     <w:p>
       <w:pPr>
-        <w:rPr>
-          <w:szCs w:val="24"/>
-        </w:rPr>
-      </w:pPr>
+        <w:pStyle w:val="Listenabsatz"/>
+        <w:numPr>
+          <w:ilvl w:val="0"/>
+          <w:numId w:val="48"/>
+        </w:numPr>
+        <w:rPr>
+          <w:szCs w:val="24"/>
+          <w:lang w:val="fr-CH"/>
+        </w:rPr>
+      </w:pPr>
+      <w:r>
+        <w:rPr>
+          <w:szCs w:val="24"/>
+          <w:lang w:val="fr-CH"/>
+        </w:rPr>
+        <w:t>Les départements veillent à ce que les exigences légales relatives à la composition des commissions extraparlementaires (notamment la représentation équitable des sexes et des communautés linguistiques) soient respectées lors de remplacements de membres en cours de législature.</w:t>
+      </w:r>
     </w:p>
     <w:p>
       <w:pPr>
         <w:rPr>
           <w:szCs w:val="24"/>
+          <w:lang w:val="fr-CH"/>
         </w:rPr>
       </w:pPr>
     </w:p>
     <w:p>
       <w:pPr>
+        <w:pStyle w:val="Listenabsatz"/>
         <w:numPr>
           <w:ilvl w:val="0"/>
-          <w:numId w:val="45"/>
+          <w:numId w:val="48"/>
         </w:numPr>
         <w:rPr>
           <w:szCs w:val="24"/>
@@ -1521,12 +1645,11 @@
           <w:szCs w:val="24"/>
           <w:lang w:val="fr-CH"/>
         </w:rPr>
-        <w:t>Les départements veillent à ce que les exigences légales relatives à la composition des commissions extraparlementaires (notamment la représentation équitable des sexes et des communautés linguistiques) soient respectées lors de remplacements de membres en cours de législature.</w:t>
+        <w:t>Les membres pour lesquels le mandat n’est pas reconduit au début de la nouvelle période sont remerciés pour leurs bons et loyaux services.</w:t>
       </w:r>
     </w:p>
     <w:p>
       <w:pPr>
-        <w:ind w:left="720"/>
         <w:rPr>
           <w:szCs w:val="24"/>
           <w:lang w:val="fr-CH"/>
@@ -1535,9 +1658,10 @@
     </w:p>
     <w:p>
       <w:pPr>
+        <w:pStyle w:val="Listenabsatz"/>
         <w:numPr>
           <w:ilvl w:val="0"/>
-          <w:numId w:val="45"/>
+          <w:numId w:val="48"/>
         </w:numPr>
         <w:rPr>
           <w:szCs w:val="24"/>
@@ -1549,33 +1673,7 @@
           <w:szCs w:val="24"/>
           <w:lang w:val="fr-CH"/>
         </w:rPr>
-        <w:t>Les membres pour lesquels le mandat n’est pas reconduit au début de la nouvelle période sont remerciés pour leurs bons et loyaux services.</w:t>
-      </w:r>
-    </w:p>
-    <w:p>
-      <w:pPr>
-        <w:rPr>
-          <w:szCs w:val="24"/>
-          <w:lang w:val="fr-CH"/>
-        </w:rPr>
-      </w:pPr>
-    </w:p>
-    <w:p>
-      <w:pPr>
-        <w:numPr>
-          <w:ilvl w:val="0"/>
-          <w:numId w:val="45"/>
-        </w:numPr>
-        <w:rPr>
-          <w:szCs w:val="24"/>
-          <w:lang w:val="fr-CH"/>
-        </w:rPr>
-      </w:pPr>
-      <w:r>
-        <w:rPr>
-          <w:szCs w:val="24"/>
-          <w:lang w:val="fr-CH"/>
-        </w:rPr>
+        <w:lastRenderedPageBreak/>
         <w:t xml:space="preserve">Les départements (SG) sont chargés d’informer les membres sortants et nouvellement nommés (toutes fonctions confondues) </w:t>
       </w:r>
       <w:r>
@@ -1635,36 +1733,46 @@
     </w:p>
     <w:p>
       <w:pPr>
-        <w:numPr>
-          <w:ilvl w:val="1"/>
-          <w:numId w:val="45"/>
-        </w:numPr>
-        <w:rPr>
-          <w:szCs w:val="24"/>
-          <w:lang w:val="fr-CH"/>
-        </w:rPr>
-      </w:pPr>
-      <w:r>
-        <w:rPr>
-          <w:szCs w:val="24"/>
-          <w:lang w:val="fr-CH"/>
-        </w:rPr>
-        <w:t>La Chancellerie fédérale est autorisée à adapter la liste des membres publiée, en accord avec le département compétent, si des modifications interviennent concernant les indications relatives aux personnes élues.</w:t>
-      </w:r>
+        <w:rPr>
+          <w:szCs w:val="24"/>
+          <w:lang w:val="fr-CH"/>
+        </w:rPr>
+      </w:pPr>
     </w:p>
     <w:p>
       <w:pPr>
-        <w:ind w:left="1440"/>
-        <w:rPr>
-          <w:szCs w:val="24"/>
-        </w:rPr>
-      </w:pPr>
+        <w:pStyle w:val="Listenabsatz"/>
+        <w:numPr>
+          <w:ilvl w:val="0"/>
+          <w:numId w:val="48"/>
+        </w:numPr>
+        <w:rPr>
+          <w:szCs w:val="24"/>
+          <w:lang w:val="fr-CH"/>
+        </w:rPr>
+      </w:pPr>
+      <w:r>
+        <w:rPr>
+          <w:szCs w:val="24"/>
+          <w:lang w:val="fr-CH"/>
+        </w:rPr>
+        <w:t>La Chancellerie fédérale est autorisée à adapter la liste des membres publiée, en accord avec le département compétent, si des modifications interviennent concernant les indications relatives aux personnes élues.</w:t>
+      </w:r>
     </w:p>
     <w:p>
       <w:pPr>
+        <w:rPr>
+          <w:szCs w:val="24"/>
+          <w:lang w:val="fr-CH"/>
+        </w:rPr>
+      </w:pPr>
+    </w:p>
+    <w:p>
+      <w:pPr>
+        <w:pStyle w:val="Listenabsatz"/>
         <w:numPr>
           <w:ilvl w:val="0"/>
-          <w:numId w:val="45"/>
+          <w:numId w:val="48"/>
         </w:numPr>
         <w:rPr>
           <w:szCs w:val="24"/>
@@ -1681,7 +1789,6 @@
     </w:p>
     <w:p>
       <w:pPr>
-        <w:ind w:left="720"/>
         <w:rPr>
           <w:szCs w:val="24"/>
           <w:lang w:val="fr-CH"/>
@@ -1690,9 +1797,10 @@
     </w:p>
     <w:p>
       <w:pPr>
+        <w:pStyle w:val="Listenabsatz"/>
         <w:numPr>
           <w:ilvl w:val="0"/>
-          <w:numId w:val="45"/>
+          <w:numId w:val="48"/>
         </w:numPr>
         <w:rPr>
           <w:szCs w:val="24"/>
@@ -1778,6 +1886,7 @@
       <w:pPr>
         <w:rPr>
           <w:szCs w:val="24"/>
+          <w:lang w:val="fr-CH"/>
         </w:rPr>
       </w:pPr>
     </w:p>
@@ -1785,6 +1894,7 @@
       <w:pPr>
         <w:rPr>
           <w:szCs w:val="24"/>
+          <w:lang w:val="fr-CH"/>
         </w:rPr>
       </w:pPr>
     </w:p>
@@ -1792,85 +1902,23 @@
       <w:pPr>
         <w:rPr>
           <w:szCs w:val="24"/>
+          <w:lang w:val="fr-CH"/>
         </w:rPr>
       </w:pPr>
     </w:p>
     <w:p>
       <w:pPr>
         <w:rPr>
-          <w:szCs w:val="24"/>
-          <w:highlight w:val="yellow"/>
-        </w:rPr>
-      </w:pPr>
-      <w:r>
-        <w:rPr>
-          <w:szCs w:val="24"/>
-          <w:highlight w:val="yellow"/>
-        </w:rPr>
-        <w:t>Für getreuen Protokollauszug:</w:t>
-      </w:r>
-    </w:p>
-    <w:p>
-      <w:pPr>
-        <w:rPr>
-          <w:szCs w:val="24"/>
-          <w:highlight w:val="yellow"/>
-        </w:rPr>
-      </w:pPr>
-    </w:p>
-    <w:p>
-      <w:pPr>
-        <w:rPr>
-          <w:szCs w:val="24"/>
-          <w:highlight w:val="yellow"/>
-        </w:rPr>
-      </w:pPr>
-    </w:p>
-    <w:p>
-      <w:pPr>
-        <w:rPr>
-          <w:szCs w:val="24"/>
-          <w:highlight w:val="yellow"/>
-          <w:u w:val="single"/>
-        </w:rPr>
-      </w:pPr>
-      <w:r>
-        <w:rPr>
-          <w:szCs w:val="24"/>
-          <w:highlight w:val="yellow"/>
-          <w:u w:val="single"/>
-        </w:rPr>
-        <w:t>Veröffentlichung:</w:t>
-      </w:r>
-    </w:p>
-    <w:p>
-      <w:pPr>
-        <w:rPr>
           <w:sz w:val="26"/>
           <w:szCs w:val="24"/>
         </w:rPr>
       </w:pPr>
       <w:r>
         <w:rPr>
-          <w:szCs w:val="24"/>
-          <w:highlight w:val="yellow"/>
-        </w:rPr>
-        <w:t xml:space="preserve">Amtliche Sammlung (Ziff. </w:t>
-      </w:r>
-      <w:r>
-        <w:rPr>
-          <w:szCs w:val="24"/>
-          <w:highlight w:val="yellow"/>
-        </w:rPr>
-        <w:t>8</w:t>
-      </w:r>
-      <w:r>
-        <w:rPr>
           <w:sz w:val="26"/>
           <w:szCs w:val="24"/>
-          <w:highlight w:val="yellow"/>
-        </w:rPr>
-        <w:t>)</w:t>
+        </w:rPr>
+        <w:t>Annexe : Liste des membres</w:t>
       </w:r>
     </w:p>
     <w:sectPr>
@@ -4091,6 +4139,178 @@
     </w:lvl>
   </w:abstractNum>
   <w:abstractNum w:abstractNumId="25" w15:restartNumberingAfterBreak="0">
+    <w:nsid w:val="3E837728"/>
+    <w:multiLevelType w:val="multilevel"/>
+    <w:tmpl w:val="0807001F"/>
+    <w:lvl w:ilvl="0">
+      <w:start w:val="1"/>
+      <w:numFmt w:val="decimal"/>
+      <w:lvlText w:val="%1."/>
+      <w:lvlJc w:val="left"/>
+      <w:pPr>
+        <w:ind w:left="360" w:hanging="360"/>
+      </w:pPr>
+    </w:lvl>
+    <w:lvl w:ilvl="1">
+      <w:start w:val="1"/>
+      <w:numFmt w:val="decimal"/>
+      <w:lvlText w:val="%1.%2."/>
+      <w:lvlJc w:val="left"/>
+      <w:pPr>
+        <w:ind w:left="792" w:hanging="432"/>
+      </w:pPr>
+    </w:lvl>
+    <w:lvl w:ilvl="2">
+      <w:start w:val="1"/>
+      <w:numFmt w:val="decimal"/>
+      <w:lvlText w:val="%1.%2.%3."/>
+      <w:lvlJc w:val="left"/>
+      <w:pPr>
+        <w:ind w:left="1224" w:hanging="504"/>
+      </w:pPr>
+    </w:lvl>
+    <w:lvl w:ilvl="3">
+      <w:start w:val="1"/>
+      <w:numFmt w:val="decimal"/>
+      <w:lvlText w:val="%1.%2.%3.%4."/>
+      <w:lvlJc w:val="left"/>
+      <w:pPr>
+        <w:ind w:left="1728" w:hanging="648"/>
+      </w:pPr>
+    </w:lvl>
+    <w:lvl w:ilvl="4">
+      <w:start w:val="1"/>
+      <w:numFmt w:val="decimal"/>
+      <w:lvlText w:val="%1.%2.%3.%4.%5."/>
+      <w:lvlJc w:val="left"/>
+      <w:pPr>
+        <w:ind w:left="2232" w:hanging="792"/>
+      </w:pPr>
+    </w:lvl>
+    <w:lvl w:ilvl="5">
+      <w:start w:val="1"/>
+      <w:numFmt w:val="decimal"/>
+      <w:lvlText w:val="%1.%2.%3.%4.%5.%6."/>
+      <w:lvlJc w:val="left"/>
+      <w:pPr>
+        <w:ind w:left="2736" w:hanging="936"/>
+      </w:pPr>
+    </w:lvl>
+    <w:lvl w:ilvl="6">
+      <w:start w:val="1"/>
+      <w:numFmt w:val="decimal"/>
+      <w:lvlText w:val="%1.%2.%3.%4.%5.%6.%7."/>
+      <w:lvlJc w:val="left"/>
+      <w:pPr>
+        <w:ind w:left="3240" w:hanging="1080"/>
+      </w:pPr>
+    </w:lvl>
+    <w:lvl w:ilvl="7">
+      <w:start w:val="1"/>
+      <w:numFmt w:val="decimal"/>
+      <w:lvlText w:val="%1.%2.%3.%4.%5.%6.%7.%8."/>
+      <w:lvlJc w:val="left"/>
+      <w:pPr>
+        <w:ind w:left="3744" w:hanging="1224"/>
+      </w:pPr>
+    </w:lvl>
+    <w:lvl w:ilvl="8">
+      <w:start w:val="1"/>
+      <w:numFmt w:val="decimal"/>
+      <w:lvlText w:val="%1.%2.%3.%4.%5.%6.%7.%8.%9."/>
+      <w:lvlJc w:val="left"/>
+      <w:pPr>
+        <w:ind w:left="4320" w:hanging="1440"/>
+      </w:pPr>
+    </w:lvl>
+  </w:abstractNum>
+  <w:abstractNum w:abstractNumId="26" w15:restartNumberingAfterBreak="0">
+    <w:nsid w:val="3FCF2C64"/>
+    <w:multiLevelType w:val="hybridMultilevel"/>
+    <w:tmpl w:val="738677AC"/>
+    <w:lvl w:ilvl="0" w:tplc="0807000F">
+      <w:start w:val="1"/>
+      <w:numFmt w:val="decimal"/>
+      <w:lvlText w:val="%1."/>
+      <w:lvlJc w:val="left"/>
+      <w:pPr>
+        <w:ind w:left="720" w:hanging="360"/>
+      </w:pPr>
+    </w:lvl>
+    <w:lvl w:ilvl="1" w:tplc="08070019">
+      <w:start w:val="1"/>
+      <w:numFmt w:val="lowerLetter"/>
+      <w:lvlText w:val="%2."/>
+      <w:lvlJc w:val="left"/>
+      <w:pPr>
+        <w:ind w:left="1440" w:hanging="360"/>
+      </w:pPr>
+    </w:lvl>
+    <w:lvl w:ilvl="2" w:tplc="0807001B">
+      <w:start w:val="1"/>
+      <w:numFmt w:val="lowerRoman"/>
+      <w:lvlText w:val="%3."/>
+      <w:lvlJc w:val="right"/>
+      <w:pPr>
+        <w:ind w:left="2160" w:hanging="180"/>
+      </w:pPr>
+    </w:lvl>
+    <w:lvl w:ilvl="3" w:tplc="0807000F" w:tentative="1">
+      <w:start w:val="1"/>
+      <w:numFmt w:val="decimal"/>
+      <w:lvlText w:val="%4."/>
+      <w:lvlJc w:val="left"/>
+      <w:pPr>
+        <w:ind w:left="2880" w:hanging="360"/>
+      </w:pPr>
+    </w:lvl>
+    <w:lvl w:ilvl="4" w:tplc="08070019" w:tentative="1">
+      <w:start w:val="1"/>
+      <w:numFmt w:val="lowerLetter"/>
+      <w:lvlText w:val="%5."/>
+      <w:lvlJc w:val="left"/>
+      <w:pPr>
+        <w:ind w:left="3600" w:hanging="360"/>
+      </w:pPr>
+    </w:lvl>
+    <w:lvl w:ilvl="5" w:tplc="0807001B" w:tentative="1">
+      <w:start w:val="1"/>
+      <w:numFmt w:val="lowerRoman"/>
+      <w:lvlText w:val="%6."/>
+      <w:lvlJc w:val="right"/>
+      <w:pPr>
+        <w:ind w:left="4320" w:hanging="180"/>
+      </w:pPr>
+    </w:lvl>
+    <w:lvl w:ilvl="6" w:tplc="0807000F" w:tentative="1">
+      <w:start w:val="1"/>
+      <w:numFmt w:val="decimal"/>
+      <w:lvlText w:val="%7."/>
+      <w:lvlJc w:val="left"/>
+      <w:pPr>
+        <w:ind w:left="5040" w:hanging="360"/>
+      </w:pPr>
+    </w:lvl>
+    <w:lvl w:ilvl="7" w:tplc="08070019" w:tentative="1">
+      <w:start w:val="1"/>
+      <w:numFmt w:val="lowerLetter"/>
+      <w:lvlText w:val="%8."/>
+      <w:lvlJc w:val="left"/>
+      <w:pPr>
+        <w:ind w:left="5760" w:hanging="360"/>
+      </w:pPr>
+    </w:lvl>
+    <w:lvl w:ilvl="8" w:tplc="0807001B" w:tentative="1">
+      <w:start w:val="1"/>
+      <w:numFmt w:val="lowerRoman"/>
+      <w:lvlText w:val="%9."/>
+      <w:lvlJc w:val="right"/>
+      <w:pPr>
+        <w:ind w:left="6480" w:hanging="180"/>
+      </w:pPr>
+    </w:lvl>
+  </w:abstractNum>
+  <w:abstractNum w:abstractNumId="27" w15:restartNumberingAfterBreak="0">
     <w:nsid w:val="426C79E5"/>
     <w:multiLevelType w:val="hybridMultilevel"/>
     <w:tmpl w:val="119CD8BA"/>
@@ -4203,7 +4423,7 @@
       </w:rPr>
     </w:lvl>
   </w:abstractNum>
-  <w:abstractNum w:abstractNumId="26" w15:restartNumberingAfterBreak="1">
+  <w:abstractNum w:abstractNumId="28" w15:restartNumberingAfterBreak="1">
     <w:nsid w:val="443451CA"/>
     <w:multiLevelType w:val="hybridMultilevel"/>
     <w:tmpl w:val="1F824302"/>
@@ -4316,7 +4536,7 @@
       </w:rPr>
     </w:lvl>
   </w:abstractNum>
-  <w:abstractNum w:abstractNumId="27" w15:restartNumberingAfterBreak="0">
+  <w:abstractNum w:abstractNumId="29" w15:restartNumberingAfterBreak="0">
     <w:nsid w:val="468D4C6E"/>
     <w:multiLevelType w:val="hybridMultilevel"/>
     <w:tmpl w:val="EA682E0A"/>
@@ -4429,7 +4649,7 @@
       </w:rPr>
     </w:lvl>
   </w:abstractNum>
-  <w:abstractNum w:abstractNumId="28" w15:restartNumberingAfterBreak="0">
+  <w:abstractNum w:abstractNumId="30" w15:restartNumberingAfterBreak="0">
     <w:nsid w:val="4C7B4A7A"/>
     <w:multiLevelType w:val="hybridMultilevel"/>
     <w:tmpl w:val="B82E5C94"/>
@@ -4515,7 +4735,7 @@
       </w:pPr>
     </w:lvl>
   </w:abstractNum>
-  <w:abstractNum w:abstractNumId="29" w15:restartNumberingAfterBreak="0">
+  <w:abstractNum w:abstractNumId="31" w15:restartNumberingAfterBreak="0">
     <w:nsid w:val="4E597EBF"/>
     <w:multiLevelType w:val="hybridMultilevel"/>
     <w:tmpl w:val="4F88A58C"/>
@@ -4601,243 +4821,17 @@
       </w:pPr>
     </w:lvl>
   </w:abstractNum>
-  <w:abstractNum w:abstractNumId="30" w15:restartNumberingAfterBreak="0">
-    <w:nsid w:val="579952D8"/>
-    <w:multiLevelType w:val="multilevel"/>
-    <w:tmpl w:val="ECAAE47A"/>
-    <w:lvl w:ilvl="0">
-      <w:start w:val="1"/>
-      <w:numFmt w:val="decimal"/>
-      <w:lvlText w:val="%1."/>
-      <w:lvlJc w:val="left"/>
-      <w:pPr>
-        <w:tabs>
-          <w:tab w:val="num" w:pos="720"/>
-        </w:tabs>
-        <w:ind w:left="720" w:hanging="360"/>
-      </w:pPr>
-    </w:lvl>
-    <w:lvl w:ilvl="1">
-      <w:start w:val="1"/>
-      <w:numFmt w:val="lowerLetter"/>
-      <w:lvlText w:val="%2."/>
-      <w:lvlJc w:val="left"/>
-      <w:pPr>
-        <w:tabs>
-          <w:tab w:val="num" w:pos="1440"/>
-        </w:tabs>
-        <w:ind w:left="1440" w:hanging="360"/>
-      </w:pPr>
-    </w:lvl>
-    <w:lvl w:ilvl="2" w:tentative="1">
-      <w:start w:val="1"/>
-      <w:numFmt w:val="decimal"/>
-      <w:lvlText w:val="%3."/>
-      <w:lvlJc w:val="left"/>
-      <w:pPr>
-        <w:tabs>
-          <w:tab w:val="num" w:pos="2160"/>
-        </w:tabs>
-        <w:ind w:left="2160" w:hanging="360"/>
-      </w:pPr>
-    </w:lvl>
-    <w:lvl w:ilvl="3" w:tentative="1">
-      <w:start w:val="1"/>
-      <w:numFmt w:val="decimal"/>
-      <w:lvlText w:val="%4."/>
-      <w:lvlJc w:val="left"/>
-      <w:pPr>
-        <w:tabs>
-          <w:tab w:val="num" w:pos="2880"/>
-        </w:tabs>
-        <w:ind w:left="2880" w:hanging="360"/>
-      </w:pPr>
-    </w:lvl>
-    <w:lvl w:ilvl="4" w:tentative="1">
-      <w:start w:val="1"/>
-      <w:numFmt w:val="decimal"/>
-      <w:lvlText w:val="%5."/>
-      <w:lvlJc w:val="left"/>
-      <w:pPr>
-        <w:tabs>
-          <w:tab w:val="num" w:pos="3600"/>
-        </w:tabs>
-        <w:ind w:left="3600" w:hanging="360"/>
-      </w:pPr>
-    </w:lvl>
-    <w:lvl w:ilvl="5" w:tentative="1">
-      <w:start w:val="1"/>
-      <w:numFmt w:val="decimal"/>
-      <w:lvlText w:val="%6."/>
-      <w:lvlJc w:val="left"/>
-      <w:pPr>
-        <w:tabs>
-          <w:tab w:val="num" w:pos="4320"/>
-        </w:tabs>
-        <w:ind w:left="4320" w:hanging="360"/>
-      </w:pPr>
-    </w:lvl>
-    <w:lvl w:ilvl="6" w:tentative="1">
-      <w:start w:val="1"/>
-      <w:numFmt w:val="decimal"/>
-      <w:lvlText w:val="%7."/>
-      <w:lvlJc w:val="left"/>
-      <w:pPr>
-        <w:tabs>
-          <w:tab w:val="num" w:pos="5040"/>
-        </w:tabs>
-        <w:ind w:left="5040" w:hanging="360"/>
-      </w:pPr>
-    </w:lvl>
-    <w:lvl w:ilvl="7" w:tentative="1">
-      <w:start w:val="1"/>
-      <w:numFmt w:val="decimal"/>
-      <w:lvlText w:val="%8."/>
-      <w:lvlJc w:val="left"/>
-      <w:pPr>
-        <w:tabs>
-          <w:tab w:val="num" w:pos="5760"/>
-        </w:tabs>
-        <w:ind w:left="5760" w:hanging="360"/>
-      </w:pPr>
-    </w:lvl>
-    <w:lvl w:ilvl="8" w:tentative="1">
-      <w:start w:val="1"/>
-      <w:numFmt w:val="decimal"/>
-      <w:lvlText w:val="%9."/>
-      <w:lvlJc w:val="left"/>
-      <w:pPr>
-        <w:tabs>
-          <w:tab w:val="num" w:pos="6480"/>
-        </w:tabs>
-        <w:ind w:left="6480" w:hanging="360"/>
-      </w:pPr>
-    </w:lvl>
-  </w:abstractNum>
-  <w:abstractNum w:abstractNumId="31" w15:restartNumberingAfterBreak="0">
-    <w:nsid w:val="5966681D"/>
+  <w:abstractNum w:abstractNumId="32" w15:restartNumberingAfterBreak="0">
+    <w:nsid w:val="50B16119"/>
     <w:multiLevelType w:val="hybridMultilevel"/>
-    <w:tmpl w:val="E8861412"/>
-    <w:lvl w:ilvl="0" w:tplc="1DC2EF76">
-      <w:start w:val="1"/>
-      <w:numFmt w:val="bullet"/>
-      <w:lvlText w:val=""/>
-      <w:lvlJc w:val="left"/>
-      <w:pPr>
-        <w:ind w:left="1429" w:hanging="360"/>
-      </w:pPr>
-      <w:rPr>
-        <w:rFonts w:ascii="Symbol" w:hAnsi="Symbol" w:hint="default"/>
-      </w:rPr>
-    </w:lvl>
-    <w:lvl w:ilvl="1" w:tplc="08070003" w:tentative="1">
-      <w:start w:val="1"/>
-      <w:numFmt w:val="bullet"/>
-      <w:lvlText w:val="o"/>
-      <w:lvlJc w:val="left"/>
-      <w:pPr>
-        <w:ind w:left="2149" w:hanging="360"/>
-      </w:pPr>
-      <w:rPr>
-        <w:rFonts w:ascii="Courier New" w:hAnsi="Courier New" w:cs="Courier New" w:hint="default"/>
-      </w:rPr>
-    </w:lvl>
-    <w:lvl w:ilvl="2" w:tplc="08070005" w:tentative="1">
-      <w:start w:val="1"/>
-      <w:numFmt w:val="bullet"/>
-      <w:lvlText w:val=""/>
-      <w:lvlJc w:val="left"/>
-      <w:pPr>
-        <w:ind w:left="2869" w:hanging="360"/>
-      </w:pPr>
-      <w:rPr>
-        <w:rFonts w:ascii="Wingdings" w:hAnsi="Wingdings" w:hint="default"/>
-      </w:rPr>
-    </w:lvl>
-    <w:lvl w:ilvl="3" w:tplc="08070001" w:tentative="1">
-      <w:start w:val="1"/>
-      <w:numFmt w:val="bullet"/>
-      <w:lvlText w:val=""/>
-      <w:lvlJc w:val="left"/>
-      <w:pPr>
-        <w:ind w:left="3589" w:hanging="360"/>
-      </w:pPr>
-      <w:rPr>
-        <w:rFonts w:ascii="Symbol" w:hAnsi="Symbol" w:hint="default"/>
-      </w:rPr>
-    </w:lvl>
-    <w:lvl w:ilvl="4" w:tplc="08070003" w:tentative="1">
-      <w:start w:val="1"/>
-      <w:numFmt w:val="bullet"/>
-      <w:lvlText w:val="o"/>
-      <w:lvlJc w:val="left"/>
-      <w:pPr>
-        <w:ind w:left="4309" w:hanging="360"/>
-      </w:pPr>
-      <w:rPr>
-        <w:rFonts w:ascii="Courier New" w:hAnsi="Courier New" w:cs="Courier New" w:hint="default"/>
-      </w:rPr>
-    </w:lvl>
-    <w:lvl w:ilvl="5" w:tplc="08070005" w:tentative="1">
-      <w:start w:val="1"/>
-      <w:numFmt w:val="bullet"/>
-      <w:lvlText w:val=""/>
-      <w:lvlJc w:val="left"/>
-      <w:pPr>
-        <w:ind w:left="5029" w:hanging="360"/>
-      </w:pPr>
-      <w:rPr>
-        <w:rFonts w:ascii="Wingdings" w:hAnsi="Wingdings" w:hint="default"/>
-      </w:rPr>
-    </w:lvl>
-    <w:lvl w:ilvl="6" w:tplc="08070001" w:tentative="1">
-      <w:start w:val="1"/>
-      <w:numFmt w:val="bullet"/>
-      <w:lvlText w:val=""/>
-      <w:lvlJc w:val="left"/>
-      <w:pPr>
-        <w:ind w:left="5749" w:hanging="360"/>
-      </w:pPr>
-      <w:rPr>
-        <w:rFonts w:ascii="Symbol" w:hAnsi="Symbol" w:hint="default"/>
-      </w:rPr>
-    </w:lvl>
-    <w:lvl w:ilvl="7" w:tplc="08070003" w:tentative="1">
-      <w:start w:val="1"/>
-      <w:numFmt w:val="bullet"/>
-      <w:lvlText w:val="o"/>
-      <w:lvlJc w:val="left"/>
-      <w:pPr>
-        <w:ind w:left="6469" w:hanging="360"/>
-      </w:pPr>
-      <w:rPr>
-        <w:rFonts w:ascii="Courier New" w:hAnsi="Courier New" w:cs="Courier New" w:hint="default"/>
-      </w:rPr>
-    </w:lvl>
-    <w:lvl w:ilvl="8" w:tplc="08070005" w:tentative="1">
-      <w:start w:val="1"/>
-      <w:numFmt w:val="bullet"/>
-      <w:lvlText w:val=""/>
-      <w:lvlJc w:val="left"/>
-      <w:pPr>
-        <w:ind w:left="7189" w:hanging="360"/>
-      </w:pPr>
-      <w:rPr>
-        <w:rFonts w:ascii="Wingdings" w:hAnsi="Wingdings" w:hint="default"/>
-      </w:rPr>
-    </w:lvl>
-  </w:abstractNum>
-  <w:abstractNum w:abstractNumId="32" w15:restartNumberingAfterBreak="0">
-    <w:nsid w:val="5C2413AD"/>
-    <w:multiLevelType w:val="hybridMultilevel"/>
-    <w:tmpl w:val="5E7E745E"/>
+    <w:tmpl w:val="EE4EA77E"/>
     <w:lvl w:ilvl="0" w:tplc="9C805624">
       <w:start w:val="1"/>
       <w:numFmt w:val="bullet"/>
       <w:lvlText w:val="-"/>
       <w:lvlJc w:val="left"/>
       <w:pPr>
-        <w:ind w:left="1800" w:hanging="360"/>
+        <w:ind w:left="1571" w:hanging="360"/>
       </w:pPr>
       <w:rPr>
         <w:rFonts w:ascii="Arial" w:hAnsi="Arial" w:hint="default"/>
@@ -4867,7 +4861,7 @@
       <w:lvlText w:val="o"/>
       <w:lvlJc w:val="left"/>
       <w:pPr>
-        <w:ind w:left="2520" w:hanging="360"/>
+        <w:ind w:left="2291" w:hanging="360"/>
       </w:pPr>
       <w:rPr>
         <w:rFonts w:ascii="Courier New" w:hAnsi="Courier New" w:cs="Courier New" w:hint="default"/>
@@ -4879,7 +4873,7 @@
       <w:lvlText w:val=""/>
       <w:lvlJc w:val="left"/>
       <w:pPr>
-        <w:ind w:left="3240" w:hanging="360"/>
+        <w:ind w:left="3011" w:hanging="360"/>
       </w:pPr>
       <w:rPr>
         <w:rFonts w:ascii="Wingdings" w:hAnsi="Wingdings" w:hint="default"/>
@@ -4891,7 +4885,7 @@
       <w:lvlText w:val=""/>
       <w:lvlJc w:val="left"/>
       <w:pPr>
-        <w:ind w:left="3960" w:hanging="360"/>
+        <w:ind w:left="3731" w:hanging="360"/>
       </w:pPr>
       <w:rPr>
         <w:rFonts w:ascii="Symbol" w:hAnsi="Symbol" w:hint="default"/>
@@ -4903,7 +4897,7 @@
       <w:lvlText w:val="o"/>
       <w:lvlJc w:val="left"/>
       <w:pPr>
-        <w:ind w:left="4680" w:hanging="360"/>
+        <w:ind w:left="4451" w:hanging="360"/>
       </w:pPr>
       <w:rPr>
         <w:rFonts w:ascii="Courier New" w:hAnsi="Courier New" w:cs="Courier New" w:hint="default"/>
@@ -4915,7 +4909,7 @@
       <w:lvlText w:val=""/>
       <w:lvlJc w:val="left"/>
       <w:pPr>
-        <w:ind w:left="5400" w:hanging="360"/>
+        <w:ind w:left="5171" w:hanging="360"/>
       </w:pPr>
       <w:rPr>
         <w:rFonts w:ascii="Wingdings" w:hAnsi="Wingdings" w:hint="default"/>
@@ -4927,7 +4921,7 @@
       <w:lvlText w:val=""/>
       <w:lvlJc w:val="left"/>
       <w:pPr>
-        <w:ind w:left="6120" w:hanging="360"/>
+        <w:ind w:left="5891" w:hanging="360"/>
       </w:pPr>
       <w:rPr>
         <w:rFonts w:ascii="Symbol" w:hAnsi="Symbol" w:hint="default"/>
@@ -4939,7 +4933,7 @@
       <w:lvlText w:val="o"/>
       <w:lvlJc w:val="left"/>
       <w:pPr>
-        <w:ind w:left="6840" w:hanging="360"/>
+        <w:ind w:left="6611" w:hanging="360"/>
       </w:pPr>
       <w:rPr>
         <w:rFonts w:ascii="Courier New" w:hAnsi="Courier New" w:cs="Courier New" w:hint="default"/>
@@ -4951,7 +4945,7 @@
       <w:lvlText w:val=""/>
       <w:lvlJc w:val="left"/>
       <w:pPr>
-        <w:ind w:left="7560" w:hanging="360"/>
+        <w:ind w:left="7331" w:hanging="360"/>
       </w:pPr>
       <w:rPr>
         <w:rFonts w:ascii="Wingdings" w:hAnsi="Wingdings" w:hint="default"/>
@@ -4959,6 +4953,363 @@
     </w:lvl>
   </w:abstractNum>
   <w:abstractNum w:abstractNumId="33" w15:restartNumberingAfterBreak="0">
+    <w:nsid w:val="579952D8"/>
+    <w:multiLevelType w:val="multilevel"/>
+    <w:tmpl w:val="ECAAE47A"/>
+    <w:lvl w:ilvl="0">
+      <w:start w:val="1"/>
+      <w:numFmt w:val="decimal"/>
+      <w:lvlText w:val="%1."/>
+      <w:lvlJc w:val="left"/>
+      <w:pPr>
+        <w:tabs>
+          <w:tab w:val="num" w:pos="720"/>
+        </w:tabs>
+        <w:ind w:left="720" w:hanging="360"/>
+      </w:pPr>
+    </w:lvl>
+    <w:lvl w:ilvl="1">
+      <w:start w:val="1"/>
+      <w:numFmt w:val="lowerLetter"/>
+      <w:lvlText w:val="%2."/>
+      <w:lvlJc w:val="left"/>
+      <w:pPr>
+        <w:tabs>
+          <w:tab w:val="num" w:pos="1440"/>
+        </w:tabs>
+        <w:ind w:left="1440" w:hanging="360"/>
+      </w:pPr>
+    </w:lvl>
+    <w:lvl w:ilvl="2" w:tentative="1">
+      <w:start w:val="1"/>
+      <w:numFmt w:val="decimal"/>
+      <w:lvlText w:val="%3."/>
+      <w:lvlJc w:val="left"/>
+      <w:pPr>
+        <w:tabs>
+          <w:tab w:val="num" w:pos="2160"/>
+        </w:tabs>
+        <w:ind w:left="2160" w:hanging="360"/>
+      </w:pPr>
+    </w:lvl>
+    <w:lvl w:ilvl="3" w:tentative="1">
+      <w:start w:val="1"/>
+      <w:numFmt w:val="decimal"/>
+      <w:lvlText w:val="%4."/>
+      <w:lvlJc w:val="left"/>
+      <w:pPr>
+        <w:tabs>
+          <w:tab w:val="num" w:pos="2880"/>
+        </w:tabs>
+        <w:ind w:left="2880" w:hanging="360"/>
+      </w:pPr>
+    </w:lvl>
+    <w:lvl w:ilvl="4" w:tentative="1">
+      <w:start w:val="1"/>
+      <w:numFmt w:val="decimal"/>
+      <w:lvlText w:val="%5."/>
+      <w:lvlJc w:val="left"/>
+      <w:pPr>
+        <w:tabs>
+          <w:tab w:val="num" w:pos="3600"/>
+        </w:tabs>
+        <w:ind w:left="3600" w:hanging="360"/>
+      </w:pPr>
+    </w:lvl>
+    <w:lvl w:ilvl="5" w:tentative="1">
+      <w:start w:val="1"/>
+      <w:numFmt w:val="decimal"/>
+      <w:lvlText w:val="%6."/>
+      <w:lvlJc w:val="left"/>
+      <w:pPr>
+        <w:tabs>
+          <w:tab w:val="num" w:pos="4320"/>
+        </w:tabs>
+        <w:ind w:left="4320" w:hanging="360"/>
+      </w:pPr>
+    </w:lvl>
+    <w:lvl w:ilvl="6" w:tentative="1">
+      <w:start w:val="1"/>
+      <w:numFmt w:val="decimal"/>
+      <w:lvlText w:val="%7."/>
+      <w:lvlJc w:val="left"/>
+      <w:pPr>
+        <w:tabs>
+          <w:tab w:val="num" w:pos="5040"/>
+        </w:tabs>
+        <w:ind w:left="5040" w:hanging="360"/>
+      </w:pPr>
+    </w:lvl>
+    <w:lvl w:ilvl="7" w:tentative="1">
+      <w:start w:val="1"/>
+      <w:numFmt w:val="decimal"/>
+      <w:lvlText w:val="%8."/>
+      <w:lvlJc w:val="left"/>
+      <w:pPr>
+        <w:tabs>
+          <w:tab w:val="num" w:pos="5760"/>
+        </w:tabs>
+        <w:ind w:left="5760" w:hanging="360"/>
+      </w:pPr>
+    </w:lvl>
+    <w:lvl w:ilvl="8" w:tentative="1">
+      <w:start w:val="1"/>
+      <w:numFmt w:val="decimal"/>
+      <w:lvlText w:val="%9."/>
+      <w:lvlJc w:val="left"/>
+      <w:pPr>
+        <w:tabs>
+          <w:tab w:val="num" w:pos="6480"/>
+        </w:tabs>
+        <w:ind w:left="6480" w:hanging="360"/>
+      </w:pPr>
+    </w:lvl>
+  </w:abstractNum>
+  <w:abstractNum w:abstractNumId="34" w15:restartNumberingAfterBreak="0">
+    <w:nsid w:val="5966681D"/>
+    <w:multiLevelType w:val="hybridMultilevel"/>
+    <w:tmpl w:val="E8861412"/>
+    <w:lvl w:ilvl="0" w:tplc="1DC2EF76">
+      <w:start w:val="1"/>
+      <w:numFmt w:val="bullet"/>
+      <w:lvlText w:val=""/>
+      <w:lvlJc w:val="left"/>
+      <w:pPr>
+        <w:ind w:left="1429" w:hanging="360"/>
+      </w:pPr>
+      <w:rPr>
+        <w:rFonts w:ascii="Symbol" w:hAnsi="Symbol" w:hint="default"/>
+      </w:rPr>
+    </w:lvl>
+    <w:lvl w:ilvl="1" w:tplc="08070003" w:tentative="1">
+      <w:start w:val="1"/>
+      <w:numFmt w:val="bullet"/>
+      <w:lvlText w:val="o"/>
+      <w:lvlJc w:val="left"/>
+      <w:pPr>
+        <w:ind w:left="2149" w:hanging="360"/>
+      </w:pPr>
+      <w:rPr>
+        <w:rFonts w:ascii="Courier New" w:hAnsi="Courier New" w:cs="Courier New" w:hint="default"/>
+      </w:rPr>
+    </w:lvl>
+    <w:lvl w:ilvl="2" w:tplc="08070005" w:tentative="1">
+      <w:start w:val="1"/>
+      <w:numFmt w:val="bullet"/>
+      <w:lvlText w:val=""/>
+      <w:lvlJc w:val="left"/>
+      <w:pPr>
+        <w:ind w:left="2869" w:hanging="360"/>
+      </w:pPr>
+      <w:rPr>
+        <w:rFonts w:ascii="Wingdings" w:hAnsi="Wingdings" w:hint="default"/>
+      </w:rPr>
+    </w:lvl>
+    <w:lvl w:ilvl="3" w:tplc="08070001" w:tentative="1">
+      <w:start w:val="1"/>
+      <w:numFmt w:val="bullet"/>
+      <w:lvlText w:val=""/>
+      <w:lvlJc w:val="left"/>
+      <w:pPr>
+        <w:ind w:left="3589" w:hanging="360"/>
+      </w:pPr>
+      <w:rPr>
+        <w:rFonts w:ascii="Symbol" w:hAnsi="Symbol" w:hint="default"/>
+      </w:rPr>
+    </w:lvl>
+    <w:lvl w:ilvl="4" w:tplc="08070003" w:tentative="1">
+      <w:start w:val="1"/>
+      <w:numFmt w:val="bullet"/>
+      <w:lvlText w:val="o"/>
+      <w:lvlJc w:val="left"/>
+      <w:pPr>
+        <w:ind w:left="4309" w:hanging="360"/>
+      </w:pPr>
+      <w:rPr>
+        <w:rFonts w:ascii="Courier New" w:hAnsi="Courier New" w:cs="Courier New" w:hint="default"/>
+      </w:rPr>
+    </w:lvl>
+    <w:lvl w:ilvl="5" w:tplc="08070005" w:tentative="1">
+      <w:start w:val="1"/>
+      <w:numFmt w:val="bullet"/>
+      <w:lvlText w:val=""/>
+      <w:lvlJc w:val="left"/>
+      <w:pPr>
+        <w:ind w:left="5029" w:hanging="360"/>
+      </w:pPr>
+      <w:rPr>
+        <w:rFonts w:ascii="Wingdings" w:hAnsi="Wingdings" w:hint="default"/>
+      </w:rPr>
+    </w:lvl>
+    <w:lvl w:ilvl="6" w:tplc="08070001" w:tentative="1">
+      <w:start w:val="1"/>
+      <w:numFmt w:val="bullet"/>
+      <w:lvlText w:val=""/>
+      <w:lvlJc w:val="left"/>
+      <w:pPr>
+        <w:ind w:left="5749" w:hanging="360"/>
+      </w:pPr>
+      <w:rPr>
+        <w:rFonts w:ascii="Symbol" w:hAnsi="Symbol" w:hint="default"/>
+      </w:rPr>
+    </w:lvl>
+    <w:lvl w:ilvl="7" w:tplc="08070003" w:tentative="1">
+      <w:start w:val="1"/>
+      <w:numFmt w:val="bullet"/>
+      <w:lvlText w:val="o"/>
+      <w:lvlJc w:val="left"/>
+      <w:pPr>
+        <w:ind w:left="6469" w:hanging="360"/>
+      </w:pPr>
+      <w:rPr>
+        <w:rFonts w:ascii="Courier New" w:hAnsi="Courier New" w:cs="Courier New" w:hint="default"/>
+      </w:rPr>
+    </w:lvl>
+    <w:lvl w:ilvl="8" w:tplc="08070005" w:tentative="1">
+      <w:start w:val="1"/>
+      <w:numFmt w:val="bullet"/>
+      <w:lvlText w:val=""/>
+      <w:lvlJc w:val="left"/>
+      <w:pPr>
+        <w:ind w:left="7189" w:hanging="360"/>
+      </w:pPr>
+      <w:rPr>
+        <w:rFonts w:ascii="Wingdings" w:hAnsi="Wingdings" w:hint="default"/>
+      </w:rPr>
+    </w:lvl>
+  </w:abstractNum>
+  <w:abstractNum w:abstractNumId="35" w15:restartNumberingAfterBreak="0">
+    <w:nsid w:val="5C2413AD"/>
+    <w:multiLevelType w:val="hybridMultilevel"/>
+    <w:tmpl w:val="5E7E745E"/>
+    <w:lvl w:ilvl="0" w:tplc="9C805624">
+      <w:start w:val="1"/>
+      <w:numFmt w:val="bullet"/>
+      <w:lvlText w:val="-"/>
+      <w:lvlJc w:val="left"/>
+      <w:pPr>
+        <w:ind w:left="1800" w:hanging="360"/>
+      </w:pPr>
+      <w:rPr>
+        <w:rFonts w:ascii="Arial" w:hAnsi="Arial" w:hint="default"/>
+        <w:b w:val="0"/>
+        <w:i w:val="0"/>
+        <w:caps w:val="0"/>
+        <w:strike w:val="0"/>
+        <w:dstrike w:val="0"/>
+        <w:vanish w:val="0"/>
+        <w:color w:val="000000"/>
+        <w:sz w:val="20"/>
+        <w:szCs w:val="20"/>
+        <w:vertAlign w:val="baseline"/>
+        <w14:shadow w14:blurRad="0" w14:dist="0" w14:dir="0" w14:sx="0" w14:sy="0" w14:kx="0" w14:ky="0" w14:algn="none">
+          <w14:srgbClr w14:val="000000"/>
+        </w14:shadow>
+        <w14:textOutline w14:w="0" w14:cap="rnd" w14:cmpd="sng" w14:algn="ctr">
+          <w14:noFill/>
+          <w14:prstDash w14:val="solid"/>
+          <w14:bevel/>
+        </w14:textOutline>
+      </w:rPr>
+    </w:lvl>
+    <w:lvl w:ilvl="1" w:tplc="08070003" w:tentative="1">
+      <w:start w:val="1"/>
+      <w:numFmt w:val="bullet"/>
+      <w:lvlText w:val="o"/>
+      <w:lvlJc w:val="left"/>
+      <w:pPr>
+        <w:ind w:left="2520" w:hanging="360"/>
+      </w:pPr>
+      <w:rPr>
+        <w:rFonts w:ascii="Courier New" w:hAnsi="Courier New" w:cs="Courier New" w:hint="default"/>
+      </w:rPr>
+    </w:lvl>
+    <w:lvl w:ilvl="2" w:tplc="08070005" w:tentative="1">
+      <w:start w:val="1"/>
+      <w:numFmt w:val="bullet"/>
+      <w:lvlText w:val=""/>
+      <w:lvlJc w:val="left"/>
+      <w:pPr>
+        <w:ind w:left="3240" w:hanging="360"/>
+      </w:pPr>
+      <w:rPr>
+        <w:rFonts w:ascii="Wingdings" w:hAnsi="Wingdings" w:hint="default"/>
+      </w:rPr>
+    </w:lvl>
+    <w:lvl w:ilvl="3" w:tplc="08070001" w:tentative="1">
+      <w:start w:val="1"/>
+      <w:numFmt w:val="bullet"/>
+      <w:lvlText w:val=""/>
+      <w:lvlJc w:val="left"/>
+      <w:pPr>
+        <w:ind w:left="3960" w:hanging="360"/>
+      </w:pPr>
+      <w:rPr>
+        <w:rFonts w:ascii="Symbol" w:hAnsi="Symbol" w:hint="default"/>
+      </w:rPr>
+    </w:lvl>
+    <w:lvl w:ilvl="4" w:tplc="08070003" w:tentative="1">
+      <w:start w:val="1"/>
+      <w:numFmt w:val="bullet"/>
+      <w:lvlText w:val="o"/>
+      <w:lvlJc w:val="left"/>
+      <w:pPr>
+        <w:ind w:left="4680" w:hanging="360"/>
+      </w:pPr>
+      <w:rPr>
+        <w:rFonts w:ascii="Courier New" w:hAnsi="Courier New" w:cs="Courier New" w:hint="default"/>
+      </w:rPr>
+    </w:lvl>
+    <w:lvl w:ilvl="5" w:tplc="08070005" w:tentative="1">
+      <w:start w:val="1"/>
+      <w:numFmt w:val="bullet"/>
+      <w:lvlText w:val=""/>
+      <w:lvlJc w:val="left"/>
+      <w:pPr>
+        <w:ind w:left="5400" w:hanging="360"/>
+      </w:pPr>
+      <w:rPr>
+        <w:rFonts w:ascii="Wingdings" w:hAnsi="Wingdings" w:hint="default"/>
+      </w:rPr>
+    </w:lvl>
+    <w:lvl w:ilvl="6" w:tplc="08070001" w:tentative="1">
+      <w:start w:val="1"/>
+      <w:numFmt w:val="bullet"/>
+      <w:lvlText w:val=""/>
+      <w:lvlJc w:val="left"/>
+      <w:pPr>
+        <w:ind w:left="6120" w:hanging="360"/>
+      </w:pPr>
+      <w:rPr>
+        <w:rFonts w:ascii="Symbol" w:hAnsi="Symbol" w:hint="default"/>
+      </w:rPr>
+    </w:lvl>
+    <w:lvl w:ilvl="7" w:tplc="08070003" w:tentative="1">
+      <w:start w:val="1"/>
+      <w:numFmt w:val="bullet"/>
+      <w:lvlText w:val="o"/>
+      <w:lvlJc w:val="left"/>
+      <w:pPr>
+        <w:ind w:left="6840" w:hanging="360"/>
+      </w:pPr>
+      <w:rPr>
+        <w:rFonts w:ascii="Courier New" w:hAnsi="Courier New" w:cs="Courier New" w:hint="default"/>
+      </w:rPr>
+    </w:lvl>
+    <w:lvl w:ilvl="8" w:tplc="08070005" w:tentative="1">
+      <w:start w:val="1"/>
+      <w:numFmt w:val="bullet"/>
+      <w:lvlText w:val=""/>
+      <w:lvlJc w:val="left"/>
+      <w:pPr>
+        <w:ind w:left="7560" w:hanging="360"/>
+      </w:pPr>
+      <w:rPr>
+        <w:rFonts w:ascii="Wingdings" w:hAnsi="Wingdings" w:hint="default"/>
+      </w:rPr>
+    </w:lvl>
+  </w:abstractNum>
+  <w:abstractNum w:abstractNumId="36" w15:restartNumberingAfterBreak="0">
     <w:nsid w:val="5E430200"/>
     <w:multiLevelType w:val="hybridMultilevel"/>
     <w:tmpl w:val="AC5CB6C8"/>
@@ -5071,7 +5422,7 @@
       </w:rPr>
     </w:lvl>
   </w:abstractNum>
-  <w:abstractNum w:abstractNumId="34" w15:restartNumberingAfterBreak="0">
+  <w:abstractNum w:abstractNumId="37" w15:restartNumberingAfterBreak="0">
     <w:nsid w:val="5E9B3A9A"/>
     <w:multiLevelType w:val="hybridMultilevel"/>
     <w:tmpl w:val="102A645A"/>
@@ -5187,7 +5538,93 @@
       </w:pPr>
     </w:lvl>
   </w:abstractNum>
-  <w:abstractNum w:abstractNumId="35" w15:restartNumberingAfterBreak="0">
+  <w:abstractNum w:abstractNumId="38" w15:restartNumberingAfterBreak="0">
+    <w:nsid w:val="5ECF6745"/>
+    <w:multiLevelType w:val="multilevel"/>
+    <w:tmpl w:val="0807001F"/>
+    <w:lvl w:ilvl="0">
+      <w:start w:val="1"/>
+      <w:numFmt w:val="decimal"/>
+      <w:lvlText w:val="%1."/>
+      <w:lvlJc w:val="left"/>
+      <w:pPr>
+        <w:ind w:left="360" w:hanging="360"/>
+      </w:pPr>
+    </w:lvl>
+    <w:lvl w:ilvl="1">
+      <w:start w:val="1"/>
+      <w:numFmt w:val="decimal"/>
+      <w:lvlText w:val="%1.%2."/>
+      <w:lvlJc w:val="left"/>
+      <w:pPr>
+        <w:ind w:left="792" w:hanging="432"/>
+      </w:pPr>
+    </w:lvl>
+    <w:lvl w:ilvl="2">
+      <w:start w:val="1"/>
+      <w:numFmt w:val="decimal"/>
+      <w:lvlText w:val="%1.%2.%3."/>
+      <w:lvlJc w:val="left"/>
+      <w:pPr>
+        <w:ind w:left="1224" w:hanging="504"/>
+      </w:pPr>
+    </w:lvl>
+    <w:lvl w:ilvl="3">
+      <w:start w:val="1"/>
+      <w:numFmt w:val="decimal"/>
+      <w:lvlText w:val="%1.%2.%3.%4."/>
+      <w:lvlJc w:val="left"/>
+      <w:pPr>
+        <w:ind w:left="1728" w:hanging="648"/>
+      </w:pPr>
+    </w:lvl>
+    <w:lvl w:ilvl="4">
+      <w:start w:val="1"/>
+      <w:numFmt w:val="decimal"/>
+      <w:lvlText w:val="%1.%2.%3.%4.%5."/>
+      <w:lvlJc w:val="left"/>
+      <w:pPr>
+        <w:ind w:left="2232" w:hanging="792"/>
+      </w:pPr>
+    </w:lvl>
+    <w:lvl w:ilvl="5">
+      <w:start w:val="1"/>
+      <w:numFmt w:val="decimal"/>
+      <w:lvlText w:val="%1.%2.%3.%4.%5.%6."/>
+      <w:lvlJc w:val="left"/>
+      <w:pPr>
+        <w:ind w:left="2736" w:hanging="936"/>
+      </w:pPr>
+    </w:lvl>
+    <w:lvl w:ilvl="6">
+      <w:start w:val="1"/>
+      <w:numFmt w:val="decimal"/>
+      <w:lvlText w:val="%1.%2.%3.%4.%5.%6.%7."/>
+      <w:lvlJc w:val="left"/>
+      <w:pPr>
+        <w:ind w:left="3240" w:hanging="1080"/>
+      </w:pPr>
+    </w:lvl>
+    <w:lvl w:ilvl="7">
+      <w:start w:val="1"/>
+      <w:numFmt w:val="decimal"/>
+      <w:lvlText w:val="%1.%2.%3.%4.%5.%6.%7.%8."/>
+      <w:lvlJc w:val="left"/>
+      <w:pPr>
+        <w:ind w:left="3744" w:hanging="1224"/>
+      </w:pPr>
+    </w:lvl>
+    <w:lvl w:ilvl="8">
+      <w:start w:val="1"/>
+      <w:numFmt w:val="decimal"/>
+      <w:lvlText w:val="%1.%2.%3.%4.%5.%6.%7.%8.%9."/>
+      <w:lvlJc w:val="left"/>
+      <w:pPr>
+        <w:ind w:left="4320" w:hanging="1440"/>
+      </w:pPr>
+    </w:lvl>
+  </w:abstractNum>
+  <w:abstractNum w:abstractNumId="39" w15:restartNumberingAfterBreak="0">
     <w:nsid w:val="619E3C91"/>
     <w:multiLevelType w:val="hybridMultilevel"/>
     <w:tmpl w:val="83B66966"/>
@@ -5273,7 +5710,7 @@
       </w:pPr>
     </w:lvl>
   </w:abstractNum>
-  <w:abstractNum w:abstractNumId="36" w15:restartNumberingAfterBreak="0">
+  <w:abstractNum w:abstractNumId="40" w15:restartNumberingAfterBreak="0">
     <w:nsid w:val="649E54C4"/>
     <w:multiLevelType w:val="hybridMultilevel"/>
     <w:tmpl w:val="18388BF4"/>
@@ -5386,7 +5823,7 @@
       </w:rPr>
     </w:lvl>
   </w:abstractNum>
-  <w:abstractNum w:abstractNumId="37" w15:restartNumberingAfterBreak="0">
+  <w:abstractNum w:abstractNumId="41" w15:restartNumberingAfterBreak="0">
     <w:nsid w:val="64A715F1"/>
     <w:multiLevelType w:val="multilevel"/>
     <w:tmpl w:val="697E9EB0"/>
@@ -5503,7 +5940,7 @@
       </w:rPr>
     </w:lvl>
   </w:abstractNum>
-  <w:abstractNum w:abstractNumId="38" w15:restartNumberingAfterBreak="0">
+  <w:abstractNum w:abstractNumId="42" w15:restartNumberingAfterBreak="0">
     <w:nsid w:val="6C25091C"/>
     <w:multiLevelType w:val="multilevel"/>
     <w:tmpl w:val="17DE13FA"/>
@@ -5665,7 +6102,7 @@
       </w:rPr>
     </w:lvl>
   </w:abstractNum>
-  <w:abstractNum w:abstractNumId="39" w15:restartNumberingAfterBreak="0">
+  <w:abstractNum w:abstractNumId="43" w15:restartNumberingAfterBreak="0">
     <w:nsid w:val="6C2A4FAD"/>
     <w:multiLevelType w:val="hybridMultilevel"/>
     <w:tmpl w:val="AD2046CE"/>
@@ -5778,7 +6215,7 @@
       </w:rPr>
     </w:lvl>
   </w:abstractNum>
-  <w:abstractNum w:abstractNumId="40" w15:restartNumberingAfterBreak="0">
+  <w:abstractNum w:abstractNumId="44" w15:restartNumberingAfterBreak="0">
     <w:nsid w:val="6C931B69"/>
     <w:multiLevelType w:val="multilevel"/>
     <w:tmpl w:val="9C001EC2"/>
@@ -5891,7 +6328,7 @@
       </w:pPr>
     </w:lvl>
   </w:abstractNum>
-  <w:abstractNum w:abstractNumId="41" w15:restartNumberingAfterBreak="0">
+  <w:abstractNum w:abstractNumId="45" w15:restartNumberingAfterBreak="0">
     <w:nsid w:val="6FB95977"/>
     <w:multiLevelType w:val="hybridMultilevel"/>
     <w:tmpl w:val="736C81CC"/>
@@ -5980,7 +6417,7 @@
       </w:pPr>
     </w:lvl>
   </w:abstractNum>
-  <w:abstractNum w:abstractNumId="42" w15:restartNumberingAfterBreak="0">
+  <w:abstractNum w:abstractNumId="46" w15:restartNumberingAfterBreak="0">
     <w:nsid w:val="748B4F6D"/>
     <w:multiLevelType w:val="multilevel"/>
     <w:tmpl w:val="A5B80CEA"/>
@@ -6093,7 +6530,7 @@
       </w:pPr>
     </w:lvl>
   </w:abstractNum>
-  <w:abstractNum w:abstractNumId="43" w15:restartNumberingAfterBreak="0">
+  <w:abstractNum w:abstractNumId="47" w15:restartNumberingAfterBreak="0">
     <w:nsid w:val="778874D3"/>
     <w:multiLevelType w:val="hybridMultilevel"/>
     <w:tmpl w:val="1B96D124"/>
@@ -6206,7 +6643,7 @@
       </w:rPr>
     </w:lvl>
   </w:abstractNum>
-  <w:abstractNum w:abstractNumId="44" w15:restartNumberingAfterBreak="0">
+  <w:abstractNum w:abstractNumId="48" w15:restartNumberingAfterBreak="0">
     <w:nsid w:val="7E2E0140"/>
     <w:multiLevelType w:val="hybridMultilevel"/>
     <w:tmpl w:val="4DAAEBBA"/>
@@ -6320,13 +6757,13 @@
     </w:lvl>
   </w:abstractNum>
   <w:num w:numId="1" w16cid:durableId="2058044410">
-    <w:abstractNumId w:val="34"/>
+    <w:abstractNumId w:val="37"/>
   </w:num>
   <w:num w:numId="2" w16cid:durableId="1494831986">
     <w:abstractNumId w:val="19"/>
   </w:num>
   <w:num w:numId="3" w16cid:durableId="279454391">
-    <w:abstractNumId w:val="38"/>
+    <w:abstractNumId w:val="42"/>
   </w:num>
   <w:num w:numId="4" w16cid:durableId="512452334">
     <w:abstractNumId w:val="24"/>
@@ -6371,13 +6808,13 @@
     <w:abstractNumId w:val="17"/>
   </w:num>
   <w:num w:numId="18" w16cid:durableId="1970744932">
-    <w:abstractNumId w:val="26"/>
+    <w:abstractNumId w:val="28"/>
   </w:num>
   <w:num w:numId="19" w16cid:durableId="1910994975">
     <w:abstractNumId w:val="20"/>
   </w:num>
   <w:num w:numId="20" w16cid:durableId="710423429">
-    <w:abstractNumId w:val="27"/>
+    <w:abstractNumId w:val="29"/>
   </w:num>
   <w:num w:numId="21" w16cid:durableId="353456531">
     <w:abstractNumId w:val="15"/>
@@ -6389,19 +6826,19 @@
     <w:abstractNumId w:val="13"/>
   </w:num>
   <w:num w:numId="24" w16cid:durableId="2073499117">
-    <w:abstractNumId w:val="44"/>
+    <w:abstractNumId w:val="48"/>
   </w:num>
   <w:num w:numId="25" w16cid:durableId="638532971">
-    <w:abstractNumId w:val="33"/>
+    <w:abstractNumId w:val="36"/>
   </w:num>
   <w:num w:numId="26" w16cid:durableId="1160150332">
-    <w:abstractNumId w:val="39"/>
+    <w:abstractNumId w:val="43"/>
   </w:num>
   <w:num w:numId="27" w16cid:durableId="1974797392">
-    <w:abstractNumId w:val="25"/>
+    <w:abstractNumId w:val="27"/>
   </w:num>
   <w:num w:numId="28" w16cid:durableId="74208223">
-    <w:abstractNumId w:val="31"/>
+    <w:abstractNumId w:val="34"/>
   </w:num>
   <w:num w:numId="29" w16cid:durableId="261961244">
     <w:abstractNumId w:val="11"/>
@@ -6410,16 +6847,16 @@
     <w:abstractNumId w:val="22"/>
   </w:num>
   <w:num w:numId="31" w16cid:durableId="2080011610">
-    <w:abstractNumId w:val="43"/>
+    <w:abstractNumId w:val="47"/>
   </w:num>
   <w:num w:numId="32" w16cid:durableId="564532807">
-    <w:abstractNumId w:val="41"/>
+    <w:abstractNumId w:val="45"/>
   </w:num>
   <w:num w:numId="33" w16cid:durableId="580406080">
     <w:abstractNumId w:val="12"/>
   </w:num>
   <w:num w:numId="34" w16cid:durableId="1409230196">
-    <w:abstractNumId w:val="29"/>
+    <w:abstractNumId w:val="31"/>
   </w:num>
   <w:num w:numId="35" w16cid:durableId="1180120421">
     <w:abstractNumId w:val="23"/>
@@ -6428,31 +6865,43 @@
     <w:abstractNumId w:val="16"/>
   </w:num>
   <w:num w:numId="37" w16cid:durableId="53430655">
-    <w:abstractNumId w:val="36"/>
+    <w:abstractNumId w:val="40"/>
   </w:num>
   <w:num w:numId="38" w16cid:durableId="993143293">
     <w:abstractNumId w:val="10"/>
   </w:num>
   <w:num w:numId="39" w16cid:durableId="1696806991">
-    <w:abstractNumId w:val="32"/>
+    <w:abstractNumId w:val="35"/>
   </w:num>
   <w:num w:numId="40" w16cid:durableId="2119639863">
-    <w:abstractNumId w:val="37"/>
+    <w:abstractNumId w:val="41"/>
   </w:num>
   <w:num w:numId="41" w16cid:durableId="2135588828">
-    <w:abstractNumId w:val="35"/>
+    <w:abstractNumId w:val="39"/>
   </w:num>
   <w:num w:numId="42" w16cid:durableId="1836216469">
-    <w:abstractNumId w:val="28"/>
+    <w:abstractNumId w:val="30"/>
   </w:num>
   <w:num w:numId="43" w16cid:durableId="1926182703">
-    <w:abstractNumId w:val="42"/>
+    <w:abstractNumId w:val="46"/>
   </w:num>
   <w:num w:numId="44" w16cid:durableId="1272125174">
-    <w:abstractNumId w:val="30"/>
+    <w:abstractNumId w:val="33"/>
   </w:num>
   <w:num w:numId="45" w16cid:durableId="619845929">
-    <w:abstractNumId w:val="40"/>
+    <w:abstractNumId w:val="44"/>
+  </w:num>
+  <w:num w:numId="46" w16cid:durableId="1357002696">
+    <w:abstractNumId w:val="26"/>
+  </w:num>
+  <w:num w:numId="47" w16cid:durableId="367730604">
+    <w:abstractNumId w:val="25"/>
+  </w:num>
+  <w:num w:numId="48" w16cid:durableId="281428404">
+    <w:abstractNumId w:val="38"/>
+  </w:num>
+  <w:num w:numId="49" w16cid:durableId="225578339">
+    <w:abstractNumId w:val="32"/>
   </w:num>
 </w:numbering>
 </file>
@@ -7452,18 +7901,14 @@
 </file>
 
 <file path=customXml/item1.xml><?xml version="1.0" encoding="utf-8"?>
+<officeatwork xmlns="http://schemas.officeatwork.com/MasterProperties">eNp7v3u/jW9icUlqUUBRfkFqUUllcGpJsYK+HQCb2Qqj</officeatwork>
+</file>
+
+<file path=customXml/item2.xml><?xml version="1.0" encoding="utf-8"?>
 <officeatwork xmlns="http://schemas.officeatwork.com/Document">eNp7v3u/jUt+cmlual6JnU1wfk5pSWZ+nmeKXVK2jT4S18YnMS+9NDE91c7IwNTURh/OtQnLTC23s9GHUnCzAA5cIJ8=</officeatwork>
 </file>
 
-<file path=customXml/item2.xml><?xml version="1.0" encoding="utf-8"?>
-<officeatwork xmlns="http://schemas.officeatwork.com/MasterProperties">eNp7v3u/jW9icUlqUUBRfkFqUUllcGpJsYK+HQCb2Qqj</officeatwork>
-</file>
-
 <file path=customXml/item3.xml><?xml version="1.0" encoding="utf-8"?>
-<officeatwork xmlns="http://schemas.officeatwork.com/Formulas">eNp7v3u/jVt+UW5pTmKxgr4dAD33Bnw=</officeatwork>
-</file>
-
-<file path=customXml/item4.xml><?xml version="1.0" encoding="utf-8"?>
 <f:fields xmlns:f="http://schemas.fabasoft.com/folio/2007/fields">
   <f:record ref="">
     <f:field ref="objname" par="" edit="true" text="ENTW BRB zu BRA BK 2019xxxx Ausserparlamentarischen Kommissionen, Leitungsorgane und Vertretungen des Bundes: Gesamterneuerungswahlen für die Amtsperiode 2020-2023"/>
@@ -7516,7 +7961,19 @@
 </f:fields>
 </file>
 
+<file path=customXml/item4.xml><?xml version="1.0" encoding="utf-8"?>
+<officeatwork xmlns="http://schemas.officeatwork.com/Formulas">eNp7v3u/jVt+UW5pTmKxgr4dAD33Bnw=</officeatwork>
+</file>
+
 <file path=customXml/itemProps1.xml><?xml version="1.0" encoding="utf-8"?>
+<ds:datastoreItem xmlns:ds="http://schemas.openxmlformats.org/officeDocument/2006/customXml" ds:itemID="{3B3F6925-11A7-4614-A610-E26516665FC7}">
+  <ds:schemaRefs>
+    <ds:schemaRef ds:uri="http://schemas.officeatwork.com/MasterProperties"/>
+  </ds:schemaRefs>
+</ds:datastoreItem>
+</file>
+
+<file path=customXml/itemProps2.xml><?xml version="1.0" encoding="utf-8"?>
 <ds:datastoreItem xmlns:ds="http://schemas.openxmlformats.org/officeDocument/2006/customXml" ds:itemID="{826A14BC-61C7-4B5E-A710-1212315CFB87}">
   <ds:schemaRefs>
     <ds:schemaRef ds:uri="http://schemas.officeatwork.com/Document"/>
@@ -7524,26 +7981,18 @@
 </ds:datastoreItem>
 </file>
 
-<file path=customXml/itemProps2.xml><?xml version="1.0" encoding="utf-8"?>
-<ds:datastoreItem xmlns:ds="http://schemas.openxmlformats.org/officeDocument/2006/customXml" ds:itemID="{3B3F6925-11A7-4614-A610-E26516665FC7}">
+<file path=customXml/itemProps3.xml><?xml version="1.0" encoding="utf-8"?>
+<ds:datastoreItem xmlns:ds="http://schemas.openxmlformats.org/officeDocument/2006/customXml" ds:itemID="{4E8A9591-F074-446B-902F-511FF79C122F}">
   <ds:schemaRefs>
-    <ds:schemaRef ds:uri="http://schemas.officeatwork.com/MasterProperties"/>
+    <ds:schemaRef ds:uri="http://schemas.fabasoft.com/folio/2007/fields"/>
   </ds:schemaRefs>
 </ds:datastoreItem>
 </file>
 
-<file path=customXml/itemProps3.xml><?xml version="1.0" encoding="utf-8"?>
+<file path=customXml/itemProps4.xml><?xml version="1.0" encoding="utf-8"?>
 <ds:datastoreItem xmlns:ds="http://schemas.openxmlformats.org/officeDocument/2006/customXml" ds:itemID="{FACC0E0D-5C77-45BD-958B-944424F72D0B}">
   <ds:schemaRefs>
     <ds:schemaRef ds:uri="http://schemas.officeatwork.com/Formulas"/>
   </ds:schemaRefs>
 </ds:datastoreItem>
-</file>
-
-<file path=customXml/itemProps4.xml><?xml version="1.0" encoding="utf-8"?>
-<ds:datastoreItem xmlns:ds="http://schemas.openxmlformats.org/officeDocument/2006/customXml" ds:itemID="{4E8A9591-F074-446B-902F-511FF79C122F}">
-  <ds:schemaRefs>
-    <ds:schemaRef ds:uri="http://schemas.fabasoft.com/folio/2007/fields"/>
-  </ds:schemaRefs>
-</ds:datastoreItem>
 </file>
</xml_diff>

<commit_message>
feat: update templates with correct numbering #BKDO-210
</commit_message>
<xml_diff>
--- a/src/Bk.APG.Api/Templates/APG_Decision_Federal_Council_French.docx
+++ b/src/Bk.APG.Api/Templates/APG_Decision_Federal_Council_French.docx
@@ -219,7 +219,7 @@
         <w:pStyle w:val="Listenabsatz"/>
         <w:numPr>
           <w:ilvl w:val="0"/>
-          <w:numId w:val="48"/>
+          <w:numId w:val="50"/>
         </w:numPr>
         <w:rPr>
           <w:szCs w:val="24"/>
@@ -269,7 +269,7 @@
         <w:pStyle w:val="Listenabsatz"/>
         <w:numPr>
           <w:ilvl w:val="0"/>
-          <w:numId w:val="48"/>
+          <w:numId w:val="50"/>
         </w:numPr>
         <w:spacing w:after="120"/>
         <w:rPr>
@@ -343,7 +343,7 @@
       <w:pPr>
         <w:pStyle w:val="Listenabsatz"/>
         <w:spacing w:after="120"/>
-        <w:ind w:left="360"/>
+        <w:ind w:left="0"/>
         <w:rPr>
           <w:szCs w:val="24"/>
           <w:lang w:val="fr-CH"/>
@@ -355,7 +355,7 @@
         <w:pStyle w:val="Listenabsatz"/>
         <w:numPr>
           <w:ilvl w:val="0"/>
-          <w:numId w:val="48"/>
+          <w:numId w:val="50"/>
         </w:numPr>
         <w:rPr>
           <w:szCs w:val="24"/>
@@ -392,7 +392,7 @@
         <w:pStyle w:val="Listenabsatz"/>
         <w:numPr>
           <w:ilvl w:val="0"/>
-          <w:numId w:val="48"/>
+          <w:numId w:val="50"/>
         </w:numPr>
         <w:rPr>
           <w:szCs w:val="24"/>
@@ -435,14 +435,7 @@
           <w:szCs w:val="24"/>
           <w:lang w:val="en-US"/>
         </w:rPr>
-        <w:t>n</w:t>
-      </w:r>
-      <w:r>
-        <w:rPr>
-          <w:szCs w:val="24"/>
-          <w:lang w:val="en-US"/>
-        </w:rPr>
-        <w:t>onReleasedCommissions</w:t>
+        <w:t>nonReleasedCommissions</w:t>
       </w:r>
       <w:r>
         <w:rPr>
@@ -455,7 +448,10 @@
     <w:p>
       <w:pPr>
         <w:pStyle w:val="Listenabsatz"/>
-        <w:ind w:left="360"/>
+        <w:numPr>
+          <w:ilvl w:val="1"/>
+          <w:numId w:val="50"/>
+        </w:numPr>
         <w:rPr>
           <w:szCs w:val="24"/>
           <w:lang w:val="en-US"/>
@@ -503,7 +499,7 @@
         <w:pStyle w:val="Listenabsatz"/>
         <w:numPr>
           <w:ilvl w:val="0"/>
-          <w:numId w:val="48"/>
+          <w:numId w:val="50"/>
         </w:numPr>
         <w:spacing w:after="120"/>
         <w:rPr>
@@ -529,7 +525,7 @@
     <w:p>
       <w:pPr>
         <w:pStyle w:val="Listenabsatz"/>
-        <w:ind w:left="426"/>
+        <w:ind w:left="360"/>
         <w:rPr>
           <w:szCs w:val="24"/>
           <w:lang w:val="en-US"/>
@@ -546,7 +542,10 @@
     <w:p>
       <w:pPr>
         <w:pStyle w:val="Listenabsatz"/>
-        <w:ind w:left="426"/>
+        <w:numPr>
+          <w:ilvl w:val="1"/>
+          <w:numId w:val="50"/>
+        </w:numPr>
         <w:rPr>
           <w:szCs w:val="24"/>
           <w:lang w:val="en-US"/>
@@ -584,7 +583,7 @@
       <w:pPr>
         <w:pStyle w:val="Listenabsatz"/>
         <w:spacing w:before="60" w:after="40"/>
-        <w:ind w:left="426"/>
+        <w:ind w:left="360" w:firstLine="349"/>
         <w:contextualSpacing w:val="0"/>
         <w:rPr>
           <w:szCs w:val="24"/>
@@ -616,7 +615,7 @@
     <w:p>
       <w:pPr>
         <w:pStyle w:val="Listenabsatz"/>
-        <w:ind w:left="709" w:hanging="283"/>
+        <w:ind w:left="0"/>
         <w:rPr>
           <w:sz w:val="12"/>
           <w:szCs w:val="12"/>
@@ -627,7 +626,7 @@
     <w:p>
       <w:pPr>
         <w:pStyle w:val="Listenabsatz"/>
-        <w:ind w:left="709" w:hanging="283"/>
+        <w:ind w:left="360"/>
         <w:rPr>
           <w:szCs w:val="24"/>
           <w:lang w:val="en-US"/>
@@ -656,7 +655,7 @@
         <w:pStyle w:val="Listenabsatz"/>
         <w:numPr>
           <w:ilvl w:val="0"/>
-          <w:numId w:val="48"/>
+          <w:numId w:val="50"/>
         </w:numPr>
         <w:spacing w:after="120"/>
         <w:rPr>
@@ -671,13 +670,24 @@
         </w:rPr>
         <w:t>Les exceptions relatives à la composition des commissions extraparlementaires ou à leurs membres sont approuvées comme ci-après.</w:t>
       </w:r>
+    </w:p>
+    <w:p>
+      <w:pPr>
+        <w:pStyle w:val="Listenabsatz"/>
+        <w:spacing w:after="120"/>
+        <w:ind w:left="360"/>
+        <w:rPr>
+          <w:szCs w:val="24"/>
+          <w:lang w:val="fr-CH"/>
+        </w:rPr>
+      </w:pPr>
     </w:p>
     <w:p>
       <w:pPr>
         <w:pStyle w:val="Listenabsatz"/>
         <w:numPr>
           <w:ilvl w:val="1"/>
-          <w:numId w:val="48"/>
+          <w:numId w:val="50"/>
         </w:numPr>
         <w:spacing w:after="120"/>
         <w:rPr>
@@ -703,7 +713,7 @@
     <w:p>
       <w:pPr>
         <w:pStyle w:val="Listenabsatz"/>
-        <w:ind w:left="1134" w:hanging="283"/>
+        <w:ind w:left="360"/>
         <w:rPr>
           <w:szCs w:val="24"/>
           <w:lang w:val="en-US"/>
@@ -721,11 +731,10 @@
       <w:pPr>
         <w:pStyle w:val="Listenabsatz"/>
         <w:numPr>
-          <w:ilvl w:val="0"/>
-          <w:numId w:val="49"/>
+          <w:ilvl w:val="2"/>
+          <w:numId w:val="50"/>
         </w:numPr>
         <w:spacing w:before="120" w:after="60"/>
-        <w:ind w:left="1134" w:hanging="283"/>
         <w:rPr>
           <w:szCs w:val="24"/>
           <w:lang w:val="en-US"/>
@@ -738,62 +747,14 @@
           <w:szCs w:val="24"/>
           <w:lang w:val="en-US"/>
         </w:rPr>
-        <w:t>&lt;&lt;[committee.</w:t>
-      </w:r>
-      <w:r>
-        <w:rPr>
-          <w:b/>
-          <w:bCs/>
-          <w:szCs w:val="24"/>
-          <w:lang w:val="en-US"/>
-        </w:rPr>
-        <w:t>n</w:t>
-      </w:r>
-      <w:r>
-        <w:rPr>
-          <w:b/>
-          <w:bCs/>
-          <w:szCs w:val="24"/>
-          <w:lang w:val="en-US"/>
-        </w:rPr>
-        <w:t>ame]&gt;&gt;</w:t>
-      </w:r>
-      <w:r>
-        <w:rPr>
-          <w:b/>
-          <w:bCs/>
-          <w:szCs w:val="24"/>
-          <w:lang w:val="en-US"/>
-        </w:rPr>
-        <w:t xml:space="preserve">: </w:t>
-      </w:r>
-      <w:r>
-        <w:rPr>
-          <w:szCs w:val="24"/>
-          <w:lang w:val="en-US"/>
-        </w:rPr>
-        <w:t>&lt;&lt;[committee.</w:t>
-      </w:r>
-      <w:r>
-        <w:rPr>
-          <w:szCs w:val="24"/>
-          <w:lang w:val="en-US"/>
-        </w:rPr>
-        <w:t>memberCount</w:t>
-      </w:r>
-      <w:r>
-        <w:rPr>
-          <w:szCs w:val="24"/>
-          <w:lang w:val="en-US"/>
-        </w:rPr>
-        <w:t>]&gt;&gt;</w:t>
-      </w:r>
-      <w:r>
-        <w:rPr>
-          <w:szCs w:val="24"/>
-          <w:lang w:val="en-US"/>
-        </w:rPr>
-        <w:t xml:space="preserve"> </w:t>
+        <w:t xml:space="preserve">&lt;&lt;[committee.name]&gt;&gt;: </w:t>
+      </w:r>
+      <w:r>
+        <w:rPr>
+          <w:szCs w:val="24"/>
+          <w:lang w:val="en-US"/>
+        </w:rPr>
+        <w:t xml:space="preserve">&lt;&lt;[committee.memberCount]&gt;&gt; </w:t>
       </w:r>
       <w:r>
         <w:rPr>
@@ -806,7 +767,7 @@
     <w:p>
       <w:pPr>
         <w:pStyle w:val="Listenabsatz"/>
-        <w:ind w:left="1134" w:hanging="283"/>
+        <w:ind w:left="360"/>
         <w:rPr>
           <w:szCs w:val="24"/>
           <w:lang w:val="en-US"/>
@@ -834,7 +795,7 @@
         <w:pStyle w:val="Listenabsatz"/>
         <w:numPr>
           <w:ilvl w:val="1"/>
-          <w:numId w:val="48"/>
+          <w:numId w:val="50"/>
         </w:numPr>
         <w:spacing w:after="120"/>
         <w:rPr>
@@ -847,6 +808,7 @@
           <w:szCs w:val="24"/>
           <w:lang w:val="fr-CH"/>
         </w:rPr>
+        <w:lastRenderedPageBreak/>
         <w:t>La sous-représentation des femmes ou des hommes (art. 8</w:t>
       </w:r>
       <w:r>
@@ -876,18 +838,17 @@
     <w:p>
       <w:pPr>
         <w:pStyle w:val="Listenabsatz"/>
-        <w:ind w:left="1134" w:hanging="283"/>
-        <w:rPr>
-          <w:szCs w:val="24"/>
-          <w:lang w:val="en-US"/>
-        </w:rPr>
-      </w:pPr>
-      <w:r>
-        <w:rPr>
-          <w:szCs w:val="24"/>
-          <w:lang w:val="en-US"/>
-        </w:rPr>
-        <w:lastRenderedPageBreak/>
+        <w:ind w:left="360"/>
+        <w:rPr>
+          <w:szCs w:val="24"/>
+          <w:lang w:val="en-US"/>
+        </w:rPr>
+      </w:pPr>
+      <w:r>
+        <w:rPr>
+          <w:szCs w:val="24"/>
+          <w:lang w:val="en-US"/>
+        </w:rPr>
         <w:t>&lt;&lt;foreach [committee in decisionFederalCouncil.</w:t>
       </w:r>
       <w:r>
@@ -909,11 +870,10 @@
       <w:pPr>
         <w:pStyle w:val="Listenabsatz"/>
         <w:numPr>
-          <w:ilvl w:val="0"/>
-          <w:numId w:val="49"/>
+          <w:ilvl w:val="2"/>
+          <w:numId w:val="50"/>
         </w:numPr>
         <w:spacing w:before="120" w:after="60"/>
-        <w:ind w:left="1134" w:hanging="283"/>
         <w:rPr>
           <w:szCs w:val="24"/>
           <w:lang w:val="en-US"/>
@@ -926,34 +886,7 @@
           <w:szCs w:val="24"/>
           <w:lang w:val="en-US"/>
         </w:rPr>
-        <w:t>&lt;&lt;[committee.</w:t>
-      </w:r>
-      <w:r>
-        <w:rPr>
-          <w:b/>
-          <w:bCs/>
-          <w:szCs w:val="24"/>
-          <w:lang w:val="en-US"/>
-        </w:rPr>
-        <w:t>n</w:t>
-      </w:r>
-      <w:r>
-        <w:rPr>
-          <w:b/>
-          <w:bCs/>
-          <w:szCs w:val="24"/>
-          <w:lang w:val="en-US"/>
-        </w:rPr>
-        <w:t>ame]&gt;&gt;</w:t>
-      </w:r>
-      <w:r>
-        <w:rPr>
-          <w:b/>
-          <w:bCs/>
-          <w:szCs w:val="24"/>
-          <w:lang w:val="en-US"/>
-        </w:rPr>
-        <w:t xml:space="preserve">: </w:t>
+        <w:t xml:space="preserve">&lt;&lt;[committee.name]&gt;&gt;: </w:t>
       </w:r>
       <w:r>
         <w:rPr>
@@ -1008,7 +941,7 @@
     <w:p>
       <w:pPr>
         <w:pStyle w:val="Listenabsatz"/>
-        <w:ind w:left="1134" w:hanging="283"/>
+        <w:ind w:left="360"/>
         <w:rPr>
           <w:szCs w:val="24"/>
           <w:lang w:val="en-US"/>
@@ -1038,7 +971,7 @@
         <w:pStyle w:val="Listenabsatz"/>
         <w:numPr>
           <w:ilvl w:val="1"/>
-          <w:numId w:val="48"/>
+          <w:numId w:val="50"/>
         </w:numPr>
         <w:rPr>
           <w:szCs w:val="24"/>
@@ -1080,7 +1013,7 @@
     <w:p>
       <w:pPr>
         <w:pStyle w:val="Listenabsatz"/>
-        <w:ind w:left="1134" w:hanging="283"/>
+        <w:ind w:left="360"/>
         <w:rPr>
           <w:szCs w:val="24"/>
           <w:lang w:val="en-US"/>
@@ -1114,566 +1047,441 @@
         </w:rPr>
         <w:t>]&gt;&gt;</w:t>
       </w:r>
+    </w:p>
+    <w:p>
+      <w:pPr>
+        <w:pStyle w:val="Listenabsatz"/>
+        <w:numPr>
+          <w:ilvl w:val="2"/>
+          <w:numId w:val="50"/>
+        </w:numPr>
+        <w:spacing w:before="120" w:after="60"/>
+        <w:rPr>
+          <w:szCs w:val="24"/>
+          <w:lang w:val="en-US"/>
+        </w:rPr>
+      </w:pPr>
+      <w:r>
+        <w:rPr>
+          <w:b/>
+          <w:bCs/>
+          <w:szCs w:val="24"/>
+          <w:lang w:val="en-US"/>
+        </w:rPr>
+        <w:t>&lt;&lt;[committee.name]&gt;&gt;:</w:t>
+      </w:r>
+      <w:r>
+        <w:rPr>
+          <w:szCs w:val="24"/>
+          <w:lang w:val="en-US"/>
+        </w:rPr>
+        <w:t xml:space="preserve"> &lt;&lt;if [committee.frenchMissing == true &amp;&amp; committee.italianMissing == true]&gt;&gt;</w:t>
+      </w:r>
+      <w:r>
+        <w:rPr>
+          <w:lang w:val="en-US"/>
+        </w:rPr>
+        <w:t>communauté francophone &amp; italophone</w:t>
+      </w:r>
+      <w:r>
+        <w:rPr>
+          <w:noProof/>
+          <w:lang w:val="en-US"/>
+        </w:rPr>
+        <w:t xml:space="preserve"> non représentée</w:t>
+      </w:r>
+      <w:r>
+        <w:rPr>
+          <w:szCs w:val="24"/>
+          <w:lang w:val="en-US"/>
+        </w:rPr>
+        <w:t>&lt;&lt;/if&gt;&gt;&lt;&lt;if [committee.frenchMissing == true &amp;&amp; committee.italianMissing == false]&gt;&gt;</w:t>
+      </w:r>
+      <w:bookmarkStart w:id="2" w:name="_Hlk149123267"/>
+      <w:r>
+        <w:rPr>
+          <w:lang w:val="en-US"/>
+        </w:rPr>
+        <w:t>communauté francophone</w:t>
+      </w:r>
+      <w:bookmarkEnd w:id="2"/>
+      <w:r>
+        <w:rPr>
+          <w:noProof/>
+          <w:lang w:val="en-US"/>
+        </w:rPr>
+        <w:t xml:space="preserve"> non représentée</w:t>
+      </w:r>
+      <w:r>
+        <w:rPr>
+          <w:szCs w:val="24"/>
+          <w:lang w:val="en-US"/>
+        </w:rPr>
+        <w:t>&lt;&lt;/if&gt;&gt;&lt;&lt;if [committee.italianMissing == true &amp;&amp; committee.frenchMissing == false]&gt;&gt;</w:t>
+      </w:r>
+      <w:r>
+        <w:rPr>
+          <w:lang w:val="en-US"/>
+        </w:rPr>
+        <w:t>communauté italophone</w:t>
+      </w:r>
+      <w:r>
+        <w:rPr>
+          <w:noProof/>
+          <w:lang w:val="en-US"/>
+        </w:rPr>
+        <w:t xml:space="preserve"> non représentée</w:t>
+      </w:r>
+      <w:r>
+        <w:rPr>
+          <w:szCs w:val="24"/>
+          <w:lang w:val="en-US"/>
+        </w:rPr>
+        <w:t>&lt;&lt;/if&gt;&gt;</w:t>
+      </w:r>
+    </w:p>
+    <w:p>
+      <w:pPr>
+        <w:pStyle w:val="Listenabsatz"/>
+        <w:ind w:left="360"/>
+        <w:rPr>
+          <w:szCs w:val="24"/>
+          <w:lang w:val="en-US"/>
+        </w:rPr>
+      </w:pPr>
+      <w:r>
+        <w:rPr>
+          <w:szCs w:val="24"/>
+          <w:lang w:val="en-US"/>
+        </w:rPr>
+        <w:t>&lt;&lt;/foreach&gt;&gt;</w:t>
+      </w:r>
+    </w:p>
+    <w:p>
+      <w:pPr>
+        <w:rPr>
+          <w:szCs w:val="24"/>
+        </w:rPr>
+      </w:pPr>
+    </w:p>
+    <w:p>
+      <w:pPr>
+        <w:pStyle w:val="Listenabsatz"/>
+        <w:numPr>
+          <w:ilvl w:val="1"/>
+          <w:numId w:val="50"/>
+        </w:numPr>
+        <w:rPr>
+          <w:szCs w:val="24"/>
+          <w:lang w:val="fr-CH"/>
+        </w:rPr>
+      </w:pPr>
+      <w:r>
+        <w:rPr>
+          <w:szCs w:val="24"/>
+          <w:lang w:val="fr-CH"/>
+        </w:rPr>
+        <w:t>Les exceptions à la limitation de la durée de fonction (art. 8</w:t>
+      </w:r>
+      <w:r>
+        <w:rPr>
+          <w:i/>
+          <w:iCs/>
+          <w:szCs w:val="24"/>
+          <w:lang w:val="fr-CH"/>
+        </w:rPr>
+        <w:t>i</w:t>
+      </w:r>
+      <w:r>
+        <w:rPr>
+          <w:szCs w:val="24"/>
+          <w:lang w:val="fr-CH"/>
+        </w:rPr>
+        <w:t>, al. 2, OLOGA) dans les commissions extraparlementaires suivantes sont approuvées</w:t>
+      </w:r>
+      <w:r>
+        <w:rPr>
+          <w:szCs w:val="24"/>
+          <w:lang w:val="fr-CH"/>
+        </w:rPr>
+        <w:t>:</w:t>
+      </w:r>
+    </w:p>
+    <w:p>
+      <w:pPr>
+        <w:pStyle w:val="Listenabsatz"/>
+        <w:ind w:left="360"/>
+        <w:rPr>
+          <w:szCs w:val="24"/>
+          <w:lang w:val="en-US"/>
+        </w:rPr>
+      </w:pPr>
+      <w:r>
+        <w:rPr>
+          <w:szCs w:val="24"/>
+          <w:lang w:val="en-US"/>
+        </w:rPr>
+        <w:t>&lt;&lt;foreach [committee in decisionFederalCouncil.</w:t>
+      </w:r>
+      <w:r>
+        <w:rPr>
+          <w:szCs w:val="24"/>
+          <w:lang w:val="en-US"/>
+        </w:rPr>
+        <w:t>longerDutyMembersCommittees</w:t>
+      </w:r>
+      <w:r>
+        <w:rPr>
+          <w:szCs w:val="24"/>
+          <w:lang w:val="en-US"/>
+        </w:rPr>
+        <w:t>]&gt;&gt;</w:t>
+      </w:r>
+    </w:p>
+    <w:p>
+      <w:pPr>
+        <w:pStyle w:val="Listenabsatz"/>
+        <w:numPr>
+          <w:ilvl w:val="2"/>
+          <w:numId w:val="50"/>
+        </w:numPr>
+        <w:spacing w:before="120" w:after="60"/>
+        <w:rPr>
+          <w:szCs w:val="24"/>
+          <w:lang w:val="en-US"/>
+        </w:rPr>
+      </w:pPr>
+      <w:r>
+        <w:rPr>
+          <w:b/>
+          <w:bCs/>
+          <w:szCs w:val="24"/>
+          <w:lang w:val="en-US"/>
+        </w:rPr>
+        <w:t xml:space="preserve">&lt;&lt;[committee.name]&gt;&gt;: </w:t>
+      </w:r>
+      <w:r>
+        <w:rPr>
+          <w:szCs w:val="24"/>
+          <w:lang w:val="en-US"/>
+        </w:rPr>
+        <w:t>&lt;&lt;[committee.freeText]&gt;&gt;</w:t>
+      </w:r>
+    </w:p>
+    <w:p>
+      <w:pPr>
+        <w:pStyle w:val="Listenabsatz"/>
+        <w:ind w:left="360"/>
+        <w:rPr>
+          <w:szCs w:val="24"/>
+          <w:lang w:val="en-US"/>
+        </w:rPr>
+      </w:pPr>
+      <w:r>
+        <w:rPr>
+          <w:szCs w:val="24"/>
+          <w:lang w:val="en-US"/>
+        </w:rPr>
+        <w:t>&lt;&lt;/foreach&gt;&gt;</w:t>
+      </w:r>
+    </w:p>
+    <w:p>
+      <w:pPr>
+        <w:rPr>
+          <w:rFonts w:cs="Arial"/>
+          <w:iCs/>
+          <w:szCs w:val="24"/>
+        </w:rPr>
+      </w:pPr>
+    </w:p>
+    <w:p>
+      <w:pPr>
+        <w:pStyle w:val="Listenabsatz"/>
+        <w:numPr>
+          <w:ilvl w:val="1"/>
+          <w:numId w:val="50"/>
+        </w:numPr>
+        <w:spacing w:after="120"/>
+        <w:rPr>
+          <w:szCs w:val="24"/>
+          <w:lang w:val="fr-CH"/>
+        </w:rPr>
+      </w:pPr>
+      <w:r>
+        <w:rPr>
+          <w:szCs w:val="24"/>
+          <w:lang w:val="fr-CH"/>
+        </w:rPr>
+        <w:t>La nomination de membres de l’administration fédérale (art. 57</w:t>
+      </w:r>
+      <w:r>
+        <w:rPr>
+          <w:i/>
+          <w:iCs/>
+          <w:szCs w:val="24"/>
+          <w:lang w:val="fr-CH"/>
+        </w:rPr>
+        <w:t>e</w:t>
+      </w:r>
+      <w:r>
+        <w:rPr>
+          <w:szCs w:val="24"/>
+          <w:lang w:val="fr-CH"/>
+        </w:rPr>
+        <w:t>, al. 3, LOGA) dans les commissions extraparlementaires suivantes est approuvée</w:t>
+      </w:r>
+      <w:r>
+        <w:rPr>
+          <w:szCs w:val="24"/>
+          <w:lang w:val="fr-CH"/>
+        </w:rPr>
+        <w:t>:</w:t>
+      </w:r>
+    </w:p>
+    <w:p>
+      <w:pPr>
+        <w:pStyle w:val="Listenabsatz"/>
+        <w:ind w:left="360"/>
+        <w:rPr>
+          <w:szCs w:val="24"/>
+          <w:lang w:val="en-US"/>
+        </w:rPr>
+      </w:pPr>
+      <w:r>
+        <w:rPr>
+          <w:szCs w:val="24"/>
+          <w:lang w:val="en-US"/>
+        </w:rPr>
+        <w:t>&lt;&lt;foreach [committee in decisionFederalCouncil.federalAssemblyMembersCommittees]&gt;&gt;</w:t>
+      </w:r>
+    </w:p>
+    <w:p>
+      <w:pPr>
+        <w:pStyle w:val="Listenabsatz"/>
+        <w:numPr>
+          <w:ilvl w:val="2"/>
+          <w:numId w:val="50"/>
+        </w:numPr>
+        <w:spacing w:before="120" w:after="60"/>
+        <w:rPr>
+          <w:szCs w:val="24"/>
+          <w:lang w:val="en-US"/>
+        </w:rPr>
+      </w:pPr>
+      <w:r>
+        <w:rPr>
+          <w:b/>
+          <w:bCs/>
+          <w:szCs w:val="24"/>
+          <w:lang w:val="en-US"/>
+        </w:rPr>
+        <w:t xml:space="preserve">&lt;&lt;[committee.name]&gt;&gt;: </w:t>
+      </w:r>
+      <w:r>
+        <w:rPr>
+          <w:szCs w:val="24"/>
+          <w:lang w:val="en-US"/>
+        </w:rPr>
+        <w:t>&lt;&lt;[committee.freeText]&gt;&gt;</w:t>
+      </w:r>
+    </w:p>
+    <w:p>
+      <w:pPr>
+        <w:pStyle w:val="Listenabsatz"/>
+        <w:ind w:left="360"/>
+        <w:rPr>
+          <w:szCs w:val="24"/>
+          <w:lang w:val="en-US"/>
+        </w:rPr>
+      </w:pPr>
+      <w:r>
+        <w:rPr>
+          <w:szCs w:val="24"/>
+          <w:lang w:val="en-US"/>
+        </w:rPr>
+        <w:t>&lt;&lt;/foreach&gt;&gt;</w:t>
+      </w:r>
+    </w:p>
+    <w:p>
+      <w:pPr>
+        <w:rPr>
+          <w:szCs w:val="24"/>
+        </w:rPr>
+      </w:pPr>
     </w:p>
     <w:p>
       <w:pPr>
         <w:pStyle w:val="Listenabsatz"/>
         <w:numPr>
           <w:ilvl w:val="0"/>
-          <w:numId w:val="49"/>
+          <w:numId w:val="50"/>
         </w:numPr>
-        <w:spacing w:before="120" w:after="60"/>
-        <w:ind w:left="1134" w:hanging="283"/>
-        <w:rPr>
-          <w:szCs w:val="24"/>
-          <w:lang w:val="en-US"/>
-        </w:rPr>
-      </w:pPr>
-      <w:r>
-        <w:rPr>
-          <w:b/>
-          <w:bCs/>
-          <w:szCs w:val="24"/>
-          <w:lang w:val="en-US"/>
-        </w:rPr>
-        <w:t>&lt;&lt;[committee.</w:t>
-      </w:r>
-      <w:r>
-        <w:rPr>
-          <w:b/>
-          <w:bCs/>
-          <w:szCs w:val="24"/>
-          <w:lang w:val="en-US"/>
-        </w:rPr>
-        <w:t>n</w:t>
-      </w:r>
-      <w:r>
-        <w:rPr>
-          <w:b/>
-          <w:bCs/>
-          <w:szCs w:val="24"/>
-          <w:lang w:val="en-US"/>
-        </w:rPr>
-        <w:t>ame]&gt;&gt;</w:t>
-      </w:r>
-      <w:r>
-        <w:rPr>
-          <w:b/>
-          <w:bCs/>
-          <w:szCs w:val="24"/>
-          <w:lang w:val="en-US"/>
-        </w:rPr>
-        <w:t>:</w:t>
-      </w:r>
-      <w:r>
-        <w:rPr>
-          <w:szCs w:val="24"/>
-          <w:lang w:val="en-US"/>
-        </w:rPr>
-        <w:t xml:space="preserve"> &lt;&lt;if [committee.frenchMissing == true &amp;&amp; committee.italianMissing == true]&gt;&gt;</w:t>
-      </w:r>
-      <w:r>
-        <w:rPr>
-          <w:lang w:val="en-US"/>
-        </w:rPr>
-        <w:t xml:space="preserve">communauté francophone </w:t>
-      </w:r>
-      <w:r>
-        <w:rPr>
-          <w:lang w:val="en-US"/>
-        </w:rPr>
-        <w:t xml:space="preserve">&amp; </w:t>
-      </w:r>
-      <w:r>
-        <w:rPr>
-          <w:lang w:val="en-US"/>
-        </w:rPr>
-        <w:t>italophone</w:t>
-      </w:r>
-      <w:r>
-        <w:rPr>
-          <w:noProof/>
-          <w:lang w:val="en-US"/>
-        </w:rPr>
-        <w:t xml:space="preserve"> non représentée</w:t>
-      </w:r>
-      <w:r>
-        <w:rPr>
-          <w:szCs w:val="24"/>
-          <w:lang w:val="en-US"/>
-        </w:rPr>
-        <w:t>&lt;&lt;/if&gt;&gt;&lt;&lt;if [committee.frenchMissing == true &amp;&amp; committee.italianMissing == false]&gt;&gt;</w:t>
-      </w:r>
-      <w:bookmarkStart w:id="2" w:name="_Hlk149123267"/>
-      <w:r>
-        <w:rPr>
-          <w:lang w:val="en-US"/>
-        </w:rPr>
-        <w:t>communauté francophone</w:t>
-      </w:r>
-      <w:bookmarkEnd w:id="2"/>
-      <w:r>
-        <w:rPr>
-          <w:noProof/>
-          <w:lang w:val="en-US"/>
-        </w:rPr>
-        <w:t xml:space="preserve"> non représentée</w:t>
-      </w:r>
-      <w:r>
-        <w:rPr>
-          <w:szCs w:val="24"/>
-          <w:lang w:val="en-US"/>
-        </w:rPr>
-        <w:t>&lt;&lt;/if&gt;&gt;&lt;&lt;if [committee.italianMissing == true &amp;&amp; committee.frenchMissing == false]&gt;&gt;</w:t>
-      </w:r>
-      <w:r>
-        <w:rPr>
-          <w:lang w:val="en-US"/>
-        </w:rPr>
-        <w:t>communauté italophone</w:t>
-      </w:r>
-      <w:r>
-        <w:rPr>
-          <w:noProof/>
-          <w:lang w:val="en-US"/>
-        </w:rPr>
-        <w:t xml:space="preserve"> non représentée</w:t>
-      </w:r>
-      <w:r>
-        <w:rPr>
-          <w:szCs w:val="24"/>
-          <w:lang w:val="en-US"/>
-        </w:rPr>
-        <w:t>&lt;&lt;/if&gt;&gt;</w:t>
+        <w:rPr>
+          <w:szCs w:val="24"/>
+          <w:lang w:val="fr-CH"/>
+        </w:rPr>
+      </w:pPr>
+      <w:r>
+        <w:rPr>
+          <w:szCs w:val="24"/>
+          <w:lang w:val="fr-CH"/>
+        </w:rPr>
+        <w:t>Les départements veillent à ce que les exigences légales relatives à la composition des commissions extraparlementaires (notamment la représentation équitable des sexes et des communautés linguistiques) soient respectées lors de remplacements de membres en cours de législature.</w:t>
       </w:r>
     </w:p>
     <w:p>
       <w:pPr>
-        <w:pStyle w:val="Listenabsatz"/>
-        <w:ind w:left="1134" w:hanging="283"/>
-        <w:rPr>
-          <w:szCs w:val="24"/>
-          <w:lang w:val="en-US"/>
-        </w:rPr>
-      </w:pPr>
-      <w:r>
-        <w:rPr>
-          <w:szCs w:val="24"/>
-          <w:lang w:val="en-US"/>
-        </w:rPr>
-        <w:t>&lt;&lt;/foreach&gt;&gt;</w:t>
-      </w:r>
-    </w:p>
-    <w:p>
-      <w:pPr>
-        <w:rPr>
-          <w:szCs w:val="24"/>
-        </w:rPr>
-      </w:pPr>
-    </w:p>
-    <w:p>
-      <w:pPr>
-        <w:pStyle w:val="Listenabsatz"/>
-        <w:numPr>
-          <w:ilvl w:val="1"/>
-          <w:numId w:val="48"/>
-        </w:numPr>
-        <w:rPr>
-          <w:szCs w:val="24"/>
-          <w:lang w:val="fr-CH"/>
-        </w:rPr>
-      </w:pPr>
-      <w:r>
-        <w:rPr>
-          <w:szCs w:val="24"/>
-          <w:lang w:val="fr-CH"/>
-        </w:rPr>
-        <w:t>Les exceptions à la limitation de la durée de fonction (art. 8</w:t>
-      </w:r>
-      <w:r>
-        <w:rPr>
-          <w:i/>
-          <w:iCs/>
-          <w:szCs w:val="24"/>
-          <w:lang w:val="fr-CH"/>
-        </w:rPr>
-        <w:t>i</w:t>
-      </w:r>
-      <w:r>
-        <w:rPr>
-          <w:szCs w:val="24"/>
-          <w:lang w:val="fr-CH"/>
-        </w:rPr>
-        <w:t>, al. 2, OLOGA) dans les commissions extraparlementaires suivantes sont approuvées</w:t>
-      </w:r>
-      <w:r>
-        <w:rPr>
-          <w:szCs w:val="24"/>
-          <w:lang w:val="fr-CH"/>
-        </w:rPr>
-        <w:t>:</w:t>
-      </w:r>
-    </w:p>
-    <w:p>
-      <w:pPr>
-        <w:pStyle w:val="Listenabsatz"/>
-        <w:ind w:left="1134" w:hanging="283"/>
-        <w:rPr>
-          <w:szCs w:val="24"/>
-          <w:lang w:val="en-US"/>
-        </w:rPr>
-      </w:pPr>
-      <w:r>
-        <w:rPr>
-          <w:szCs w:val="24"/>
-          <w:lang w:val="en-US"/>
-        </w:rPr>
-        <w:t>&lt;&lt;foreach [committee in decisionFederalCouncil.</w:t>
-      </w:r>
-      <w:r>
-        <w:rPr>
-          <w:szCs w:val="24"/>
-          <w:lang w:val="en-US"/>
-        </w:rPr>
-        <w:t>longerDutyMembersCommittees</w:t>
-      </w:r>
-      <w:r>
-        <w:rPr>
-          <w:szCs w:val="24"/>
-          <w:lang w:val="en-US"/>
-        </w:rPr>
-        <w:t>]&gt;&gt;</w:t>
-      </w:r>
+        <w:rPr>
+          <w:szCs w:val="24"/>
+          <w:lang w:val="fr-CH"/>
+        </w:rPr>
+      </w:pPr>
     </w:p>
     <w:p>
       <w:pPr>
         <w:pStyle w:val="Listenabsatz"/>
         <w:numPr>
           <w:ilvl w:val="0"/>
-          <w:numId w:val="49"/>
+          <w:numId w:val="50"/>
         </w:numPr>
-        <w:spacing w:before="120" w:after="60"/>
-        <w:ind w:left="1134" w:hanging="283"/>
-        <w:rPr>
-          <w:szCs w:val="24"/>
-          <w:lang w:val="en-US"/>
-        </w:rPr>
-      </w:pPr>
-      <w:r>
-        <w:rPr>
-          <w:b/>
-          <w:bCs/>
-          <w:szCs w:val="24"/>
-          <w:lang w:val="en-US"/>
-        </w:rPr>
-        <w:t>&lt;&lt;[committee.</w:t>
-      </w:r>
-      <w:r>
-        <w:rPr>
-          <w:b/>
-          <w:bCs/>
-          <w:szCs w:val="24"/>
-          <w:lang w:val="en-US"/>
-        </w:rPr>
-        <w:t>n</w:t>
-      </w:r>
-      <w:r>
-        <w:rPr>
-          <w:b/>
-          <w:bCs/>
-          <w:szCs w:val="24"/>
-          <w:lang w:val="en-US"/>
-        </w:rPr>
-        <w:t>ame]&gt;&gt;</w:t>
-      </w:r>
-      <w:r>
-        <w:rPr>
-          <w:b/>
-          <w:bCs/>
-          <w:szCs w:val="24"/>
-          <w:lang w:val="en-US"/>
-        </w:rPr>
-        <w:t xml:space="preserve">: </w:t>
-      </w:r>
-      <w:r>
-        <w:rPr>
-          <w:szCs w:val="24"/>
-          <w:lang w:val="en-US"/>
-        </w:rPr>
-        <w:t>&lt;&lt;[committee.</w:t>
-      </w:r>
-      <w:r>
-        <w:rPr>
-          <w:szCs w:val="24"/>
-          <w:lang w:val="en-US"/>
-        </w:rPr>
-        <w:t>freeText</w:t>
-      </w:r>
-      <w:r>
-        <w:rPr>
-          <w:szCs w:val="24"/>
-          <w:lang w:val="en-US"/>
-        </w:rPr>
-        <w:t>]&gt;&gt;</w:t>
+        <w:rPr>
+          <w:szCs w:val="24"/>
+          <w:lang w:val="fr-CH"/>
+        </w:rPr>
+      </w:pPr>
+      <w:r>
+        <w:rPr>
+          <w:szCs w:val="24"/>
+          <w:lang w:val="fr-CH"/>
+        </w:rPr>
+        <w:t>Les membres pour lesquels le mandat n’est pas reconduit au début de la nouvelle période sont remerciés pour leurs bons et loyaux services.</w:t>
       </w:r>
     </w:p>
     <w:p>
       <w:pPr>
-        <w:pStyle w:val="Listenabsatz"/>
-        <w:ind w:left="1134" w:hanging="283"/>
-        <w:rPr>
-          <w:szCs w:val="24"/>
-          <w:lang w:val="en-US"/>
-        </w:rPr>
-      </w:pPr>
-      <w:r>
-        <w:rPr>
-          <w:szCs w:val="24"/>
-          <w:lang w:val="en-US"/>
-        </w:rPr>
-        <w:t>&lt;&lt;/foreach&gt;&gt;</w:t>
-      </w:r>
-    </w:p>
-    <w:p>
-      <w:pPr>
-        <w:rPr>
-          <w:rFonts w:cs="Arial"/>
-          <w:iCs/>
-          <w:szCs w:val="24"/>
-        </w:rPr>
-      </w:pPr>
-    </w:p>
-    <w:p>
-      <w:pPr>
-        <w:pStyle w:val="Listenabsatz"/>
-        <w:numPr>
-          <w:ilvl w:val="1"/>
-          <w:numId w:val="48"/>
-        </w:numPr>
-        <w:spacing w:after="120"/>
-        <w:rPr>
-          <w:szCs w:val="24"/>
-          <w:lang w:val="fr-CH"/>
-        </w:rPr>
-      </w:pPr>
-      <w:r>
-        <w:rPr>
-          <w:szCs w:val="24"/>
-          <w:lang w:val="fr-CH"/>
-        </w:rPr>
-        <w:t>La nomination de membres de l’administration fédérale (art. 57</w:t>
-      </w:r>
-      <w:r>
-        <w:rPr>
-          <w:i/>
-          <w:iCs/>
-          <w:szCs w:val="24"/>
-          <w:lang w:val="fr-CH"/>
-        </w:rPr>
-        <w:t>e</w:t>
-      </w:r>
-      <w:r>
-        <w:rPr>
-          <w:szCs w:val="24"/>
-          <w:lang w:val="fr-CH"/>
-        </w:rPr>
-        <w:t>, al. 3, LOGA) dans les commissions extraparlementaires suivantes est approuvée</w:t>
-      </w:r>
-      <w:r>
-        <w:rPr>
-          <w:szCs w:val="24"/>
-          <w:lang w:val="fr-CH"/>
-        </w:rPr>
-        <w:t>:</w:t>
-      </w:r>
-    </w:p>
-    <w:p>
-      <w:pPr>
-        <w:pStyle w:val="Listenabsatz"/>
-        <w:ind w:left="1134" w:hanging="283"/>
-        <w:rPr>
-          <w:szCs w:val="24"/>
-          <w:lang w:val="en-US"/>
-        </w:rPr>
-      </w:pPr>
-      <w:r>
-        <w:rPr>
-          <w:szCs w:val="24"/>
-          <w:lang w:val="en-US"/>
-        </w:rPr>
-        <w:t>&lt;&lt;foreach [committee in decisionFederalCouncil.federalAssemblyMembersCommittees]&gt;&gt;</w:t>
-      </w:r>
+        <w:rPr>
+          <w:szCs w:val="24"/>
+          <w:lang w:val="fr-CH"/>
+        </w:rPr>
+      </w:pPr>
     </w:p>
     <w:p>
       <w:pPr>
         <w:pStyle w:val="Listenabsatz"/>
         <w:numPr>
           <w:ilvl w:val="0"/>
-          <w:numId w:val="49"/>
+          <w:numId w:val="50"/>
         </w:numPr>
-        <w:spacing w:before="120" w:after="60"/>
-        <w:ind w:left="1134" w:hanging="283"/>
-        <w:rPr>
-          <w:szCs w:val="24"/>
-          <w:lang w:val="en-US"/>
-        </w:rPr>
-      </w:pPr>
-      <w:r>
-        <w:rPr>
-          <w:b/>
-          <w:bCs/>
-          <w:szCs w:val="24"/>
-          <w:lang w:val="en-US"/>
-        </w:rPr>
-        <w:t>&lt;&lt;[committee.</w:t>
-      </w:r>
-      <w:r>
-        <w:rPr>
-          <w:b/>
-          <w:bCs/>
-          <w:szCs w:val="24"/>
-          <w:lang w:val="en-US"/>
-        </w:rPr>
-        <w:t>n</w:t>
-      </w:r>
-      <w:r>
-        <w:rPr>
-          <w:b/>
-          <w:bCs/>
-          <w:szCs w:val="24"/>
-          <w:lang w:val="en-US"/>
-        </w:rPr>
-        <w:t>ame]&gt;&gt;</w:t>
-      </w:r>
-      <w:r>
-        <w:rPr>
-          <w:b/>
-          <w:bCs/>
-          <w:szCs w:val="24"/>
-          <w:lang w:val="en-US"/>
-        </w:rPr>
-        <w:t xml:space="preserve">: </w:t>
-      </w:r>
-      <w:r>
-        <w:rPr>
-          <w:szCs w:val="24"/>
-          <w:lang w:val="en-US"/>
-        </w:rPr>
-        <w:t>&lt;&lt;[committee.</w:t>
-      </w:r>
-      <w:r>
-        <w:rPr>
-          <w:szCs w:val="24"/>
-          <w:lang w:val="en-US"/>
-        </w:rPr>
-        <w:t>freeText</w:t>
-      </w:r>
-      <w:r>
-        <w:rPr>
-          <w:szCs w:val="24"/>
-          <w:lang w:val="en-US"/>
-        </w:rPr>
-        <w:t>]&gt;&gt;</w:t>
-      </w:r>
-    </w:p>
-    <w:p>
-      <w:pPr>
-        <w:pStyle w:val="Listenabsatz"/>
-        <w:ind w:left="1134" w:hanging="283"/>
-        <w:rPr>
-          <w:szCs w:val="24"/>
-          <w:lang w:val="en-US"/>
-        </w:rPr>
-      </w:pPr>
-      <w:r>
-        <w:rPr>
-          <w:szCs w:val="24"/>
-          <w:lang w:val="en-US"/>
-        </w:rPr>
-        <w:t>&lt;&lt;/foreach&gt;&gt;</w:t>
-      </w:r>
-    </w:p>
-    <w:p>
-      <w:pPr>
-        <w:rPr>
-          <w:szCs w:val="24"/>
-        </w:rPr>
-      </w:pPr>
-    </w:p>
-    <w:p>
-      <w:pPr>
-        <w:pStyle w:val="Listenabsatz"/>
-        <w:numPr>
-          <w:ilvl w:val="0"/>
-          <w:numId w:val="48"/>
-        </w:numPr>
-        <w:rPr>
-          <w:szCs w:val="24"/>
-          <w:lang w:val="fr-CH"/>
-        </w:rPr>
-      </w:pPr>
-      <w:r>
-        <w:rPr>
-          <w:szCs w:val="24"/>
-          <w:lang w:val="fr-CH"/>
-        </w:rPr>
-        <w:t>Les départements veillent à ce que les exigences légales relatives à la composition des commissions extraparlementaires (notamment la représentation équitable des sexes et des communautés linguistiques) soient respectées lors de remplacements de membres en cours de législature.</w:t>
-      </w:r>
-    </w:p>
-    <w:p>
-      <w:pPr>
-        <w:rPr>
-          <w:szCs w:val="24"/>
-          <w:lang w:val="fr-CH"/>
-        </w:rPr>
-      </w:pPr>
-    </w:p>
-    <w:p>
-      <w:pPr>
-        <w:pStyle w:val="Listenabsatz"/>
-        <w:numPr>
-          <w:ilvl w:val="0"/>
-          <w:numId w:val="48"/>
-        </w:numPr>
-        <w:rPr>
-          <w:szCs w:val="24"/>
-          <w:lang w:val="fr-CH"/>
-        </w:rPr>
-      </w:pPr>
-      <w:r>
-        <w:rPr>
-          <w:szCs w:val="24"/>
-          <w:lang w:val="fr-CH"/>
-        </w:rPr>
-        <w:t>Les membres pour lesquels le mandat n’est pas reconduit au début de la nouvelle période sont remerciés pour leurs bons et loyaux services.</w:t>
-      </w:r>
-    </w:p>
-    <w:p>
-      <w:pPr>
-        <w:rPr>
-          <w:szCs w:val="24"/>
-          <w:lang w:val="fr-CH"/>
-        </w:rPr>
-      </w:pPr>
-    </w:p>
-    <w:p>
-      <w:pPr>
-        <w:pStyle w:val="Listenabsatz"/>
-        <w:numPr>
-          <w:ilvl w:val="0"/>
-          <w:numId w:val="48"/>
-        </w:numPr>
-        <w:rPr>
-          <w:szCs w:val="24"/>
-          <w:lang w:val="fr-CH"/>
-        </w:rPr>
-      </w:pPr>
-      <w:r>
-        <w:rPr>
-          <w:szCs w:val="24"/>
-          <w:lang w:val="fr-CH"/>
-        </w:rPr>
-        <w:lastRenderedPageBreak/>
+        <w:rPr>
+          <w:szCs w:val="24"/>
+          <w:lang w:val="fr-CH"/>
+        </w:rPr>
+      </w:pPr>
+      <w:r>
+        <w:rPr>
+          <w:szCs w:val="24"/>
+          <w:lang w:val="fr-CH"/>
+        </w:rPr>
         <w:t xml:space="preserve">Les départements (SG) sont chargés d’informer les membres sortants et nouvellement nommés (toutes fonctions confondues) </w:t>
       </w:r>
       <w:r>
@@ -1702,11 +1510,6 @@
         <w:rPr>
           <w:szCs w:val="24"/>
         </w:rPr>
-      </w:r>
-      <w:r>
-        <w:rPr>
-          <w:szCs w:val="24"/>
-        </w:rPr>
         <w:fldChar w:fldCharType="separate"/>
       </w:r>
       <w:r>
@@ -1744,7 +1547,7 @@
         <w:pStyle w:val="Listenabsatz"/>
         <w:numPr>
           <w:ilvl w:val="0"/>
-          <w:numId w:val="48"/>
+          <w:numId w:val="50"/>
         </w:numPr>
         <w:rPr>
           <w:szCs w:val="24"/>
@@ -1772,7 +1575,7 @@
         <w:pStyle w:val="Listenabsatz"/>
         <w:numPr>
           <w:ilvl w:val="0"/>
-          <w:numId w:val="48"/>
+          <w:numId w:val="50"/>
         </w:numPr>
         <w:rPr>
           <w:szCs w:val="24"/>
@@ -1800,7 +1603,7 @@
         <w:pStyle w:val="Listenabsatz"/>
         <w:numPr>
           <w:ilvl w:val="0"/>
-          <w:numId w:val="48"/>
+          <w:numId w:val="50"/>
         </w:numPr>
         <w:rPr>
           <w:szCs w:val="24"/>
@@ -1835,11 +1638,6 @@
           <w:lang w:val="fr-CH"/>
         </w:rPr>
         <w:instrText xml:space="preserve"> FORMTEXT </w:instrText>
-      </w:r>
-      <w:r>
-        <w:rPr>
-          <w:szCs w:val="24"/>
-        </w:rPr>
       </w:r>
       <w:r>
         <w:rPr>
@@ -5625,6 +5423,92 @@
     </w:lvl>
   </w:abstractNum>
   <w:abstractNum w:abstractNumId="39" w15:restartNumberingAfterBreak="0">
+    <w:nsid w:val="60376395"/>
+    <w:multiLevelType w:val="multilevel"/>
+    <w:tmpl w:val="0807001F"/>
+    <w:lvl w:ilvl="0">
+      <w:start w:val="1"/>
+      <w:numFmt w:val="decimal"/>
+      <w:lvlText w:val="%1."/>
+      <w:lvlJc w:val="left"/>
+      <w:pPr>
+        <w:ind w:left="360" w:hanging="360"/>
+      </w:pPr>
+    </w:lvl>
+    <w:lvl w:ilvl="1">
+      <w:start w:val="1"/>
+      <w:numFmt w:val="decimal"/>
+      <w:lvlText w:val="%1.%2."/>
+      <w:lvlJc w:val="left"/>
+      <w:pPr>
+        <w:ind w:left="792" w:hanging="432"/>
+      </w:pPr>
+    </w:lvl>
+    <w:lvl w:ilvl="2">
+      <w:start w:val="1"/>
+      <w:numFmt w:val="decimal"/>
+      <w:lvlText w:val="%1.%2.%3."/>
+      <w:lvlJc w:val="left"/>
+      <w:pPr>
+        <w:ind w:left="1224" w:hanging="504"/>
+      </w:pPr>
+    </w:lvl>
+    <w:lvl w:ilvl="3">
+      <w:start w:val="1"/>
+      <w:numFmt w:val="decimal"/>
+      <w:lvlText w:val="%1.%2.%3.%4."/>
+      <w:lvlJc w:val="left"/>
+      <w:pPr>
+        <w:ind w:left="1728" w:hanging="648"/>
+      </w:pPr>
+    </w:lvl>
+    <w:lvl w:ilvl="4">
+      <w:start w:val="1"/>
+      <w:numFmt w:val="decimal"/>
+      <w:lvlText w:val="%1.%2.%3.%4.%5."/>
+      <w:lvlJc w:val="left"/>
+      <w:pPr>
+        <w:ind w:left="2232" w:hanging="792"/>
+      </w:pPr>
+    </w:lvl>
+    <w:lvl w:ilvl="5">
+      <w:start w:val="1"/>
+      <w:numFmt w:val="decimal"/>
+      <w:lvlText w:val="%1.%2.%3.%4.%5.%6."/>
+      <w:lvlJc w:val="left"/>
+      <w:pPr>
+        <w:ind w:left="2736" w:hanging="936"/>
+      </w:pPr>
+    </w:lvl>
+    <w:lvl w:ilvl="6">
+      <w:start w:val="1"/>
+      <w:numFmt w:val="decimal"/>
+      <w:lvlText w:val="%1.%2.%3.%4.%5.%6.%7."/>
+      <w:lvlJc w:val="left"/>
+      <w:pPr>
+        <w:ind w:left="3240" w:hanging="1080"/>
+      </w:pPr>
+    </w:lvl>
+    <w:lvl w:ilvl="7">
+      <w:start w:val="1"/>
+      <w:numFmt w:val="decimal"/>
+      <w:lvlText w:val="%1.%2.%3.%4.%5.%6.%7.%8."/>
+      <w:lvlJc w:val="left"/>
+      <w:pPr>
+        <w:ind w:left="3744" w:hanging="1224"/>
+      </w:pPr>
+    </w:lvl>
+    <w:lvl w:ilvl="8">
+      <w:start w:val="1"/>
+      <w:numFmt w:val="decimal"/>
+      <w:lvlText w:val="%1.%2.%3.%4.%5.%6.%7.%8.%9."/>
+      <w:lvlJc w:val="left"/>
+      <w:pPr>
+        <w:ind w:left="4320" w:hanging="1440"/>
+      </w:pPr>
+    </w:lvl>
+  </w:abstractNum>
+  <w:abstractNum w:abstractNumId="40" w15:restartNumberingAfterBreak="0">
     <w:nsid w:val="619E3C91"/>
     <w:multiLevelType w:val="hybridMultilevel"/>
     <w:tmpl w:val="83B66966"/>
@@ -5710,7 +5594,7 @@
       </w:pPr>
     </w:lvl>
   </w:abstractNum>
-  <w:abstractNum w:abstractNumId="40" w15:restartNumberingAfterBreak="0">
+  <w:abstractNum w:abstractNumId="41" w15:restartNumberingAfterBreak="0">
     <w:nsid w:val="649E54C4"/>
     <w:multiLevelType w:val="hybridMultilevel"/>
     <w:tmpl w:val="18388BF4"/>
@@ -5823,7 +5707,7 @@
       </w:rPr>
     </w:lvl>
   </w:abstractNum>
-  <w:abstractNum w:abstractNumId="41" w15:restartNumberingAfterBreak="0">
+  <w:abstractNum w:abstractNumId="42" w15:restartNumberingAfterBreak="0">
     <w:nsid w:val="64A715F1"/>
     <w:multiLevelType w:val="multilevel"/>
     <w:tmpl w:val="697E9EB0"/>
@@ -5940,7 +5824,7 @@
       </w:rPr>
     </w:lvl>
   </w:abstractNum>
-  <w:abstractNum w:abstractNumId="42" w15:restartNumberingAfterBreak="0">
+  <w:abstractNum w:abstractNumId="43" w15:restartNumberingAfterBreak="0">
     <w:nsid w:val="6C25091C"/>
     <w:multiLevelType w:val="multilevel"/>
     <w:tmpl w:val="17DE13FA"/>
@@ -6102,7 +5986,7 @@
       </w:rPr>
     </w:lvl>
   </w:abstractNum>
-  <w:abstractNum w:abstractNumId="43" w15:restartNumberingAfterBreak="0">
+  <w:abstractNum w:abstractNumId="44" w15:restartNumberingAfterBreak="0">
     <w:nsid w:val="6C2A4FAD"/>
     <w:multiLevelType w:val="hybridMultilevel"/>
     <w:tmpl w:val="AD2046CE"/>
@@ -6215,7 +6099,7 @@
       </w:rPr>
     </w:lvl>
   </w:abstractNum>
-  <w:abstractNum w:abstractNumId="44" w15:restartNumberingAfterBreak="0">
+  <w:abstractNum w:abstractNumId="45" w15:restartNumberingAfterBreak="0">
     <w:nsid w:val="6C931B69"/>
     <w:multiLevelType w:val="multilevel"/>
     <w:tmpl w:val="9C001EC2"/>
@@ -6328,7 +6212,7 @@
       </w:pPr>
     </w:lvl>
   </w:abstractNum>
-  <w:abstractNum w:abstractNumId="45" w15:restartNumberingAfterBreak="0">
+  <w:abstractNum w:abstractNumId="46" w15:restartNumberingAfterBreak="0">
     <w:nsid w:val="6FB95977"/>
     <w:multiLevelType w:val="hybridMultilevel"/>
     <w:tmpl w:val="736C81CC"/>
@@ -6417,7 +6301,7 @@
       </w:pPr>
     </w:lvl>
   </w:abstractNum>
-  <w:abstractNum w:abstractNumId="46" w15:restartNumberingAfterBreak="0">
+  <w:abstractNum w:abstractNumId="47" w15:restartNumberingAfterBreak="0">
     <w:nsid w:val="748B4F6D"/>
     <w:multiLevelType w:val="multilevel"/>
     <w:tmpl w:val="A5B80CEA"/>
@@ -6530,7 +6414,7 @@
       </w:pPr>
     </w:lvl>
   </w:abstractNum>
-  <w:abstractNum w:abstractNumId="47" w15:restartNumberingAfterBreak="0">
+  <w:abstractNum w:abstractNumId="48" w15:restartNumberingAfterBreak="0">
     <w:nsid w:val="778874D3"/>
     <w:multiLevelType w:val="hybridMultilevel"/>
     <w:tmpl w:val="1B96D124"/>
@@ -6643,7 +6527,7 @@
       </w:rPr>
     </w:lvl>
   </w:abstractNum>
-  <w:abstractNum w:abstractNumId="48" w15:restartNumberingAfterBreak="0">
+  <w:abstractNum w:abstractNumId="49" w15:restartNumberingAfterBreak="0">
     <w:nsid w:val="7E2E0140"/>
     <w:multiLevelType w:val="hybridMultilevel"/>
     <w:tmpl w:val="4DAAEBBA"/>
@@ -6763,7 +6647,7 @@
     <w:abstractNumId w:val="19"/>
   </w:num>
   <w:num w:numId="3" w16cid:durableId="279454391">
-    <w:abstractNumId w:val="42"/>
+    <w:abstractNumId w:val="43"/>
   </w:num>
   <w:num w:numId="4" w16cid:durableId="512452334">
     <w:abstractNumId w:val="24"/>
@@ -6826,13 +6710,13 @@
     <w:abstractNumId w:val="13"/>
   </w:num>
   <w:num w:numId="24" w16cid:durableId="2073499117">
-    <w:abstractNumId w:val="48"/>
+    <w:abstractNumId w:val="49"/>
   </w:num>
   <w:num w:numId="25" w16cid:durableId="638532971">
     <w:abstractNumId w:val="36"/>
   </w:num>
   <w:num w:numId="26" w16cid:durableId="1160150332">
-    <w:abstractNumId w:val="43"/>
+    <w:abstractNumId w:val="44"/>
   </w:num>
   <w:num w:numId="27" w16cid:durableId="1974797392">
     <w:abstractNumId w:val="27"/>
@@ -6847,10 +6731,10 @@
     <w:abstractNumId w:val="22"/>
   </w:num>
   <w:num w:numId="31" w16cid:durableId="2080011610">
-    <w:abstractNumId w:val="47"/>
+    <w:abstractNumId w:val="48"/>
   </w:num>
   <w:num w:numId="32" w16cid:durableId="564532807">
-    <w:abstractNumId w:val="45"/>
+    <w:abstractNumId w:val="46"/>
   </w:num>
   <w:num w:numId="33" w16cid:durableId="580406080">
     <w:abstractNumId w:val="12"/>
@@ -6865,7 +6749,7 @@
     <w:abstractNumId w:val="16"/>
   </w:num>
   <w:num w:numId="37" w16cid:durableId="53430655">
-    <w:abstractNumId w:val="40"/>
+    <w:abstractNumId w:val="41"/>
   </w:num>
   <w:num w:numId="38" w16cid:durableId="993143293">
     <w:abstractNumId w:val="10"/>
@@ -6874,22 +6758,22 @@
     <w:abstractNumId w:val="35"/>
   </w:num>
   <w:num w:numId="40" w16cid:durableId="2119639863">
-    <w:abstractNumId w:val="41"/>
+    <w:abstractNumId w:val="42"/>
   </w:num>
   <w:num w:numId="41" w16cid:durableId="2135588828">
-    <w:abstractNumId w:val="39"/>
+    <w:abstractNumId w:val="40"/>
   </w:num>
   <w:num w:numId="42" w16cid:durableId="1836216469">
     <w:abstractNumId w:val="30"/>
   </w:num>
   <w:num w:numId="43" w16cid:durableId="1926182703">
-    <w:abstractNumId w:val="46"/>
+    <w:abstractNumId w:val="47"/>
   </w:num>
   <w:num w:numId="44" w16cid:durableId="1272125174">
     <w:abstractNumId w:val="33"/>
   </w:num>
   <w:num w:numId="45" w16cid:durableId="619845929">
-    <w:abstractNumId w:val="44"/>
+    <w:abstractNumId w:val="45"/>
   </w:num>
   <w:num w:numId="46" w16cid:durableId="1357002696">
     <w:abstractNumId w:val="26"/>
@@ -6902,6 +6786,9 @@
   </w:num>
   <w:num w:numId="49" w16cid:durableId="225578339">
     <w:abstractNumId w:val="32"/>
+  </w:num>
+  <w:num w:numId="50" w16cid:durableId="150023219">
+    <w:abstractNumId w:val="39"/>
   </w:num>
 </w:numbering>
 </file>
@@ -7248,6 +7135,7 @@
   <w:style w:type="character" w:default="1" w:styleId="Absatz-Standardschriftart">
     <w:name w:val="Default Paragraph Font"/>
     <w:uiPriority w:val="1"/>
+    <w:semiHidden/>
     <w:unhideWhenUsed/>
   </w:style>
   <w:style w:type="table" w:default="1" w:styleId="NormaleTabelle">
@@ -7901,14 +7789,10 @@
 </file>
 
 <file path=customXml/item1.xml><?xml version="1.0" encoding="utf-8"?>
-<officeatwork xmlns="http://schemas.officeatwork.com/MasterProperties">eNp7v3u/jW9icUlqUUBRfkFqUUllcGpJsYK+HQCb2Qqj</officeatwork>
+<officeatwork xmlns="http://schemas.officeatwork.com/Formulas">eNp7v3u/jVt+UW5pTmKxgr4dAD33Bnw=</officeatwork>
 </file>
 
 <file path=customXml/item2.xml><?xml version="1.0" encoding="utf-8"?>
-<officeatwork xmlns="http://schemas.officeatwork.com/Document">eNp7v3u/jUt+cmlual6JnU1wfk5pSWZ+nmeKXVK2jT4S18YnMS+9NDE91c7IwNTURh/OtQnLTC23s9GHUnCzAA5cIJ8=</officeatwork>
-</file>
-
-<file path=customXml/item3.xml><?xml version="1.0" encoding="utf-8"?>
 <f:fields xmlns:f="http://schemas.fabasoft.com/folio/2007/fields">
   <f:record ref="">
     <f:field ref="objname" par="" edit="true" text="ENTW BRB zu BRA BK 2019xxxx Ausserparlamentarischen Kommissionen, Leitungsorgane und Vertretungen des Bundes: Gesamterneuerungswahlen für die Amtsperiode 2020-2023"/>
@@ -7961,19 +7845,31 @@
 </f:fields>
 </file>
 
+<file path=customXml/item3.xml><?xml version="1.0" encoding="utf-8"?>
+<officeatwork xmlns="http://schemas.officeatwork.com/Document">eNp7v3u/jUt+cmlual6JnU1wfk5pSWZ+nmeKXVK2jT4S18YnMS+9NDE91c7IwNTURh/OtQnLTC23s9GHUnCzAA5cIJ8=</officeatwork>
+</file>
+
 <file path=customXml/item4.xml><?xml version="1.0" encoding="utf-8"?>
-<officeatwork xmlns="http://schemas.officeatwork.com/Formulas">eNp7v3u/jVt+UW5pTmKxgr4dAD33Bnw=</officeatwork>
+<officeatwork xmlns="http://schemas.officeatwork.com/MasterProperties">eNp7v3u/jW9icUlqUUBRfkFqUUllcGpJsYK+HQCb2Qqj</officeatwork>
 </file>
 
 <file path=customXml/itemProps1.xml><?xml version="1.0" encoding="utf-8"?>
-<ds:datastoreItem xmlns:ds="http://schemas.openxmlformats.org/officeDocument/2006/customXml" ds:itemID="{3B3F6925-11A7-4614-A610-E26516665FC7}">
+<ds:datastoreItem xmlns:ds="http://schemas.openxmlformats.org/officeDocument/2006/customXml" ds:itemID="{FACC0E0D-5C77-45BD-958B-944424F72D0B}">
   <ds:schemaRefs>
-    <ds:schemaRef ds:uri="http://schemas.officeatwork.com/MasterProperties"/>
+    <ds:schemaRef ds:uri="http://schemas.officeatwork.com/Formulas"/>
   </ds:schemaRefs>
 </ds:datastoreItem>
 </file>
 
 <file path=customXml/itemProps2.xml><?xml version="1.0" encoding="utf-8"?>
+<ds:datastoreItem xmlns:ds="http://schemas.openxmlformats.org/officeDocument/2006/customXml" ds:itemID="{4E8A9591-F074-446B-902F-511FF79C122F}">
+  <ds:schemaRefs>
+    <ds:schemaRef ds:uri="http://schemas.fabasoft.com/folio/2007/fields"/>
+  </ds:schemaRefs>
+</ds:datastoreItem>
+</file>
+
+<file path=customXml/itemProps3.xml><?xml version="1.0" encoding="utf-8"?>
 <ds:datastoreItem xmlns:ds="http://schemas.openxmlformats.org/officeDocument/2006/customXml" ds:itemID="{826A14BC-61C7-4B5E-A710-1212315CFB87}">
   <ds:schemaRefs>
     <ds:schemaRef ds:uri="http://schemas.officeatwork.com/Document"/>
@@ -7981,18 +7877,10 @@
 </ds:datastoreItem>
 </file>
 
-<file path=customXml/itemProps3.xml><?xml version="1.0" encoding="utf-8"?>
-<ds:datastoreItem xmlns:ds="http://schemas.openxmlformats.org/officeDocument/2006/customXml" ds:itemID="{4E8A9591-F074-446B-902F-511FF79C122F}">
+<file path=customXml/itemProps4.xml><?xml version="1.0" encoding="utf-8"?>
+<ds:datastoreItem xmlns:ds="http://schemas.openxmlformats.org/officeDocument/2006/customXml" ds:itemID="{3B3F6925-11A7-4614-A610-E26516665FC7}">
   <ds:schemaRefs>
-    <ds:schemaRef ds:uri="http://schemas.fabasoft.com/folio/2007/fields"/>
-  </ds:schemaRefs>
-</ds:datastoreItem>
-</file>
-
-<file path=customXml/itemProps4.xml><?xml version="1.0" encoding="utf-8"?>
-<ds:datastoreItem xmlns:ds="http://schemas.openxmlformats.org/officeDocument/2006/customXml" ds:itemID="{FACC0E0D-5C77-45BD-958B-944424F72D0B}">
-  <ds:schemaRefs>
-    <ds:schemaRef ds:uri="http://schemas.officeatwork.com/Formulas"/>
+    <ds:schemaRef ds:uri="http://schemas.officeatwork.com/MasterProperties"/>
   </ds:schemaRefs>
 </ds:datastoreItem>
 </file>
</xml_diff>

<commit_message>
feat: fix insets to both templates #BKDO-210
</commit_message>
<xml_diff>
--- a/src/Bk.APG.Api/Templates/APG_Decision_Federal_Council_French.docx
+++ b/src/Bk.APG.Api/Templates/APG_Decision_Federal_Council_French.docx
@@ -452,6 +452,7 @@
           <w:ilvl w:val="1"/>
           <w:numId w:val="50"/>
         </w:numPr>
+        <w:ind w:left="1134" w:hanging="774"/>
         <w:rPr>
           <w:szCs w:val="24"/>
           <w:lang w:val="en-US"/>
@@ -546,6 +547,7 @@
           <w:ilvl w:val="1"/>
           <w:numId w:val="50"/>
         </w:numPr>
+        <w:ind w:left="1134" w:hanging="774"/>
         <w:rPr>
           <w:szCs w:val="24"/>
           <w:lang w:val="en-US"/>
@@ -583,7 +585,7 @@
       <w:pPr>
         <w:pStyle w:val="Listenabsatz"/>
         <w:spacing w:before="60" w:after="40"/>
-        <w:ind w:left="360" w:firstLine="349"/>
+        <w:ind w:left="1134"/>
         <w:contextualSpacing w:val="0"/>
         <w:rPr>
           <w:szCs w:val="24"/>
@@ -690,6 +692,7 @@
           <w:numId w:val="50"/>
         </w:numPr>
         <w:spacing w:after="120"/>
+        <w:ind w:left="1134" w:hanging="774"/>
         <w:rPr>
           <w:szCs w:val="24"/>
           <w:lang w:val="fr-CH"/>
@@ -735,6 +738,7 @@
           <w:numId w:val="50"/>
         </w:numPr>
         <w:spacing w:before="120" w:after="60"/>
+        <w:ind w:left="1985" w:hanging="851"/>
         <w:rPr>
           <w:szCs w:val="24"/>
           <w:lang w:val="en-US"/>
@@ -798,17 +802,17 @@
           <w:numId w:val="50"/>
         </w:numPr>
         <w:spacing w:after="120"/>
-        <w:rPr>
-          <w:szCs w:val="24"/>
-          <w:lang w:val="fr-CH"/>
-        </w:rPr>
-      </w:pPr>
-      <w:r>
-        <w:rPr>
-          <w:szCs w:val="24"/>
-          <w:lang w:val="fr-CH"/>
-        </w:rPr>
-        <w:lastRenderedPageBreak/>
+        <w:ind w:left="1134" w:hanging="774"/>
+        <w:rPr>
+          <w:szCs w:val="24"/>
+          <w:lang w:val="fr-CH"/>
+        </w:rPr>
+      </w:pPr>
+      <w:r>
+        <w:rPr>
+          <w:szCs w:val="24"/>
+          <w:lang w:val="fr-CH"/>
+        </w:rPr>
         <w:t>La sous-représentation des femmes ou des hommes (art. 8</w:t>
       </w:r>
       <w:r>
@@ -874,6 +878,7 @@
           <w:numId w:val="50"/>
         </w:numPr>
         <w:spacing w:before="120" w:after="60"/>
+        <w:ind w:left="1985" w:hanging="851"/>
         <w:rPr>
           <w:szCs w:val="24"/>
           <w:lang w:val="en-US"/>
@@ -973,6 +978,7 @@
           <w:ilvl w:val="1"/>
           <w:numId w:val="50"/>
         </w:numPr>
+        <w:ind w:left="1134" w:hanging="774"/>
         <w:rPr>
           <w:szCs w:val="24"/>
           <w:lang w:val="fr-CH"/>
@@ -1056,6 +1062,7 @@
           <w:numId w:val="50"/>
         </w:numPr>
         <w:spacing w:before="120" w:after="60"/>
+        <w:ind w:left="1985" w:hanging="851"/>
         <w:rPr>
           <w:szCs w:val="24"/>
           <w:lang w:val="en-US"/>
@@ -1171,6 +1178,7 @@
           <w:ilvl w:val="1"/>
           <w:numId w:val="50"/>
         </w:numPr>
+        <w:ind w:left="1134" w:hanging="774"/>
         <w:rPr>
           <w:szCs w:val="24"/>
           <w:lang w:val="fr-CH"/>
@@ -1246,6 +1254,7 @@
           <w:numId w:val="50"/>
         </w:numPr>
         <w:spacing w:before="120" w:after="60"/>
+        <w:ind w:left="1985" w:hanging="851"/>
         <w:rPr>
           <w:szCs w:val="24"/>
           <w:lang w:val="en-US"/>
@@ -1302,6 +1311,7 @@
           <w:numId w:val="50"/>
         </w:numPr>
         <w:spacing w:after="120"/>
+        <w:ind w:left="1134" w:hanging="774"/>
         <w:rPr>
           <w:szCs w:val="24"/>
           <w:lang w:val="fr-CH"/>
@@ -1363,6 +1373,7 @@
           <w:numId w:val="50"/>
         </w:numPr>
         <w:spacing w:before="120" w:after="60"/>
+        <w:ind w:left="1701" w:hanging="567"/>
         <w:rPr>
           <w:szCs w:val="24"/>
           <w:lang w:val="en-US"/>
@@ -1426,6 +1437,7 @@
           <w:szCs w:val="24"/>
           <w:lang w:val="fr-CH"/>
         </w:rPr>
+        <w:lastRenderedPageBreak/>
         <w:t>Les départements veillent à ce que les exigences légales relatives à la composition des commissions extraparlementaires (notamment la représentation équitable des sexes et des communautés linguistiques) soient respectées lors de remplacements de membres en cours de législature.</w:t>
       </w:r>
     </w:p>
@@ -1510,6 +1522,11 @@
         <w:rPr>
           <w:szCs w:val="24"/>
         </w:rPr>
+      </w:r>
+      <w:r>
+        <w:rPr>
+          <w:szCs w:val="24"/>
+        </w:rPr>
         <w:fldChar w:fldCharType="separate"/>
       </w:r>
       <w:r>
@@ -1638,6 +1655,11 @@
           <w:lang w:val="fr-CH"/>
         </w:rPr>
         <w:instrText xml:space="preserve"> FORMTEXT </w:instrText>
+      </w:r>
+      <w:r>
+        <w:rPr>
+          <w:szCs w:val="24"/>
+        </w:rPr>
       </w:r>
       <w:r>
         <w:rPr>
@@ -7789,7 +7811,7 @@
 </file>
 
 <file path=customXml/item1.xml><?xml version="1.0" encoding="utf-8"?>
-<officeatwork xmlns="http://schemas.officeatwork.com/Formulas">eNp7v3u/jVt+UW5pTmKxgr4dAD33Bnw=</officeatwork>
+<officeatwork xmlns="http://schemas.officeatwork.com/Document">eNp7v3u/jUt+cmlual6JnU1wfk5pSWZ+nmeKXVK2jT4S18YnMS+9NDE91c7IwNTURh/OtQnLTC23s9GHUnCzAA5cIJ8=</officeatwork>
 </file>
 
 <file path=customXml/item2.xml><?xml version="1.0" encoding="utf-8"?>
@@ -7846,7 +7868,7 @@
 </file>
 
 <file path=customXml/item3.xml><?xml version="1.0" encoding="utf-8"?>
-<officeatwork xmlns="http://schemas.officeatwork.com/Document">eNp7v3u/jUt+cmlual6JnU1wfk5pSWZ+nmeKXVK2jT4S18YnMS+9NDE91c7IwNTURh/OtQnLTC23s9GHUnCzAA5cIJ8=</officeatwork>
+<officeatwork xmlns="http://schemas.officeatwork.com/Formulas">eNp7v3u/jVt+UW5pTmKxgr4dAD33Bnw=</officeatwork>
 </file>
 
 <file path=customXml/item4.xml><?xml version="1.0" encoding="utf-8"?>
@@ -7854,9 +7876,9 @@
 </file>
 
 <file path=customXml/itemProps1.xml><?xml version="1.0" encoding="utf-8"?>
-<ds:datastoreItem xmlns:ds="http://schemas.openxmlformats.org/officeDocument/2006/customXml" ds:itemID="{FACC0E0D-5C77-45BD-958B-944424F72D0B}">
+<ds:datastoreItem xmlns:ds="http://schemas.openxmlformats.org/officeDocument/2006/customXml" ds:itemID="{826A14BC-61C7-4B5E-A710-1212315CFB87}">
   <ds:schemaRefs>
-    <ds:schemaRef ds:uri="http://schemas.officeatwork.com/Formulas"/>
+    <ds:schemaRef ds:uri="http://schemas.officeatwork.com/Document"/>
   </ds:schemaRefs>
 </ds:datastoreItem>
 </file>
@@ -7870,9 +7892,9 @@
 </file>
 
 <file path=customXml/itemProps3.xml><?xml version="1.0" encoding="utf-8"?>
-<ds:datastoreItem xmlns:ds="http://schemas.openxmlformats.org/officeDocument/2006/customXml" ds:itemID="{826A14BC-61C7-4B5E-A710-1212315CFB87}">
+<ds:datastoreItem xmlns:ds="http://schemas.openxmlformats.org/officeDocument/2006/customXml" ds:itemID="{FACC0E0D-5C77-45BD-958B-944424F72D0B}">
   <ds:schemaRefs>
-    <ds:schemaRef ds:uri="http://schemas.officeatwork.com/Document"/>
+    <ds:schemaRef ds:uri="http://schemas.officeatwork.com/Formulas"/>
   </ds:schemaRefs>
 </ds:datastoreItem>
 </file>

</xml_diff>

<commit_message>
feat: update vacancies template #BKDO-1024
</commit_message>
<xml_diff>
--- a/src/Bk.APG.Api/Templates/APG_Decision_Federal_Council_French.docx
+++ b/src/Bk.APG.Api/Templates/APG_Decision_Federal_Council_French.docx
@@ -196,7 +196,21 @@
           <w:rFonts w:ascii="Arial" w:eastAsia="Times New Roman" w:hAnsi="Arial" w:cs="Times New Roman"/>
           <w:lang w:eastAsia="de-CH"/>
         </w:rPr>
-        <w:t xml:space="preserve">il est décidé: </w:t>
+        <w:t>il est décidé</w:t>
+      </w:r>
+      <w:r>
+        <w:rPr>
+          <w:rFonts w:ascii="Arial" w:eastAsia="Times New Roman" w:hAnsi="Arial" w:cs="Times New Roman"/>
+          <w:lang w:eastAsia="de-CH"/>
+        </w:rPr>
+        <w:t xml:space="preserve"> </w:t>
+      </w:r>
+      <w:r>
+        <w:rPr>
+          <w:rFonts w:ascii="Arial" w:eastAsia="Times New Roman" w:hAnsi="Arial" w:cs="Times New Roman"/>
+          <w:lang w:eastAsia="de-CH"/>
+        </w:rPr>
+        <w:t xml:space="preserve">: </w:t>
       </w:r>
     </w:p>
     <w:p>
@@ -336,6 +350,13 @@
           <w:szCs w:val="24"/>
           <w:lang w:val="fr-CH"/>
         </w:rPr>
+        <w:t xml:space="preserve"> </w:t>
+      </w:r>
+      <w:r>
+        <w:rPr>
+          <w:szCs w:val="24"/>
+          <w:lang w:val="fr-CH"/>
+        </w:rPr>
         <w:t>:</w:t>
       </w:r>
     </w:p>
@@ -374,6 +395,13 @@
           <w:szCs w:val="24"/>
           <w:lang w:val="fr-CH"/>
         </w:rPr>
+        <w:t xml:space="preserve"> </w:t>
+      </w:r>
+      <w:r>
+        <w:rPr>
+          <w:szCs w:val="24"/>
+          <w:lang w:val="fr-CH"/>
+        </w:rPr>
         <w:t>:</w:t>
       </w:r>
     </w:p>
@@ -405,6 +433,13 @@
           <w:lang w:val="fr-CH"/>
         </w:rPr>
         <w:t>Les organes suivants ne sont pas désignés ou le seront ultérieurement</w:t>
+      </w:r>
+      <w:r>
+        <w:rPr>
+          <w:szCs w:val="24"/>
+          <w:lang w:val="fr-CH"/>
+        </w:rPr>
+        <w:t xml:space="preserve"> </w:t>
       </w:r>
       <w:r>
         <w:rPr>
@@ -460,8 +495,6 @@
       </w:pPr>
       <w:r>
         <w:rPr>
-          <w:b/>
-          <w:bCs/>
           <w:szCs w:val="24"/>
           <w:lang w:val="en-US"/>
         </w:rPr>
@@ -520,6 +553,13 @@
           <w:szCs w:val="24"/>
           <w:lang w:val="fr-CH"/>
         </w:rPr>
+        <w:t xml:space="preserve"> </w:t>
+      </w:r>
+      <w:r>
+        <w:rPr>
+          <w:szCs w:val="24"/>
+          <w:lang w:val="fr-CH"/>
+        </w:rPr>
         <w:t>:</w:t>
       </w:r>
     </w:p>
@@ -550,32 +590,30 @@
         <w:ind w:left="1134" w:hanging="774"/>
         <w:rPr>
           <w:szCs w:val="24"/>
-          <w:lang w:val="en-US"/>
-        </w:rPr>
-      </w:pPr>
-      <w:r>
-        <w:rPr>
-          <w:b/>
-          <w:bCs/>
-          <w:szCs w:val="24"/>
+          <w:u w:val="single"/>
+          <w:lang w:val="en-US"/>
+        </w:rPr>
+      </w:pPr>
+      <w:r>
+        <w:rPr>
+          <w:szCs w:val="24"/>
+          <w:u w:val="single"/>
           <w:lang w:val="en-US"/>
         </w:rPr>
         <w:t>&lt;&lt;[committee.</w:t>
       </w:r>
       <w:r>
         <w:rPr>
-          <w:b/>
-          <w:bCs/>
-          <w:szCs w:val="24"/>
+          <w:szCs w:val="24"/>
+          <w:u w:val="single"/>
           <w:lang w:val="en-US"/>
         </w:rPr>
         <w:t>n</w:t>
       </w:r>
       <w:r>
         <w:rPr>
-          <w:b/>
-          <w:bCs/>
-          <w:szCs w:val="24"/>
+          <w:szCs w:val="24"/>
+          <w:u w:val="single"/>
           <w:lang w:val="en-US"/>
         </w:rPr>
         <w:t>ame]&gt;&gt;</w:t>
@@ -710,6 +748,13 @@
           <w:szCs w:val="24"/>
           <w:lang w:val="fr-CH"/>
         </w:rPr>
+        <w:t xml:space="preserve"> </w:t>
+      </w:r>
+      <w:r>
+        <w:rPr>
+          <w:szCs w:val="24"/>
+          <w:lang w:val="fr-CH"/>
+        </w:rPr>
         <w:t>:</w:t>
       </w:r>
     </w:p>
@@ -746,19 +791,34 @@
       </w:pPr>
       <w:r>
         <w:rPr>
-          <w:b/>
-          <w:bCs/>
-          <w:szCs w:val="24"/>
-          <w:lang w:val="en-US"/>
-        </w:rPr>
-        <w:t xml:space="preserve">&lt;&lt;[committee.name]&gt;&gt;: </w:t>
-      </w:r>
-      <w:r>
-        <w:rPr>
-          <w:szCs w:val="24"/>
-          <w:lang w:val="en-US"/>
-        </w:rPr>
-        <w:t xml:space="preserve">&lt;&lt;[committee.memberCount]&gt;&gt; </w:t>
+          <w:szCs w:val="24"/>
+          <w:u w:val="single"/>
+          <w:lang w:val="en-US"/>
+        </w:rPr>
+        <w:t>&lt;&lt;[committee.name]&gt;&gt;</w:t>
+      </w:r>
+      <w:r>
+        <w:rPr>
+          <w:szCs w:val="24"/>
+          <w:u w:val="single"/>
+          <w:lang w:val="en-US"/>
+        </w:rPr>
+        <w:t xml:space="preserve"> </w:t>
+      </w:r>
+      <w:r>
+        <w:rPr>
+          <w:szCs w:val="24"/>
+          <w:u w:val="single"/>
+          <w:lang w:val="en-US"/>
+        </w:rPr>
+        <w:t>:</w:t>
+      </w:r>
+      <w:r>
+        <w:rPr>
+          <w:szCs w:val="24"/>
+          <w:lang w:val="en-US"/>
+        </w:rPr>
+        <w:t xml:space="preserve"> &lt;&lt;[committee.memberCount]&gt;&gt; </w:t>
       </w:r>
       <w:r>
         <w:rPr>
@@ -836,6 +896,13 @@
           <w:szCs w:val="24"/>
           <w:lang w:val="fr-CH"/>
         </w:rPr>
+        <w:t xml:space="preserve"> </w:t>
+      </w:r>
+      <w:r>
+        <w:rPr>
+          <w:szCs w:val="24"/>
+          <w:lang w:val="fr-CH"/>
+        </w:rPr>
         <w:t>:</w:t>
       </w:r>
     </w:p>
@@ -853,21 +920,7 @@
           <w:szCs w:val="24"/>
           <w:lang w:val="en-US"/>
         </w:rPr>
-        <w:t>&lt;&lt;foreach [committee in decisionFederalCouncil.</w:t>
-      </w:r>
-      <w:r>
-        <w:rPr>
-          <w:szCs w:val="24"/>
-          <w:lang w:val="en-US"/>
-        </w:rPr>
-        <w:t>m</w:t>
-      </w:r>
-      <w:r>
-        <w:rPr>
-          <w:szCs w:val="24"/>
-          <w:lang w:val="en-US"/>
-        </w:rPr>
-        <w:t>issingGenderMembersCommittees]&gt;&gt;</w:t>
+        <w:t>&lt;&lt;foreach [committee in decisionFederalCouncil.missingGenderMembersCommittees]&gt;&gt;</w:t>
       </w:r>
     </w:p>
     <w:p>
@@ -886,12 +939,34 @@
       </w:pPr>
       <w:r>
         <w:rPr>
-          <w:b/>
-          <w:bCs/>
-          <w:szCs w:val="24"/>
-          <w:lang w:val="en-US"/>
-        </w:rPr>
-        <w:t xml:space="preserve">&lt;&lt;[committee.name]&gt;&gt;: </w:t>
+          <w:szCs w:val="24"/>
+          <w:u w:val="single"/>
+          <w:lang w:val="en-US"/>
+        </w:rPr>
+        <w:t>&lt;&lt;[committee.name]&gt;&gt;</w:t>
+      </w:r>
+      <w:r>
+        <w:rPr>
+          <w:szCs w:val="24"/>
+          <w:u w:val="single"/>
+          <w:lang w:val="en-US"/>
+        </w:rPr>
+        <w:t xml:space="preserve"> </w:t>
+      </w:r>
+      <w:r>
+        <w:rPr>
+          <w:szCs w:val="24"/>
+          <w:u w:val="single"/>
+          <w:lang w:val="en-US"/>
+        </w:rPr>
+        <w:t>:</w:t>
+      </w:r>
+      <w:r>
+        <w:rPr>
+          <w:szCs w:val="24"/>
+          <w:lang w:val="en-US"/>
+        </w:rPr>
+        <w:t xml:space="preserve"> </w:t>
       </w:r>
       <w:r>
         <w:rPr>
@@ -1013,7 +1088,21 @@
           <w:szCs w:val="24"/>
           <w:lang w:val="fr-CH"/>
         </w:rPr>
-        <w:t>, al. 1, OLOGA) dans les commissions extraparlementaires suivantes est approuvée:</w:t>
+        <w:t>, al. 1, OLOGA) dans les commissions extraparlementaires suivantes est approuvée</w:t>
+      </w:r>
+      <w:r>
+        <w:rPr>
+          <w:szCs w:val="24"/>
+          <w:lang w:val="fr-CH"/>
+        </w:rPr>
+        <w:t xml:space="preserve"> </w:t>
+      </w:r>
+      <w:r>
+        <w:rPr>
+          <w:szCs w:val="24"/>
+          <w:lang w:val="fr-CH"/>
+        </w:rPr>
+        <w:t>:</w:t>
       </w:r>
     </w:p>
     <w:p>
@@ -1037,14 +1126,7 @@
           <w:szCs w:val="24"/>
           <w:lang w:val="en-US"/>
         </w:rPr>
-        <w:t>m</w:t>
-      </w:r>
-      <w:r>
-        <w:rPr>
-          <w:szCs w:val="24"/>
-          <w:lang w:val="en-US"/>
-        </w:rPr>
-        <w:t>issingLanguageMembersCommittees</w:t>
+        <w:t>missingLanguageMembersCommittees</w:t>
       </w:r>
       <w:r>
         <w:rPr>
@@ -1070,12 +1152,27 @@
       </w:pPr>
       <w:r>
         <w:rPr>
-          <w:b/>
-          <w:bCs/>
-          <w:szCs w:val="24"/>
-          <w:lang w:val="en-US"/>
-        </w:rPr>
-        <w:t>&lt;&lt;[committee.name]&gt;&gt;:</w:t>
+          <w:szCs w:val="24"/>
+          <w:u w:val="single"/>
+          <w:lang w:val="en-US"/>
+        </w:rPr>
+        <w:t>&lt;&lt;[committee.name]&gt;&gt;</w:t>
+      </w:r>
+      <w:r>
+        <w:rPr>
+          <w:szCs w:val="24"/>
+          <w:u w:val="single"/>
+          <w:lang w:val="en-US"/>
+        </w:rPr>
+        <w:t xml:space="preserve"> </w:t>
+      </w:r>
+      <w:r>
+        <w:rPr>
+          <w:szCs w:val="24"/>
+          <w:u w:val="single"/>
+          <w:lang w:val="en-US"/>
+        </w:rPr>
+        <w:t>:</w:t>
       </w:r>
       <w:r>
         <w:rPr>
@@ -1206,6 +1303,13 @@
           <w:lang w:val="fr-CH"/>
         </w:rPr>
         <w:t>, al. 2, OLOGA) dans les commissions extraparlementaires suivantes sont approuvées</w:t>
+      </w:r>
+      <w:r>
+        <w:rPr>
+          <w:szCs w:val="24"/>
+          <w:lang w:val="fr-CH"/>
+        </w:rPr>
+        <w:t xml:space="preserve"> </w:t>
       </w:r>
       <w:r>
         <w:rPr>
@@ -1262,19 +1366,34 @@
       </w:pPr>
       <w:r>
         <w:rPr>
-          <w:b/>
-          <w:bCs/>
-          <w:szCs w:val="24"/>
-          <w:lang w:val="en-US"/>
-        </w:rPr>
-        <w:t xml:space="preserve">&lt;&lt;[committee.name]&gt;&gt;: </w:t>
-      </w:r>
-      <w:r>
-        <w:rPr>
-          <w:szCs w:val="24"/>
-          <w:lang w:val="en-US"/>
-        </w:rPr>
-        <w:t>&lt;&lt;[committee.freeText]&gt;&gt;</w:t>
+          <w:szCs w:val="24"/>
+          <w:u w:val="single"/>
+          <w:lang w:val="en-US"/>
+        </w:rPr>
+        <w:t>&lt;&lt;[committee.name]&gt;&gt;</w:t>
+      </w:r>
+      <w:r>
+        <w:rPr>
+          <w:szCs w:val="24"/>
+          <w:u w:val="single"/>
+          <w:lang w:val="en-US"/>
+        </w:rPr>
+        <w:t xml:space="preserve"> </w:t>
+      </w:r>
+      <w:r>
+        <w:rPr>
+          <w:szCs w:val="24"/>
+          <w:u w:val="single"/>
+          <w:lang w:val="en-US"/>
+        </w:rPr>
+        <w:t>:</w:t>
+      </w:r>
+      <w:r>
+        <w:rPr>
+          <w:szCs w:val="24"/>
+          <w:lang w:val="en-US"/>
+        </w:rPr>
+        <w:t xml:space="preserve"> &lt;&lt;[committee.freeText]&gt;&gt;</w:t>
       </w:r>
     </w:p>
     <w:p>
@@ -1345,6 +1464,13 @@
           <w:szCs w:val="24"/>
           <w:lang w:val="fr-CH"/>
         </w:rPr>
+        <w:t xml:space="preserve"> </w:t>
+      </w:r>
+      <w:r>
+        <w:rPr>
+          <w:szCs w:val="24"/>
+          <w:lang w:val="fr-CH"/>
+        </w:rPr>
         <w:t>:</w:t>
       </w:r>
     </w:p>
@@ -1381,19 +1507,34 @@
       </w:pPr>
       <w:r>
         <w:rPr>
-          <w:b/>
-          <w:bCs/>
-          <w:szCs w:val="24"/>
-          <w:lang w:val="en-US"/>
-        </w:rPr>
-        <w:t xml:space="preserve">&lt;&lt;[committee.name]&gt;&gt;: </w:t>
-      </w:r>
-      <w:r>
-        <w:rPr>
-          <w:szCs w:val="24"/>
-          <w:lang w:val="en-US"/>
-        </w:rPr>
-        <w:t>&lt;&lt;[committee.freeText]&gt;&gt;</w:t>
+          <w:szCs w:val="24"/>
+          <w:u w:val="single"/>
+          <w:lang w:val="en-US"/>
+        </w:rPr>
+        <w:t>&lt;&lt;[committee.name]&gt;&gt;</w:t>
+      </w:r>
+      <w:r>
+        <w:rPr>
+          <w:szCs w:val="24"/>
+          <w:u w:val="single"/>
+          <w:lang w:val="en-US"/>
+        </w:rPr>
+        <w:t xml:space="preserve"> </w:t>
+      </w:r>
+      <w:r>
+        <w:rPr>
+          <w:szCs w:val="24"/>
+          <w:u w:val="single"/>
+          <w:lang w:val="en-US"/>
+        </w:rPr>
+        <w:t>:</w:t>
+      </w:r>
+      <w:r>
+        <w:rPr>
+          <w:szCs w:val="24"/>
+          <w:lang w:val="en-US"/>
+        </w:rPr>
+        <w:t xml:space="preserve"> &lt;&lt;[committee.freeText]&gt;&gt;</w:t>
       </w:r>
     </w:p>
     <w:p>
@@ -1577,34 +1718,6 @@
           <w:lang w:val="fr-CH"/>
         </w:rPr>
         <w:t>La Chancellerie fédérale est autorisée à adapter la liste des membres publiée, en accord avec le département compétent, si des modifications interviennent concernant les indications relatives aux personnes élues.</w:t>
-      </w:r>
-    </w:p>
-    <w:p>
-      <w:pPr>
-        <w:rPr>
-          <w:szCs w:val="24"/>
-          <w:lang w:val="fr-CH"/>
-        </w:rPr>
-      </w:pPr>
-    </w:p>
-    <w:p>
-      <w:pPr>
-        <w:pStyle w:val="Listenabsatz"/>
-        <w:numPr>
-          <w:ilvl w:val="0"/>
-          <w:numId w:val="50"/>
-        </w:numPr>
-        <w:rPr>
-          <w:szCs w:val="24"/>
-          <w:lang w:val="fr-CH"/>
-        </w:rPr>
-      </w:pPr>
-      <w:r>
-        <w:rPr>
-          <w:szCs w:val="24"/>
-          <w:lang w:val="fr-CH"/>
-        </w:rPr>
-        <w:t>Pour les organes transfrontaliers ci-après, l’élection des représentants est déléguée au département compétent :</w:t>
       </w:r>
     </w:p>
     <w:p>

</xml_diff>

<commit_message>
feat: fix issues in documents, add translations #BKDO-3559
</commit_message>
<xml_diff>
--- a/src/Bk.APG.Api/Templates/APG_Decision_Federal_Council_French.docx
+++ b/src/Bk.APG.Api/Templates/APG_Decision_Federal_Council_French.docx
@@ -262,10 +262,37 @@
       </w:r>
       <w:r>
         <w:rPr>
-          <w:szCs w:val="24"/>
-          <w:lang w:val="fr-CH"/>
-        </w:rPr>
-        <w:t>selon la fonction et pour la durée qui y figure au sein des commissions extraparlementaires, des organes de direction ou comme représentants de la Confédération.</w:t>
+          <w:lang w:val="fr-CH"/>
+        </w:rPr>
+        <w:t xml:space="preserve">les membres </w:t>
+      </w:r>
+      <w:r>
+        <w:rPr>
+          <w:szCs w:val="24"/>
+          <w:lang w:val="fr-CH"/>
+        </w:rPr>
+        <w:t>des commissions extraparlementaires, des organes de direction ou représentants de la Confédération</w:t>
+      </w:r>
+      <w:r>
+        <w:rPr>
+          <w:szCs w:val="24"/>
+          <w:lang w:val="fr-CH"/>
+        </w:rPr>
+        <w:t xml:space="preserve"> sont nommés </w:t>
+      </w:r>
+      <w:r>
+        <w:rPr>
+          <w:szCs w:val="24"/>
+          <w:lang w:val="fr-CH"/>
+        </w:rPr>
+        <w:t xml:space="preserve">selon la fonction et pour la durée qui  figure </w:t>
+      </w:r>
+      <w:r>
+        <w:rPr>
+          <w:szCs w:val="24"/>
+          <w:lang w:val="fr-CH"/>
+        </w:rPr>
+        <w:t>dans la liste des personnes nommées (annexe).</w:t>
       </w:r>
     </w:p>
     <w:p>
@@ -432,7 +459,49 @@
           <w:szCs w:val="24"/>
           <w:lang w:val="fr-CH"/>
         </w:rPr>
-        <w:t>Les organes suivants ne sont pas désignés ou le seront ultérieurement</w:t>
+        <w:t xml:space="preserve">Les </w:t>
+      </w:r>
+      <w:r>
+        <w:rPr>
+          <w:szCs w:val="24"/>
+          <w:lang w:val="fr-CH"/>
+        </w:rPr>
+        <w:t xml:space="preserve">members des </w:t>
+      </w:r>
+      <w:r>
+        <w:rPr>
+          <w:szCs w:val="24"/>
+          <w:lang w:val="fr-CH"/>
+        </w:rPr>
+        <w:t xml:space="preserve">organes suivants ne sont pas </w:t>
+      </w:r>
+      <w:r>
+        <w:rPr>
+          <w:szCs w:val="24"/>
+          <w:lang w:val="fr-CH"/>
+        </w:rPr>
+        <w:t>nommés</w:t>
+      </w:r>
+      <w:r>
+        <w:rPr>
+          <w:szCs w:val="24"/>
+          <w:lang w:val="fr-CH"/>
+        </w:rPr>
+        <w:t xml:space="preserve"> </w:t>
+      </w:r>
+      <w:r>
+        <w:rPr>
+          <w:szCs w:val="24"/>
+          <w:lang w:val="fr-CH"/>
+        </w:rPr>
+        <w:t>f</w:t>
+      </w:r>
+      <w:r>
+        <w:rPr>
+          <w:szCs w:val="24"/>
+          <w:lang w:val="fr-CH"/>
+        </w:rPr>
+        <w:t>ou le seront ultérieurement</w:t>
       </w:r>
       <w:r>
         <w:rPr>
@@ -795,6 +864,7 @@
           <w:u w:val="single"/>
           <w:lang w:val="en-US"/>
         </w:rPr>
+        <w:lastRenderedPageBreak/>
         <w:t>&lt;&lt;[committee.name]&gt;&gt;</w:t>
       </w:r>
       <w:r>
@@ -1551,6 +1621,7 @@
           <w:szCs w:val="24"/>
           <w:lang w:val="en-US"/>
         </w:rPr>
+        <w:lastRenderedPageBreak/>
         <w:t>&lt;&lt;/foreach&gt;&gt;</w:t>
       </w:r>
     </w:p>
@@ -1578,7 +1649,6 @@
           <w:szCs w:val="24"/>
           <w:lang w:val="fr-CH"/>
         </w:rPr>
-        <w:lastRenderedPageBreak/>
         <w:t>Les départements veillent à ce que les exigences légales relatives à la composition des commissions extraparlementaires (notamment la représentation équitable des sexes et des communautés linguistiques) soient respectées lors de remplacements de membres en cours de législature.</w:t>
       </w:r>
     </w:p>
@@ -1635,7 +1705,21 @@
           <w:szCs w:val="24"/>
           <w:lang w:val="fr-CH"/>
         </w:rPr>
-        <w:t xml:space="preserve">Les départements (SG) sont chargés d’informer les membres sortants et nouvellement nommés (toutes fonctions confondues) </w:t>
+        <w:t>Les départements (SG) sont chargés d’informer les membres sortants et nouvellement nommés (toutes fonctions confondues)</w:t>
+      </w:r>
+      <w:r>
+        <w:rPr>
+          <w:szCs w:val="24"/>
+          <w:lang w:val="fr-CH"/>
+        </w:rPr>
+        <w:t xml:space="preserve"> d’ici au</w:t>
+      </w:r>
+      <w:r>
+        <w:rPr>
+          <w:szCs w:val="24"/>
+          <w:lang w:val="fr-CH"/>
+        </w:rPr>
+        <w:t xml:space="preserve"> </w:t>
       </w:r>
       <w:r>
         <w:rPr>
@@ -1689,7 +1773,49 @@
           <w:szCs w:val="24"/>
           <w:lang w:val="fr-CH"/>
         </w:rPr>
-        <w:t>. Passé ce délai, la ChF est chargée de publier la liste des membres nommés (annexe) sur internet sans mention de l’année de naissance et des langues. Les départements peuvent alors publier des communiqués de presse individuels.</w:t>
+        <w:t xml:space="preserve">. Passé ce délai, la ChF est chargée de publier la liste des </w:t>
+      </w:r>
+      <w:r>
+        <w:rPr>
+          <w:szCs w:val="24"/>
+          <w:lang w:val="fr-CH"/>
+        </w:rPr>
+        <w:t>personnes</w:t>
+      </w:r>
+      <w:r>
+        <w:rPr>
+          <w:szCs w:val="24"/>
+          <w:lang w:val="fr-CH"/>
+        </w:rPr>
+        <w:t xml:space="preserve"> nommé</w:t>
+      </w:r>
+      <w:r>
+        <w:rPr>
+          <w:szCs w:val="24"/>
+          <w:lang w:val="fr-CH"/>
+        </w:rPr>
+        <w:t>e</w:t>
+      </w:r>
+      <w:r>
+        <w:rPr>
+          <w:szCs w:val="24"/>
+          <w:lang w:val="fr-CH"/>
+        </w:rPr>
+        <w:t>s (annexe) sur internet</w:t>
+      </w:r>
+      <w:r>
+        <w:rPr>
+          <w:szCs w:val="24"/>
+          <w:lang w:val="fr-CH"/>
+        </w:rPr>
+        <w:t>.</w:t>
+      </w:r>
+      <w:r>
+        <w:rPr>
+          <w:szCs w:val="24"/>
+          <w:lang w:val="fr-CH"/>
+        </w:rPr>
+        <w:t xml:space="preserve"> Les départements peuvent alors publier des communiqués de presse individuels.</w:t>
       </w:r>
     </w:p>
     <w:p>
@@ -1717,7 +1843,35 @@
           <w:szCs w:val="24"/>
           <w:lang w:val="fr-CH"/>
         </w:rPr>
-        <w:t>La Chancellerie fédérale est autorisée à adapter la liste des membres publiée, en accord avec le département compétent, si des modifications interviennent concernant les indications relatives aux personnes élues.</w:t>
+        <w:t>La Ch</w:t>
+      </w:r>
+      <w:r>
+        <w:rPr>
+          <w:szCs w:val="24"/>
+          <w:lang w:val="fr-CH"/>
+        </w:rPr>
+        <w:t>F</w:t>
+      </w:r>
+      <w:r>
+        <w:rPr>
+          <w:szCs w:val="24"/>
+          <w:lang w:val="fr-CH"/>
+        </w:rPr>
+        <w:t xml:space="preserve"> est autorisée à adapter la liste des membres publiée, en accord avec le département compétent, si des modifications interviennent concernant les indications relatives aux personnes </w:t>
+      </w:r>
+      <w:r>
+        <w:rPr>
+          <w:szCs w:val="24"/>
+          <w:lang w:val="fr-CH"/>
+        </w:rPr>
+        <w:t>nommées</w:t>
+      </w:r>
+      <w:r>
+        <w:rPr>
+          <w:szCs w:val="24"/>
+          <w:lang w:val="fr-CH"/>
+        </w:rPr>
+        <w:t>.</w:t>
       </w:r>
     </w:p>
     <w:p>
@@ -1745,7 +1899,21 @@
           <w:szCs w:val="24"/>
           <w:lang w:val="fr-CH"/>
         </w:rPr>
-        <w:t xml:space="preserve">La ChF est chargée de présenter au Conseil fédéral, à l'intention des Chambres fédérales, d’ici à fin </w:t>
+        <w:t xml:space="preserve">La ChF est chargée de présenter au Conseil fédéral, à l'intention des Chambres fédérales, d’ici </w:t>
+      </w:r>
+      <w:r>
+        <w:rPr>
+          <w:szCs w:val="24"/>
+          <w:lang w:val="fr-CH"/>
+        </w:rPr>
+        <w:t>au</w:t>
+      </w:r>
+      <w:r>
+        <w:rPr>
+          <w:szCs w:val="24"/>
+          <w:lang w:val="fr-CH"/>
+        </w:rPr>
+        <w:t xml:space="preserve"> </w:t>
       </w:r>
       <w:r>
         <w:rPr>
@@ -1799,20 +1967,7 @@
           <w:szCs w:val="24"/>
           <w:lang w:val="fr-CH"/>
         </w:rPr>
-        <w:t xml:space="preserve">, un rapport sur la composition des organes extraparlementaires dont les membres ont été nommés dans le cadre du renouvellement intégral pour la période </w:t>
-      </w:r>
-      <w:r>
-        <w:rPr>
-          <w:lang w:val="fr-CH"/>
-        </w:rPr>
-        <w:t>&lt;&lt;[decisionFederalCouncil.termOfOfficeDateRange]&gt;&gt;</w:t>
-      </w:r>
-      <w:r>
-        <w:rPr>
-          <w:szCs w:val="24"/>
-          <w:lang w:val="fr-CH"/>
-        </w:rPr>
-        <w:t>.</w:t>
+        <w:t>, un rapport sur la composition des organes extraparlementaires dont les membres ont été nommés dans le cadre du renouvellement intégral pour la période &lt;&lt;[decisionFederalCouncil.termOfOfficeDateRange]&gt;&gt;.</w:t>
       </w:r>
     </w:p>
     <w:p>
@@ -1842,16 +1997,20 @@
     <w:p>
       <w:pPr>
         <w:rPr>
-          <w:sz w:val="26"/>
-          <w:szCs w:val="24"/>
-        </w:rPr>
-      </w:pPr>
-      <w:r>
-        <w:rPr>
-          <w:sz w:val="26"/>
-          <w:szCs w:val="24"/>
-        </w:rPr>
-        <w:t>Annexe : Liste des membres</w:t>
+          <w:szCs w:val="24"/>
+        </w:rPr>
+      </w:pPr>
+      <w:r>
+        <w:rPr>
+          <w:szCs w:val="24"/>
+        </w:rPr>
+        <w:t xml:space="preserve">Annexe : Liste des </w:t>
+      </w:r>
+      <w:r>
+        <w:rPr>
+          <w:szCs w:val="24"/>
+        </w:rPr>
+        <w:t>personnes nommées</w:t>
       </w:r>
     </w:p>
     <w:sectPr>
@@ -7924,7 +8083,7 @@
 </file>
 
 <file path=customXml/item1.xml><?xml version="1.0" encoding="utf-8"?>
-<officeatwork xmlns="http://schemas.officeatwork.com/Document">eNp7v3u/jUt+cmlual6JnU1wfk5pSWZ+nmeKXVK2jT4S18YnMS+9NDE91c7IwNTURh/OtQnLTC23s9GHUnCzAA5cIJ8=</officeatwork>
+<officeatwork xmlns="http://schemas.officeatwork.com/Formulas">eNp7v3u/jVt+UW5pTmKxgr4dAD33Bnw=</officeatwork>
 </file>
 
 <file path=customXml/item2.xml><?xml version="1.0" encoding="utf-8"?>
@@ -7981,7 +8140,7 @@
 </file>
 
 <file path=customXml/item3.xml><?xml version="1.0" encoding="utf-8"?>
-<officeatwork xmlns="http://schemas.officeatwork.com/Formulas">eNp7v3u/jVt+UW5pTmKxgr4dAD33Bnw=</officeatwork>
+<officeatwork xmlns="http://schemas.officeatwork.com/Document">eNp7v3u/jUt+cmlual6JnU1wfk5pSWZ+nmeKXVK2jT4S18YnMS+9NDE91c7IwNTURh/OtQnLTC23s9GHUnCzAA5cIJ8=</officeatwork>
 </file>
 
 <file path=customXml/item4.xml><?xml version="1.0" encoding="utf-8"?>
@@ -7989,9 +8148,9 @@
 </file>
 
 <file path=customXml/itemProps1.xml><?xml version="1.0" encoding="utf-8"?>
-<ds:datastoreItem xmlns:ds="http://schemas.openxmlformats.org/officeDocument/2006/customXml" ds:itemID="{826A14BC-61C7-4B5E-A710-1212315CFB87}">
+<ds:datastoreItem xmlns:ds="http://schemas.openxmlformats.org/officeDocument/2006/customXml" ds:itemID="{FACC0E0D-5C77-45BD-958B-944424F72D0B}">
   <ds:schemaRefs>
-    <ds:schemaRef ds:uri="http://schemas.officeatwork.com/Document"/>
+    <ds:schemaRef ds:uri="http://schemas.officeatwork.com/Formulas"/>
   </ds:schemaRefs>
 </ds:datastoreItem>
 </file>
@@ -8005,9 +8164,9 @@
 </file>
 
 <file path=customXml/itemProps3.xml><?xml version="1.0" encoding="utf-8"?>
-<ds:datastoreItem xmlns:ds="http://schemas.openxmlformats.org/officeDocument/2006/customXml" ds:itemID="{FACC0E0D-5C77-45BD-958B-944424F72D0B}">
+<ds:datastoreItem xmlns:ds="http://schemas.openxmlformats.org/officeDocument/2006/customXml" ds:itemID="{826A14BC-61C7-4B5E-A710-1212315CFB87}">
   <ds:schemaRefs>
-    <ds:schemaRef ds:uri="http://schemas.officeatwork.com/Formulas"/>
+    <ds:schemaRef ds:uri="http://schemas.officeatwork.com/Document"/>
   </ds:schemaRefs>
 </ds:datastoreItem>
 </file>

</xml_diff>

<commit_message>
feat: fix selection of maximum duration #BKDO-3693
</commit_message>
<xml_diff>
--- a/src/Bk.APG.Api/Templates/APG_Decision_Federal_Council_French.docx
+++ b/src/Bk.APG.Api/Templates/APG_Decision_Federal_Council_French.docx
@@ -285,7 +285,7 @@
           <w:szCs w:val="24"/>
           <w:lang w:val="fr-CH"/>
         </w:rPr>
-        <w:t xml:space="preserve">selon la fonction et pour la durée qui  figure </w:t>
+        <w:t xml:space="preserve">selon la fonction et pour la durée qui figure </w:t>
       </w:r>
       <w:r>
         <w:rPr>
@@ -2100,27 +2100,14 @@
           <w:r>
             <w:t>/</w:t>
           </w:r>
-          <w:r>
-            <w:fldChar w:fldCharType="begin"/>
-          </w:r>
-          <w:r>
-            <w:instrText xml:space="preserve"> NUMPAGES  </w:instrText>
-          </w:r>
-          <w:r>
-            <w:fldChar w:fldCharType="separate"/>
-          </w:r>
-          <w:r>
-            <w:rPr>
-              <w:noProof/>
-            </w:rPr>
-            <w:t>14</w:t>
-          </w:r>
-          <w:r>
-            <w:rPr>
-              <w:noProof/>
-            </w:rPr>
-            <w:fldChar w:fldCharType="end"/>
-          </w:r>
+          <w:fldSimple w:instr=" NUMPAGES  ">
+            <w:r>
+              <w:rPr>
+                <w:noProof/>
+              </w:rPr>
+              <w:t>14</w:t>
+            </w:r>
+          </w:fldSimple>
         </w:p>
       </w:tc>
     </w:tr>
@@ -8083,10 +8070,6 @@
 </file>
 
 <file path=customXml/item1.xml><?xml version="1.0" encoding="utf-8"?>
-<officeatwork xmlns="http://schemas.officeatwork.com/Formulas">eNp7v3u/jVt+UW5pTmKxgr4dAD33Bnw=</officeatwork>
-</file>
-
-<file path=customXml/item2.xml><?xml version="1.0" encoding="utf-8"?>
 <f:fields xmlns:f="http://schemas.fabasoft.com/folio/2007/fields">
   <f:record ref="">
     <f:field ref="objname" par="" edit="true" text="ENTW BRB zu BRA BK 2019xxxx Ausserparlamentarischen Kommissionen, Leitungsorgane und Vertretungen des Bundes: Gesamterneuerungswahlen für die Amtsperiode 2020-2023"/>
@@ -8139,15 +8122,27 @@
 </f:fields>
 </file>
 
+<file path=customXml/item2.xml><?xml version="1.0" encoding="utf-8"?>
+<officeatwork xmlns="http://schemas.officeatwork.com/Formulas">eNp7v3u/jVt+UW5pTmKxgr4dAD33Bnw=</officeatwork>
+</file>
+
 <file path=customXml/item3.xml><?xml version="1.0" encoding="utf-8"?>
+<officeatwork xmlns="http://schemas.officeatwork.com/MasterProperties">eNp7v3u/jW9icUlqUUBRfkFqUUllcGpJsYK+HQCb2Qqj</officeatwork>
+</file>
+
+<file path=customXml/item4.xml><?xml version="1.0" encoding="utf-8"?>
 <officeatwork xmlns="http://schemas.officeatwork.com/Document">eNp7v3u/jUt+cmlual6JnU1wfk5pSWZ+nmeKXVK2jT4S18YnMS+9NDE91c7IwNTURh/OtQnLTC23s9GHUnCzAA5cIJ8=</officeatwork>
 </file>
 
-<file path=customXml/item4.xml><?xml version="1.0" encoding="utf-8"?>
-<officeatwork xmlns="http://schemas.officeatwork.com/MasterProperties">eNp7v3u/jW9icUlqUUBRfkFqUUllcGpJsYK+HQCb2Qqj</officeatwork>
+<file path=customXml/itemProps1.xml><?xml version="1.0" encoding="utf-8"?>
+<ds:datastoreItem xmlns:ds="http://schemas.openxmlformats.org/officeDocument/2006/customXml" ds:itemID="{4E8A9591-F074-446B-902F-511FF79C122F}">
+  <ds:schemaRefs>
+    <ds:schemaRef ds:uri="http://schemas.fabasoft.com/folio/2007/fields"/>
+  </ds:schemaRefs>
+</ds:datastoreItem>
 </file>
 
-<file path=customXml/itemProps1.xml><?xml version="1.0" encoding="utf-8"?>
+<file path=customXml/itemProps2.xml><?xml version="1.0" encoding="utf-8"?>
 <ds:datastoreItem xmlns:ds="http://schemas.openxmlformats.org/officeDocument/2006/customXml" ds:itemID="{FACC0E0D-5C77-45BD-958B-944424F72D0B}">
   <ds:schemaRefs>
     <ds:schemaRef ds:uri="http://schemas.officeatwork.com/Formulas"/>
@@ -8155,26 +8150,18 @@
 </ds:datastoreItem>
 </file>
 
-<file path=customXml/itemProps2.xml><?xml version="1.0" encoding="utf-8"?>
-<ds:datastoreItem xmlns:ds="http://schemas.openxmlformats.org/officeDocument/2006/customXml" ds:itemID="{4E8A9591-F074-446B-902F-511FF79C122F}">
+<file path=customXml/itemProps3.xml><?xml version="1.0" encoding="utf-8"?>
+<ds:datastoreItem xmlns:ds="http://schemas.openxmlformats.org/officeDocument/2006/customXml" ds:itemID="{3B3F6925-11A7-4614-A610-E26516665FC7}">
   <ds:schemaRefs>
-    <ds:schemaRef ds:uri="http://schemas.fabasoft.com/folio/2007/fields"/>
+    <ds:schemaRef ds:uri="http://schemas.officeatwork.com/MasterProperties"/>
   </ds:schemaRefs>
 </ds:datastoreItem>
 </file>
 
-<file path=customXml/itemProps3.xml><?xml version="1.0" encoding="utf-8"?>
+<file path=customXml/itemProps4.xml><?xml version="1.0" encoding="utf-8"?>
 <ds:datastoreItem xmlns:ds="http://schemas.openxmlformats.org/officeDocument/2006/customXml" ds:itemID="{826A14BC-61C7-4B5E-A710-1212315CFB87}">
   <ds:schemaRefs>
     <ds:schemaRef ds:uri="http://schemas.officeatwork.com/Document"/>
   </ds:schemaRefs>
 </ds:datastoreItem>
-</file>
-
-<file path=customXml/itemProps4.xml><?xml version="1.0" encoding="utf-8"?>
-<ds:datastoreItem xmlns:ds="http://schemas.openxmlformats.org/officeDocument/2006/customXml" ds:itemID="{3B3F6925-11A7-4614-A610-E26516665FC7}">
-  <ds:schemaRefs>
-    <ds:schemaRef ds:uri="http://schemas.officeatwork.com/MasterProperties"/>
-  </ds:schemaRefs>
-</ds:datastoreItem>
 </file>
</xml_diff>